<commit_message>
Added some recap about arrays and improved the flow of the slides
</commit_message>
<xml_diff>
--- a/advanced_datatypes_questions.docx
+++ b/advanced_datatypes_questions.docx
@@ -230,19 +230,11 @@
           <w:lang w:val="da-DK"/>
         </w:rPr>
       </w:pPr>
-      <w:proofErr w:type="gramStart"/>
-      <w:r>
-        <w:rPr>
-          <w:lang w:val="da-DK"/>
-        </w:rPr>
-        <w:t>Hint</w:t>
-      </w:r>
-      <w:proofErr w:type="gramEnd"/>
-      <w:r>
-        <w:rPr>
-          <w:lang w:val="da-DK"/>
-        </w:rPr>
-        <w:t>: et array navn er i flertal</w:t>
+      <w:r>
+        <w:rPr>
+          <w:lang w:val="da-DK"/>
+        </w:rPr>
+        <w:t>Hint: et array navn er i flertal</w:t>
       </w:r>
     </w:p>
     <w:p>
@@ -256,19 +248,11 @@
           <w:lang w:val="da-DK"/>
         </w:rPr>
       </w:pPr>
-      <w:proofErr w:type="gramStart"/>
-      <w:r>
-        <w:rPr>
-          <w:lang w:val="da-DK"/>
-        </w:rPr>
-        <w:t>Hint</w:t>
-      </w:r>
-      <w:proofErr w:type="gramEnd"/>
-      <w:r>
-        <w:rPr>
-          <w:lang w:val="da-DK"/>
-        </w:rPr>
-        <w:t xml:space="preserve">: et </w:t>
+      <w:r>
+        <w:rPr>
+          <w:lang w:val="da-DK"/>
+        </w:rPr>
+        <w:t xml:space="preserve">Hint: et </w:t>
       </w:r>
       <w:proofErr w:type="spellStart"/>
       <w:r>
@@ -370,28 +354,7 @@
         <w:rPr>
           <w:lang w:val="da-DK"/>
         </w:rPr>
-        <w:t>.id=1</w:t>
-      </w:r>
-      <w:proofErr w:type="gramStart"/>
-      <w:r>
-        <w:rPr>
-          <w:lang w:val="da-DK"/>
-        </w:rPr>
-        <w:t>, .age</w:t>
-      </w:r>
-      <w:proofErr w:type="gramEnd"/>
-      <w:r>
-        <w:rPr>
-          <w:lang w:val="da-DK"/>
-        </w:rPr>
-        <w:t>=21</w:t>
-      </w:r>
-      <w:proofErr w:type="gramStart"/>
-      <w:r>
-        <w:rPr>
-          <w:lang w:val="da-DK"/>
-        </w:rPr>
-        <w:t>, .</w:t>
+        <w:t>.id=1, .age=21, .</w:t>
       </w:r>
       <w:proofErr w:type="spellStart"/>
       <w:r>
@@ -401,19 +364,11 @@
         <w:t>heightM</w:t>
       </w:r>
       <w:proofErr w:type="spellEnd"/>
-      <w:proofErr w:type="gramEnd"/>
-      <w:r>
-        <w:rPr>
-          <w:lang w:val="da-DK"/>
-        </w:rPr>
-        <w:t>=1.8</w:t>
-      </w:r>
-      <w:proofErr w:type="gramStart"/>
-      <w:r>
-        <w:rPr>
-          <w:lang w:val="da-DK"/>
-        </w:rPr>
-        <w:t>, .</w:t>
+      <w:r>
+        <w:rPr>
+          <w:lang w:val="da-DK"/>
+        </w:rPr>
+        <w:t>=1.8, .</w:t>
       </w:r>
       <w:proofErr w:type="spellStart"/>
       <w:r>
@@ -423,7 +378,6 @@
         <w:t>weightKg</w:t>
       </w:r>
       <w:proofErr w:type="spellEnd"/>
-      <w:proofErr w:type="gramEnd"/>
       <w:r>
         <w:rPr>
           <w:lang w:val="da-DK"/>
@@ -482,16 +436,286 @@
     <w:p>
       <w:pPr>
         <w:pStyle w:val="Heading"/>
-      </w:pPr>
-      <w:r>
+        <w:rPr>
+          <w:lang w:val="da-DK"/>
+        </w:rPr>
+      </w:pPr>
+      <w:r>
+        <w:rPr>
+          <w:lang w:val="da-DK"/>
+        </w:rPr>
+        <w:t xml:space="preserve">Q: Opret en simpel Sensor </w:t>
+      </w:r>
+      <w:proofErr w:type="spellStart"/>
+      <w:r>
+        <w:rPr>
+          <w:lang w:val="da-DK"/>
+        </w:rPr>
+        <w:t>Structur</w:t>
+      </w:r>
+      <w:proofErr w:type="spellEnd"/>
+    </w:p>
+    <w:p>
+      <w:pPr>
+        <w:pStyle w:val="BodyText"/>
+        <w:rPr>
+          <w:lang w:val="da-DK"/>
+        </w:rPr>
+      </w:pPr>
+      <w:r>
+        <w:rPr>
+          <w:lang w:val="da-DK"/>
+        </w:rPr>
+        <w:t xml:space="preserve">I mange biomedicinske systemer skal man håndtere og strukturere patientdata. I denne opgave skal du oprette en simpel </w:t>
+      </w:r>
+      <w:proofErr w:type="spellStart"/>
+      <w:r>
+        <w:rPr>
+          <w:lang w:val="da-DK"/>
+        </w:rPr>
+        <w:t>struct</w:t>
+      </w:r>
+      <w:proofErr w:type="spellEnd"/>
+      <w:r>
+        <w:rPr>
+          <w:lang w:val="da-DK"/>
+        </w:rPr>
+        <w:t xml:space="preserve">, der kan holde information om en patient, og skrive et program, der kan indlæse og vise disse data. </w:t>
+      </w:r>
+    </w:p>
+    <w:p>
+      <w:pPr>
+        <w:pStyle w:val="BodyText"/>
+        <w:numPr>
+          <w:ilvl w:val="0"/>
+          <w:numId w:val="15"/>
+        </w:numPr>
+        <w:rPr>
+          <w:lang w:val="da-DK"/>
+        </w:rPr>
+      </w:pPr>
+      <w:r>
+        <w:rPr>
+          <w:lang w:val="da-DK"/>
+        </w:rPr>
+        <w:t xml:space="preserve">Definér en </w:t>
+      </w:r>
+      <w:proofErr w:type="spellStart"/>
+      <w:r>
+        <w:rPr>
+          <w:lang w:val="da-DK"/>
+        </w:rPr>
+        <w:t>struct</w:t>
+      </w:r>
+      <w:proofErr w:type="spellEnd"/>
+      <w:r>
+        <w:rPr>
+          <w:lang w:val="da-DK"/>
+        </w:rPr>
+        <w:t xml:space="preserve"> kaldet </w:t>
+      </w:r>
+      <w:proofErr w:type="spellStart"/>
+      <w:r>
+        <w:rPr>
+          <w:lang w:val="da-DK"/>
+        </w:rPr>
+        <w:t>TempSensor</w:t>
+      </w:r>
+      <w:proofErr w:type="spellEnd"/>
+      <w:r>
+        <w:rPr>
+          <w:lang w:val="da-DK"/>
+        </w:rPr>
+        <w:t>, som indeholder:</w:t>
+      </w:r>
+    </w:p>
+    <w:p>
+      <w:pPr>
+        <w:pStyle w:val="BodyText"/>
+        <w:numPr>
+          <w:ilvl w:val="1"/>
+          <w:numId w:val="15"/>
+        </w:numPr>
+        <w:rPr>
+          <w:lang w:val="da-DK"/>
+        </w:rPr>
+      </w:pPr>
+      <w:proofErr w:type="spellStart"/>
+      <w:r>
+        <w:rPr>
+          <w:lang w:val="da-DK"/>
+        </w:rPr>
+        <w:t>int</w:t>
+      </w:r>
+      <w:proofErr w:type="spellEnd"/>
+      <w:r>
+        <w:rPr>
+          <w:lang w:val="da-DK"/>
+        </w:rPr>
+        <w:t xml:space="preserve"> id – sensorens ID</w:t>
+      </w:r>
+    </w:p>
+    <w:p>
+      <w:pPr>
+        <w:pStyle w:val="BodyText"/>
+        <w:numPr>
+          <w:ilvl w:val="1"/>
+          <w:numId w:val="15"/>
+        </w:numPr>
+        <w:rPr>
+          <w:lang w:val="da-DK"/>
+        </w:rPr>
+      </w:pPr>
+      <w:proofErr w:type="spellStart"/>
+      <w:r>
+        <w:rPr>
+          <w:lang w:val="da-DK"/>
+        </w:rPr>
+        <w:t>float</w:t>
+      </w:r>
+      <w:proofErr w:type="spellEnd"/>
+      <w:r>
+        <w:rPr>
+          <w:lang w:val="da-DK"/>
+        </w:rPr>
+        <w:t xml:space="preserve"> </w:t>
+      </w:r>
+      <w:proofErr w:type="spellStart"/>
+      <w:r>
+        <w:rPr>
+          <w:lang w:val="da-DK"/>
+        </w:rPr>
+        <w:t>temperature</w:t>
+      </w:r>
+      <w:proofErr w:type="spellEnd"/>
+      <w:r>
+        <w:rPr>
+          <w:lang w:val="da-DK"/>
+        </w:rPr>
+        <w:t xml:space="preserve"> – målt temperatur i grader Celsius</w:t>
+      </w:r>
+    </w:p>
+    <w:p>
+      <w:pPr>
+        <w:pStyle w:val="BodyText"/>
+        <w:numPr>
+          <w:ilvl w:val="0"/>
+          <w:numId w:val="15"/>
+        </w:numPr>
+        <w:rPr>
+          <w:lang w:val="da-DK"/>
+        </w:rPr>
+      </w:pPr>
+      <w:r>
+        <w:rPr>
+          <w:lang w:val="da-DK"/>
+        </w:rPr>
+        <w:t xml:space="preserve">I </w:t>
+      </w:r>
+      <w:proofErr w:type="spellStart"/>
+      <w:r>
+        <w:rPr>
+          <w:lang w:val="da-DK"/>
+        </w:rPr>
+        <w:t>main</w:t>
+      </w:r>
+      <w:proofErr w:type="spellEnd"/>
+      <w:r>
+        <w:rPr>
+          <w:lang w:val="da-DK"/>
+        </w:rPr>
+        <w:t>():</w:t>
+      </w:r>
+    </w:p>
+    <w:p>
+      <w:pPr>
+        <w:pStyle w:val="BodyText"/>
+        <w:numPr>
+          <w:ilvl w:val="1"/>
+          <w:numId w:val="15"/>
+        </w:numPr>
+        <w:rPr>
+          <w:lang w:val="da-DK"/>
+        </w:rPr>
+      </w:pPr>
+      <w:r>
+        <w:rPr>
+          <w:lang w:val="da-DK"/>
+        </w:rPr>
+        <w:t xml:space="preserve">Opret én variabel 'sensor' af typen </w:t>
+      </w:r>
+      <w:proofErr w:type="spellStart"/>
+      <w:r>
+        <w:rPr>
+          <w:lang w:val="da-DK"/>
+        </w:rPr>
+        <w:t>TempSensor</w:t>
+      </w:r>
+      <w:proofErr w:type="spellEnd"/>
+    </w:p>
+    <w:p>
+      <w:pPr>
+        <w:pStyle w:val="BodyText"/>
+        <w:numPr>
+          <w:ilvl w:val="1"/>
+          <w:numId w:val="15"/>
+        </w:numPr>
+        <w:rPr>
+          <w:lang w:val="da-DK"/>
+        </w:rPr>
+      </w:pPr>
+      <w:r>
+        <w:rPr>
+          <w:lang w:val="da-DK"/>
+        </w:rPr>
+        <w:t>Tildel værdier til felterne manuelt</w:t>
+      </w:r>
+    </w:p>
+    <w:p>
+      <w:pPr>
+        <w:pStyle w:val="BodyText"/>
+        <w:numPr>
+          <w:ilvl w:val="1"/>
+          <w:numId w:val="15"/>
+        </w:numPr>
+        <w:rPr>
+          <w:lang w:val="da-DK"/>
+        </w:rPr>
+      </w:pPr>
+      <w:r>
+        <w:rPr>
+          <w:lang w:val="da-DK"/>
+        </w:rPr>
+        <w:t>Udskriv værdierne til skærmen</w:t>
+      </w:r>
+    </w:p>
+    <w:p>
+      <w:pPr>
+        <w:pStyle w:val="BodyText"/>
+        <w:rPr>
+          <w:lang w:val="da-DK"/>
+        </w:rPr>
+      </w:pPr>
+    </w:p>
+    <w:p>
+      <w:pPr>
+        <w:pStyle w:val="Heading"/>
+        <w:rPr>
+          <w:lang w:val="da-DK"/>
+        </w:rPr>
+      </w:pPr>
+      <w:r>
+        <w:rPr>
+          <w:lang w:val="da-DK"/>
+        </w:rPr>
         <w:t xml:space="preserve">Q: </w:t>
       </w:r>
       <w:proofErr w:type="spellStart"/>
       <w:r>
-        <w:t>example_t</w:t>
-      </w:r>
-      <w:r>
-        <w:t>imemodule</w:t>
+        <w:rPr>
+          <w:lang w:val="da-DK"/>
+        </w:rPr>
+        <w:t>example_timemodule</w:t>
       </w:r>
       <w:proofErr w:type="spellEnd"/>
     </w:p>
@@ -598,19 +822,11 @@
           <w:lang w:val="da-DK"/>
         </w:rPr>
       </w:pPr>
-      <w:proofErr w:type="gramStart"/>
-      <w:r>
-        <w:rPr>
-          <w:lang w:val="da-DK"/>
-        </w:rPr>
-        <w:t>Hint</w:t>
-      </w:r>
-      <w:proofErr w:type="gramEnd"/>
-      <w:r>
-        <w:rPr>
-          <w:lang w:val="da-DK"/>
-        </w:rPr>
-        <w:t xml:space="preserve">: Hvad gør funktionen </w:t>
+      <w:r>
+        <w:rPr>
+          <w:lang w:val="da-DK"/>
+        </w:rPr>
+        <w:t xml:space="preserve">Hint: Hvad gør funktionen </w:t>
       </w:r>
       <w:proofErr w:type="spellStart"/>
       <w:r>
@@ -762,19 +978,11 @@
           <w:lang w:val="da-DK"/>
         </w:rPr>
       </w:pPr>
-      <w:proofErr w:type="gramStart"/>
-      <w:r>
-        <w:rPr>
-          <w:lang w:val="da-DK"/>
-        </w:rPr>
-        <w:t>Hint</w:t>
-      </w:r>
-      <w:proofErr w:type="gramEnd"/>
-      <w:r>
-        <w:rPr>
-          <w:lang w:val="da-DK"/>
-        </w:rPr>
-        <w:t>: cs50 manual</w:t>
+      <w:r>
+        <w:rPr>
+          <w:lang w:val="da-DK"/>
+        </w:rPr>
+        <w:t>Hint: cs50 manual</w:t>
       </w:r>
     </w:p>
     <w:p>
@@ -844,7 +1052,6 @@
         <w:rPr>
           <w:lang w:val="da-DK"/>
         </w:rPr>
-        <w:lastRenderedPageBreak/>
         <w:t xml:space="preserve">Print antal bytes som </w:t>
       </w:r>
       <w:proofErr w:type="spellStart"/>
@@ -873,21 +1080,7 @@
         <w:rPr>
           <w:lang w:val="da-DK"/>
         </w:rPr>
-        <w:t xml:space="preserve"> indeholder (</w:t>
-      </w:r>
-      <w:proofErr w:type="gramStart"/>
-      <w:r>
-        <w:rPr>
-          <w:lang w:val="da-DK"/>
-        </w:rPr>
-        <w:t>Hint</w:t>
-      </w:r>
-      <w:proofErr w:type="gramEnd"/>
-      <w:r>
-        <w:rPr>
-          <w:lang w:val="da-DK"/>
-        </w:rPr>
-        <w:t xml:space="preserve">: </w:t>
+        <w:t xml:space="preserve"> indeholder (Hint: </w:t>
       </w:r>
       <w:proofErr w:type="spellStart"/>
       <w:r>
@@ -949,13 +1142,22 @@
     <w:p>
       <w:pPr>
         <w:pStyle w:val="BodyText"/>
+        <w:rPr>
+          <w:lang w:val="da-DK"/>
+        </w:rPr>
       </w:pPr>
     </w:p>
     <w:p>
       <w:pPr>
         <w:pStyle w:val="Heading"/>
-      </w:pPr>
-      <w:r>
+        <w:rPr>
+          <w:lang w:val="da-DK"/>
+        </w:rPr>
+      </w:pPr>
+      <w:r>
+        <w:rPr>
+          <w:lang w:val="da-DK"/>
+        </w:rPr>
         <w:t>Q: union1</w:t>
       </w:r>
     </w:p>
@@ -991,7 +1193,6 @@
         <w:t xml:space="preserve">Hvorfor har </w:t>
       </w:r>
       <w:proofErr w:type="spellStart"/>
-      <w:proofErr w:type="gramStart"/>
       <w:r>
         <w:rPr>
           <w:lang w:val="da-DK"/>
@@ -999,7 +1200,6 @@
         <w:t>data.i</w:t>
       </w:r>
       <w:proofErr w:type="spellEnd"/>
-      <w:proofErr w:type="gramEnd"/>
       <w:r>
         <w:rPr>
           <w:lang w:val="da-DK"/>
@@ -1007,7 +1207,6 @@
         <w:t xml:space="preserve"> = 10 og </w:t>
       </w:r>
       <w:proofErr w:type="spellStart"/>
-      <w:proofErr w:type="gramStart"/>
       <w:r>
         <w:rPr>
           <w:lang w:val="da-DK"/>
@@ -1015,7 +1214,6 @@
         <w:t>data.f</w:t>
       </w:r>
       <w:proofErr w:type="spellEnd"/>
-      <w:proofErr w:type="gramEnd"/>
       <w:r>
         <w:rPr>
           <w:lang w:val="da-DK"/>
@@ -1055,7 +1253,6 @@
         <w:t xml:space="preserve">Forklar sammenhængen mellem </w:t>
       </w:r>
       <w:proofErr w:type="spellStart"/>
-      <w:proofErr w:type="gramStart"/>
       <w:r>
         <w:rPr>
           <w:lang w:val="da-DK"/>
@@ -1063,7 +1260,6 @@
         <w:t>data.i</w:t>
       </w:r>
       <w:proofErr w:type="spellEnd"/>
-      <w:proofErr w:type="gramEnd"/>
       <w:r>
         <w:rPr>
           <w:lang w:val="da-DK"/>
@@ -1071,7 +1267,6 @@
         <w:t xml:space="preserve"> og </w:t>
       </w:r>
       <w:proofErr w:type="spellStart"/>
-      <w:proofErr w:type="gramStart"/>
       <w:r>
         <w:rPr>
           <w:lang w:val="da-DK"/>
@@ -1085,7 +1280,6 @@
         </w:rPr>
         <w:t xml:space="preserve"> ?</w:t>
       </w:r>
-      <w:proofErr w:type="gramEnd"/>
       <w:r>
         <w:rPr>
           <w:lang w:val="da-DK"/>
@@ -1094,7 +1288,6 @@
         <w:t xml:space="preserve">(print eventuelt </w:t>
       </w:r>
       <w:proofErr w:type="spellStart"/>
-      <w:proofErr w:type="gramStart"/>
       <w:r>
         <w:rPr>
           <w:lang w:val="da-DK"/>
@@ -1102,7 +1295,6 @@
         <w:t>data.i</w:t>
       </w:r>
       <w:proofErr w:type="spellEnd"/>
-      <w:proofErr w:type="gramEnd"/>
       <w:r>
         <w:rPr>
           <w:lang w:val="da-DK"/>
@@ -1160,7 +1352,6 @@
         <w:t xml:space="preserve">Hvorfor giver </w:t>
       </w:r>
       <w:proofErr w:type="spellStart"/>
-      <w:proofErr w:type="gramStart"/>
       <w:r>
         <w:rPr>
           <w:lang w:val="da-DK"/>
@@ -1168,7 +1359,6 @@
         <w:t>data.f</w:t>
       </w:r>
       <w:proofErr w:type="spellEnd"/>
-      <w:proofErr w:type="gramEnd"/>
       <w:r>
         <w:rPr>
           <w:lang w:val="da-DK"/>
@@ -1187,19 +1377,11 @@
           <w:lang w:val="da-DK"/>
         </w:rPr>
       </w:pPr>
-      <w:proofErr w:type="gramStart"/>
-      <w:r>
-        <w:rPr>
-          <w:lang w:val="da-DK"/>
-        </w:rPr>
-        <w:t>Hint</w:t>
-      </w:r>
-      <w:proofErr w:type="gramEnd"/>
-      <w:r>
-        <w:rPr>
-          <w:lang w:val="da-DK"/>
-        </w:rPr>
-        <w:t xml:space="preserve">: når man skriver "abc", hvad står der så på </w:t>
+      <w:r>
+        <w:rPr>
+          <w:lang w:val="da-DK"/>
+        </w:rPr>
+        <w:t xml:space="preserve">Hint: når man skriver "abc", hvad står der så på </w:t>
       </w:r>
       <w:proofErr w:type="spellStart"/>
       <w:r>
@@ -1403,6 +1585,7 @@
         <w:rPr>
           <w:lang w:val="da-DK"/>
         </w:rPr>
+        <w:lastRenderedPageBreak/>
         <w:t>Right=35</w:t>
       </w:r>
     </w:p>
@@ -1442,19 +1625,11 @@
           <w:lang w:val="da-DK"/>
         </w:rPr>
       </w:pPr>
-      <w:proofErr w:type="gramStart"/>
-      <w:r>
-        <w:rPr>
-          <w:lang w:val="da-DK"/>
-        </w:rPr>
-        <w:t>Hint</w:t>
-      </w:r>
-      <w:proofErr w:type="gramEnd"/>
-      <w:r>
-        <w:rPr>
-          <w:lang w:val="da-DK"/>
-        </w:rPr>
-        <w:t xml:space="preserve">: Find ud af hvordan man aktiverer knapperne her: </w:t>
+      <w:r>
+        <w:rPr>
+          <w:lang w:val="da-DK"/>
+        </w:rPr>
+        <w:t xml:space="preserve">Hint: Find ud af hvordan man aktiverer knapperne her: </w:t>
       </w:r>
       <w:hyperlink r:id="rId5" w:history="1">
         <w:r>
@@ -1572,7 +1747,9 @@
         </w:rPr>
       </w:pPr>
       <w:r>
-        <w:lastRenderedPageBreak/>
+        <w:rPr>
+          <w:noProof/>
+        </w:rPr>
         <w:drawing>
           <wp:inline distT="0" distB="0" distL="0" distR="0" wp14:anchorId="61C81B22" wp14:editId="350C32C3">
             <wp:extent cx="4347714" cy="2689307"/>
@@ -1693,19 +1870,11 @@
           <w:lang w:val="da-DK"/>
         </w:rPr>
       </w:pPr>
-      <w:proofErr w:type="gramStart"/>
-      <w:r>
-        <w:rPr>
-          <w:lang w:val="da-DK"/>
-        </w:rPr>
-        <w:t>Hint</w:t>
-      </w:r>
-      <w:proofErr w:type="gramEnd"/>
-      <w:r>
-        <w:rPr>
-          <w:lang w:val="da-DK"/>
-        </w:rPr>
-        <w:t xml:space="preserve">: </w:t>
+      <w:r>
+        <w:rPr>
+          <w:lang w:val="da-DK"/>
+        </w:rPr>
+        <w:t xml:space="preserve">Hint: </w:t>
       </w:r>
       <w:hyperlink r:id="rId7" w:history="1">
         <w:r>
@@ -2004,6 +2173,7 @@
         <w:rPr>
           <w:lang w:val="da-DK"/>
         </w:rPr>
+        <w:lastRenderedPageBreak/>
         <w:t xml:space="preserve">id 46, age 29, </w:t>
       </w:r>
       <w:proofErr w:type="spellStart"/>
@@ -2156,13 +2326,7 @@
         <w:rPr>
           <w:lang w:val="da-DK"/>
         </w:rPr>
-        <w:t>Q: patient</w:t>
-      </w:r>
-      <w:r>
-        <w:rPr>
-          <w:lang w:val="da-DK"/>
-        </w:rPr>
-        <w:t>3</w:t>
+        <w:t>Q: patient3</w:t>
       </w:r>
     </w:p>
     <w:p>
@@ -2238,7 +2402,6 @@
         <w:rPr>
           <w:lang w:val="da-DK"/>
         </w:rPr>
-        <w:lastRenderedPageBreak/>
         <w:t>Brug patient2 som udgangspunkt.</w:t>
       </w:r>
     </w:p>
@@ -2735,13 +2898,7 @@
         <w:rPr>
           <w:lang w:val="da-DK"/>
         </w:rPr>
-        <w:t>Q: patient</w:t>
-      </w:r>
-      <w:r>
-        <w:rPr>
-          <w:lang w:val="da-DK"/>
-        </w:rPr>
-        <w:t>4</w:t>
+        <w:t>Q: patient4</w:t>
       </w:r>
     </w:p>
     <w:p>
@@ -3060,21 +3217,7 @@
         <w:rPr>
           <w:lang w:val="da-DK"/>
         </w:rPr>
-        <w:t xml:space="preserve">id </w:t>
-      </w:r>
-      <w:proofErr w:type="gramStart"/>
-      <w:r>
-        <w:rPr>
-          <w:lang w:val="da-DK"/>
-        </w:rPr>
-        <w:t>899 ,</w:t>
-      </w:r>
-      <w:proofErr w:type="gramEnd"/>
-      <w:r>
-        <w:rPr>
-          <w:lang w:val="da-DK"/>
-        </w:rPr>
-        <w:t xml:space="preserve"> age 25, </w:t>
+        <w:t xml:space="preserve">id 899 , age 25, </w:t>
       </w:r>
       <w:proofErr w:type="spellStart"/>
       <w:r>
@@ -3224,19 +3367,11 @@
           <w:lang w:val="da-DK"/>
         </w:rPr>
       </w:pPr>
-      <w:proofErr w:type="gramStart"/>
-      <w:r>
-        <w:rPr>
-          <w:lang w:val="da-DK"/>
-        </w:rPr>
-        <w:t>id  16</w:t>
-      </w:r>
-      <w:proofErr w:type="gramEnd"/>
-      <w:r>
-        <w:rPr>
-          <w:lang w:val="da-DK"/>
-        </w:rPr>
-        <w:t xml:space="preserve"> , age 56, </w:t>
+      <w:r>
+        <w:rPr>
+          <w:lang w:val="da-DK"/>
+        </w:rPr>
+        <w:t xml:space="preserve">id  16 , age 56, </w:t>
       </w:r>
       <w:proofErr w:type="spellStart"/>
       <w:r>
@@ -3286,19 +3421,12 @@
           <w:lang w:val="da-DK"/>
         </w:rPr>
       </w:pPr>
-      <w:proofErr w:type="gramStart"/>
-      <w:r>
-        <w:rPr>
-          <w:lang w:val="da-DK"/>
-        </w:rPr>
-        <w:t>id  16</w:t>
-      </w:r>
-      <w:proofErr w:type="gramEnd"/>
-      <w:r>
-        <w:rPr>
-          <w:lang w:val="da-DK"/>
-        </w:rPr>
-        <w:t xml:space="preserve"> , age 16, </w:t>
+      <w:r>
+        <w:rPr>
+          <w:lang w:val="da-DK"/>
+        </w:rPr>
+        <w:lastRenderedPageBreak/>
+        <w:t xml:space="preserve">id  16 , age 16, </w:t>
       </w:r>
       <w:proofErr w:type="spellStart"/>
       <w:r>
@@ -3364,39 +3492,17 @@
           <w:lang w:val="da-DK"/>
         </w:rPr>
       </w:pPr>
-      <w:proofErr w:type="gramStart"/>
-      <w:r>
-        <w:rPr>
-          <w:lang w:val="da-DK"/>
-        </w:rPr>
-        <w:t>Hint</w:t>
-      </w:r>
-      <w:proofErr w:type="gramEnd"/>
-      <w:r>
-        <w:rPr>
-          <w:lang w:val="da-DK"/>
-        </w:rPr>
-        <w:t xml:space="preserve">: </w:t>
-      </w:r>
-      <w:r>
-        <w:rPr>
-          <w:lang w:val="da-DK"/>
-        </w:rPr>
-        <w:t xml:space="preserve">Overvej hvordan man skal </w:t>
-      </w:r>
-      <w:proofErr w:type="gramStart"/>
-      <w:r>
-        <w:rPr>
-          <w:lang w:val="da-DK"/>
-        </w:rPr>
-        <w:t>håndterer</w:t>
-      </w:r>
-      <w:proofErr w:type="gramEnd"/>
-      <w:r>
-        <w:rPr>
-          <w:lang w:val="da-DK"/>
-        </w:rPr>
-        <w:t xml:space="preserve"> om det er en mand/kvinde, og hvordan patient3 udregningerne skal ændres, så det stadig er korrekt.</w:t>
+      <w:r>
+        <w:rPr>
+          <w:lang w:val="da-DK"/>
+        </w:rPr>
+        <w:t xml:space="preserve">Hint: </w:t>
+      </w:r>
+      <w:r>
+        <w:rPr>
+          <w:lang w:val="da-DK"/>
+        </w:rPr>
+        <w:t>Overvej hvordan man skal håndterer om det er en mand/kvinde, og hvordan patient3 udregningerne skal ændres, så det stadig er korrekt.</w:t>
       </w:r>
     </w:p>
     <w:p>
@@ -3410,19 +3516,11 @@
           <w:lang w:val="da-DK"/>
         </w:rPr>
       </w:pPr>
-      <w:proofErr w:type="gramStart"/>
-      <w:r>
-        <w:rPr>
-          <w:lang w:val="da-DK"/>
-        </w:rPr>
-        <w:t>Hint</w:t>
-      </w:r>
-      <w:proofErr w:type="gramEnd"/>
-      <w:r>
-        <w:rPr>
-          <w:lang w:val="da-DK"/>
-        </w:rPr>
-        <w:t xml:space="preserve">: overvej om man ikke kan gemme antallet af observationer for hhv. mænd / kvinder i den statistiske </w:t>
+      <w:r>
+        <w:rPr>
+          <w:lang w:val="da-DK"/>
+        </w:rPr>
+        <w:t xml:space="preserve">Hint: overvej om man ikke kan gemme antallet af observationer for hhv. mænd / kvinder i den statistiske </w:t>
       </w:r>
       <w:proofErr w:type="spellStart"/>
       <w:r>
@@ -3656,7 +3754,6 @@
         <w:pStyle w:val="Title"/>
       </w:pPr>
       <w:r>
-        <w:lastRenderedPageBreak/>
         <w:t>Answers</w:t>
       </w:r>
     </w:p>
@@ -3780,9 +3877,6 @@
     <w:p>
       <w:pPr>
         <w:pStyle w:val="BodyText"/>
-        <w:rPr>
-          <w:lang w:val="da-DK"/>
-        </w:rPr>
       </w:pPr>
       <w:r>
         <w:rPr>
@@ -3799,9 +3893,6 @@
     <w:p>
       <w:pPr>
         <w:pStyle w:val="BodyText"/>
-        <w:rPr>
-          <w:lang w:val="da-DK"/>
-        </w:rPr>
       </w:pPr>
       <w:r>
         <w:tab/>
@@ -3811,9 +3902,6 @@
     <w:p>
       <w:pPr>
         <w:pStyle w:val="BodyText"/>
-        <w:rPr>
-          <w:lang w:val="da-DK"/>
-        </w:rPr>
       </w:pPr>
       <w:r>
         <w:tab/>
@@ -3823,9 +3911,6 @@
     <w:p>
       <w:pPr>
         <w:pStyle w:val="BodyText"/>
-        <w:rPr>
-          <w:lang w:val="da-DK"/>
-        </w:rPr>
       </w:pPr>
       <w:r>
         <w:tab/>
@@ -3843,14 +3928,296 @@
       <w:pPr>
         <w:pStyle w:val="BodyText"/>
       </w:pPr>
-      <w:proofErr w:type="gramStart"/>
-      <w:r>
-        <w:t>Se</w:t>
-      </w:r>
-      <w:proofErr w:type="gramEnd"/>
-      <w:r>
-        <w:t xml:space="preserve"> patient1_sol.c</w:t>
-      </w:r>
+      <w:r>
+        <w:t>Se patient1_sol.c</w:t>
+      </w:r>
+    </w:p>
+    <w:p>
+      <w:pPr>
+        <w:pStyle w:val="Heading"/>
+        <w:rPr>
+          <w:lang w:val="da-DK"/>
+        </w:rPr>
+      </w:pPr>
+      <w:r>
+        <w:rPr>
+          <w:lang w:val="da-DK"/>
+        </w:rPr>
+        <w:t>A</w:t>
+      </w:r>
+      <w:r>
+        <w:rPr>
+          <w:lang w:val="da-DK"/>
+        </w:rPr>
+        <w:t xml:space="preserve">: Opret en simpel Sensor </w:t>
+      </w:r>
+      <w:proofErr w:type="spellStart"/>
+      <w:r>
+        <w:rPr>
+          <w:lang w:val="da-DK"/>
+        </w:rPr>
+        <w:t>Structur</w:t>
+      </w:r>
+      <w:proofErr w:type="spellEnd"/>
+    </w:p>
+    <w:p>
+      <w:pPr>
+        <w:pStyle w:val="BodyText"/>
+        <w:rPr>
+          <w:lang w:val="da-DK" w:bidi="ar-SA"/>
+        </w:rPr>
+      </w:pPr>
+      <w:r>
+        <w:rPr>
+          <w:lang w:val="da-DK" w:bidi="ar-SA"/>
+        </w:rPr>
+        <w:t xml:space="preserve">I mange biomedicinske systemer skal man håndtere og strukturere patientdata. I denne opgave skal du skrive et program, </w:t>
+      </w:r>
+      <w:proofErr w:type="spellStart"/>
+      <w:r>
+        <w:rPr>
+          <w:lang w:val="da-DK" w:bidi="ar-SA"/>
+        </w:rPr>
+        <w:t>sensorstruct</w:t>
+      </w:r>
+      <w:proofErr w:type="spellEnd"/>
+      <w:r>
+        <w:rPr>
+          <w:lang w:val="da-DK" w:bidi="ar-SA"/>
+        </w:rPr>
+        <w:t xml:space="preserve">, som indeholder en simpel </w:t>
+      </w:r>
+      <w:proofErr w:type="spellStart"/>
+      <w:r>
+        <w:rPr>
+          <w:lang w:val="da-DK" w:bidi="ar-SA"/>
+        </w:rPr>
+        <w:t>struct</w:t>
+      </w:r>
+      <w:proofErr w:type="spellEnd"/>
+      <w:r>
+        <w:rPr>
+          <w:lang w:val="da-DK" w:bidi="ar-SA"/>
+        </w:rPr>
+        <w:t xml:space="preserve">, der kan holde information om en sensor, der kan indlæse og vise disse data. </w:t>
+      </w:r>
+    </w:p>
+    <w:p>
+      <w:pPr>
+        <w:pStyle w:val="BodyText"/>
+        <w:numPr>
+          <w:ilvl w:val="0"/>
+          <w:numId w:val="16"/>
+        </w:numPr>
+        <w:rPr>
+          <w:lang w:val="da-DK"/>
+        </w:rPr>
+      </w:pPr>
+      <w:r>
+        <w:rPr>
+          <w:lang w:val="da-DK"/>
+        </w:rPr>
+        <w:t xml:space="preserve">Definér en </w:t>
+      </w:r>
+      <w:proofErr w:type="spellStart"/>
+      <w:r>
+        <w:rPr>
+          <w:lang w:val="da-DK"/>
+        </w:rPr>
+        <w:t>struct</w:t>
+      </w:r>
+      <w:proofErr w:type="spellEnd"/>
+      <w:r>
+        <w:rPr>
+          <w:lang w:val="da-DK"/>
+        </w:rPr>
+        <w:t xml:space="preserve"> kaldet </w:t>
+      </w:r>
+      <w:proofErr w:type="spellStart"/>
+      <w:r>
+        <w:rPr>
+          <w:lang w:val="da-DK"/>
+        </w:rPr>
+        <w:t>TempSensor</w:t>
+      </w:r>
+      <w:proofErr w:type="spellEnd"/>
+      <w:r>
+        <w:rPr>
+          <w:lang w:val="da-DK"/>
+        </w:rPr>
+        <w:t>, som indeholder:</w:t>
+      </w:r>
+    </w:p>
+    <w:p>
+      <w:pPr>
+        <w:pStyle w:val="BodyText"/>
+        <w:numPr>
+          <w:ilvl w:val="1"/>
+          <w:numId w:val="16"/>
+        </w:numPr>
+        <w:rPr>
+          <w:lang w:val="da-DK"/>
+        </w:rPr>
+      </w:pPr>
+      <w:proofErr w:type="spellStart"/>
+      <w:r>
+        <w:rPr>
+          <w:lang w:val="da-DK"/>
+        </w:rPr>
+        <w:t>int</w:t>
+      </w:r>
+      <w:proofErr w:type="spellEnd"/>
+      <w:r>
+        <w:rPr>
+          <w:lang w:val="da-DK"/>
+        </w:rPr>
+        <w:t xml:space="preserve"> id – sensorens ID</w:t>
+      </w:r>
+    </w:p>
+    <w:p>
+      <w:pPr>
+        <w:pStyle w:val="BodyText"/>
+        <w:numPr>
+          <w:ilvl w:val="1"/>
+          <w:numId w:val="16"/>
+        </w:numPr>
+        <w:rPr>
+          <w:lang w:val="da-DK"/>
+        </w:rPr>
+      </w:pPr>
+      <w:proofErr w:type="spellStart"/>
+      <w:r>
+        <w:rPr>
+          <w:lang w:val="da-DK"/>
+        </w:rPr>
+        <w:t>float</w:t>
+      </w:r>
+      <w:proofErr w:type="spellEnd"/>
+      <w:r>
+        <w:rPr>
+          <w:lang w:val="da-DK"/>
+        </w:rPr>
+        <w:t xml:space="preserve"> </w:t>
+      </w:r>
+      <w:proofErr w:type="spellStart"/>
+      <w:r>
+        <w:rPr>
+          <w:lang w:val="da-DK"/>
+        </w:rPr>
+        <w:t>temperature</w:t>
+      </w:r>
+      <w:proofErr w:type="spellEnd"/>
+      <w:r>
+        <w:rPr>
+          <w:lang w:val="da-DK"/>
+        </w:rPr>
+        <w:t xml:space="preserve"> – målt temperatur i grader Celsius</w:t>
+      </w:r>
+    </w:p>
+    <w:p>
+      <w:pPr>
+        <w:pStyle w:val="BodyText"/>
+        <w:numPr>
+          <w:ilvl w:val="0"/>
+          <w:numId w:val="16"/>
+        </w:numPr>
+        <w:rPr>
+          <w:lang w:val="da-DK"/>
+        </w:rPr>
+      </w:pPr>
+      <w:r>
+        <w:rPr>
+          <w:lang w:val="da-DK"/>
+        </w:rPr>
+        <w:t xml:space="preserve">I </w:t>
+      </w:r>
+      <w:proofErr w:type="spellStart"/>
+      <w:r>
+        <w:rPr>
+          <w:lang w:val="da-DK"/>
+        </w:rPr>
+        <w:t>main</w:t>
+      </w:r>
+      <w:proofErr w:type="spellEnd"/>
+      <w:r>
+        <w:rPr>
+          <w:lang w:val="da-DK"/>
+        </w:rPr>
+        <w:t>():</w:t>
+      </w:r>
+    </w:p>
+    <w:p>
+      <w:pPr>
+        <w:pStyle w:val="BodyText"/>
+        <w:numPr>
+          <w:ilvl w:val="1"/>
+          <w:numId w:val="16"/>
+        </w:numPr>
+        <w:rPr>
+          <w:lang w:val="da-DK"/>
+        </w:rPr>
+      </w:pPr>
+      <w:r>
+        <w:rPr>
+          <w:lang w:val="da-DK"/>
+        </w:rPr>
+        <w:lastRenderedPageBreak/>
+        <w:t xml:space="preserve">Opret én variabel 'sensor' af typen </w:t>
+      </w:r>
+      <w:proofErr w:type="spellStart"/>
+      <w:r>
+        <w:rPr>
+          <w:lang w:val="da-DK"/>
+        </w:rPr>
+        <w:t>TempSensor</w:t>
+      </w:r>
+      <w:proofErr w:type="spellEnd"/>
+    </w:p>
+    <w:p>
+      <w:pPr>
+        <w:pStyle w:val="BodyText"/>
+        <w:numPr>
+          <w:ilvl w:val="1"/>
+          <w:numId w:val="16"/>
+        </w:numPr>
+        <w:rPr>
+          <w:lang w:val="da-DK"/>
+        </w:rPr>
+      </w:pPr>
+      <w:r>
+        <w:rPr>
+          <w:lang w:val="da-DK"/>
+        </w:rPr>
+        <w:t>Tildel værdier til felterne manuelt</w:t>
+      </w:r>
+    </w:p>
+    <w:p>
+      <w:pPr>
+        <w:pStyle w:val="BodyText"/>
+        <w:numPr>
+          <w:ilvl w:val="1"/>
+          <w:numId w:val="16"/>
+        </w:numPr>
+        <w:rPr>
+          <w:lang w:val="da-DK"/>
+        </w:rPr>
+      </w:pPr>
+      <w:r>
+        <w:rPr>
+          <w:lang w:val="da-DK"/>
+        </w:rPr>
+        <w:t>Udskriv værdierne til skærmen</w:t>
+      </w:r>
+    </w:p>
+    <w:p>
+      <w:pPr>
+        <w:pStyle w:val="BodyText"/>
+      </w:pPr>
+    </w:p>
+    <w:p>
+      <w:pPr>
+        <w:pStyle w:val="BodyText"/>
+      </w:pPr>
     </w:p>
     <w:p>
       <w:pPr>
@@ -3916,7 +4283,6 @@
         <w:t xml:space="preserve"> </w:t>
       </w:r>
       <w:proofErr w:type="spellStart"/>
-      <w:proofErr w:type="gramStart"/>
       <w:r>
         <w:rPr>
           <w:lang w:val="da-DK"/>
@@ -3936,16 +4302,7 @@
           <w:bCs/>
           <w:lang w:val="da-DK"/>
         </w:rPr>
-        <w:t>-</w:t>
-      </w:r>
-      <w:proofErr w:type="gramEnd"/>
-      <w:r>
-        <w:rPr>
-          <w:b/>
-          <w:bCs/>
-          <w:lang w:val="da-DK"/>
-        </w:rPr>
-        <w:t xml:space="preserve"> 36byte (9 </w:t>
+        <w:t xml:space="preserve">- 36byte (9 </w:t>
       </w:r>
       <w:proofErr w:type="spellStart"/>
       <w:r>
@@ -4144,10 +4501,7 @@
         <w:pStyle w:val="Heading"/>
       </w:pPr>
       <w:r>
-        <w:t>A</w:t>
-      </w:r>
-      <w:r>
-        <w:t>: union1</w:t>
+        <w:t>A: union1</w:t>
       </w:r>
     </w:p>
     <w:p>
@@ -4168,7 +4522,6 @@
         <w:t xml:space="preserve">Hvorfor har </w:t>
       </w:r>
       <w:proofErr w:type="spellStart"/>
-      <w:proofErr w:type="gramStart"/>
       <w:r>
         <w:rPr>
           <w:lang w:val="da-DK"/>
@@ -4176,7 +4529,6 @@
         <w:t>data.i</w:t>
       </w:r>
       <w:proofErr w:type="spellEnd"/>
-      <w:proofErr w:type="gramEnd"/>
       <w:r>
         <w:rPr>
           <w:lang w:val="da-DK"/>
@@ -4184,7 +4536,6 @@
         <w:t xml:space="preserve"> = 10 og </w:t>
       </w:r>
       <w:proofErr w:type="spellStart"/>
-      <w:proofErr w:type="gramStart"/>
       <w:r>
         <w:rPr>
           <w:lang w:val="da-DK"/>
@@ -4192,7 +4543,6 @@
         <w:t>data.f</w:t>
       </w:r>
       <w:proofErr w:type="spellEnd"/>
-      <w:proofErr w:type="gramEnd"/>
       <w:r>
         <w:rPr>
           <w:lang w:val="da-DK"/>
@@ -4213,25 +4563,140 @@
           <w:bCs/>
           <w:lang w:val="da-DK"/>
         </w:rPr>
-        <w:t xml:space="preserve"> Den gør at man kan gemme alle datatyper på samme hukommelse. MEN! Man kan kun gemme 1 ting </w:t>
-      </w:r>
-      <w:proofErr w:type="gramStart"/>
+        <w:t xml:space="preserve"> Den gør at man kan gemme alle datatyper på samme hukommelse. MEN! Man kan kun gemme 1 ting af gangen. Ellers bliver hukommelsen overskrevet.</w:t>
+      </w:r>
+    </w:p>
+    <w:p>
+      <w:pPr>
+        <w:pStyle w:val="BodyText"/>
+        <w:numPr>
+          <w:ilvl w:val="0"/>
+          <w:numId w:val="10"/>
+        </w:numPr>
+        <w:rPr>
+          <w:lang w:val="da-DK"/>
+        </w:rPr>
+      </w:pPr>
+      <w:r>
+        <w:rPr>
+          <w:lang w:val="da-DK"/>
+        </w:rPr>
+        <w:t xml:space="preserve">Forklar sammenhængen mellem </w:t>
+      </w:r>
+      <w:proofErr w:type="spellStart"/>
+      <w:r>
+        <w:rPr>
+          <w:lang w:val="da-DK"/>
+        </w:rPr>
+        <w:t>data.i</w:t>
+      </w:r>
+      <w:proofErr w:type="spellEnd"/>
+      <w:r>
+        <w:rPr>
+          <w:lang w:val="da-DK"/>
+        </w:rPr>
+        <w:t xml:space="preserve"> og </w:t>
+      </w:r>
+      <w:proofErr w:type="spellStart"/>
+      <w:r>
+        <w:rPr>
+          <w:lang w:val="da-DK"/>
+        </w:rPr>
+        <w:t>data.str</w:t>
+      </w:r>
+      <w:proofErr w:type="spellEnd"/>
+      <w:r>
+        <w:rPr>
+          <w:lang w:val="da-DK"/>
+        </w:rPr>
+        <w:t xml:space="preserve"> ?</w:t>
+      </w:r>
+      <w:r>
+        <w:rPr>
+          <w:lang w:val="da-DK"/>
+        </w:rPr>
+        <w:br/>
+        <w:t xml:space="preserve">(print eventuelt </w:t>
+      </w:r>
+      <w:proofErr w:type="spellStart"/>
+      <w:r>
+        <w:rPr>
+          <w:lang w:val="da-DK"/>
+        </w:rPr>
+        <w:t>data.i</w:t>
+      </w:r>
+      <w:proofErr w:type="spellEnd"/>
+      <w:r>
+        <w:rPr>
+          <w:lang w:val="da-DK"/>
+        </w:rPr>
+        <w:t xml:space="preserve"> som en </w:t>
+      </w:r>
+      <w:proofErr w:type="spellStart"/>
+      <w:r>
+        <w:rPr>
+          <w:lang w:val="da-DK"/>
+        </w:rPr>
+        <w:t>hex-value</w:t>
+      </w:r>
+      <w:proofErr w:type="spellEnd"/>
+      <w:r>
+        <w:rPr>
+          <w:lang w:val="da-DK"/>
+        </w:rPr>
+        <w:t xml:space="preserve">) </w:t>
+      </w:r>
       <w:r>
         <w:rPr>
           <w:b/>
           <w:bCs/>
           <w:lang w:val="da-DK"/>
         </w:rPr>
-        <w:t>af</w:t>
-      </w:r>
-      <w:proofErr w:type="gramEnd"/>
+        <w:t>– Samme som bytearray</w:t>
+      </w:r>
+    </w:p>
+    <w:p>
+      <w:pPr>
+        <w:pStyle w:val="BodyText"/>
+        <w:numPr>
+          <w:ilvl w:val="0"/>
+          <w:numId w:val="10"/>
+        </w:numPr>
+        <w:rPr>
+          <w:lang w:val="da-DK"/>
+        </w:rPr>
+      </w:pPr>
+      <w:r>
+        <w:rPr>
+          <w:lang w:val="da-DK"/>
+        </w:rPr>
+        <w:t xml:space="preserve">Hvor meget plads fylder denne union (hvad bestemmer det og hvorfor lige dette tal)? – </w:t>
+      </w:r>
       <w:r>
         <w:rPr>
           <w:b/>
           <w:bCs/>
           <w:lang w:val="da-DK"/>
         </w:rPr>
-        <w:t xml:space="preserve"> gangen. Ellers bliver hukommelsen overskrevet.</w:t>
+        <w:t>4 byte (</w:t>
+      </w:r>
+      <w:proofErr w:type="spellStart"/>
+      <w:r>
+        <w:rPr>
+          <w:b/>
+          <w:bCs/>
+          <w:lang w:val="da-DK"/>
+        </w:rPr>
+        <w:t>int</w:t>
+      </w:r>
+      <w:proofErr w:type="spellEnd"/>
+      <w:r>
+        <w:rPr>
+          <w:b/>
+          <w:bCs/>
+          <w:lang w:val="da-DK"/>
+        </w:rPr>
+        <w:t>)</w:t>
       </w:r>
     </w:p>
     <w:p>
@@ -4249,72 +4714,21 @@
         <w:rPr>
           <w:lang w:val="da-DK"/>
         </w:rPr>
-        <w:t xml:space="preserve">Forklar sammenhængen mellem </w:t>
-      </w:r>
-      <w:proofErr w:type="spellStart"/>
-      <w:r>
-        <w:rPr>
-          <w:lang w:val="da-DK"/>
-        </w:rPr>
-        <w:t>data.i</w:t>
-      </w:r>
-      <w:proofErr w:type="spellEnd"/>
-      <w:r>
-        <w:rPr>
-          <w:lang w:val="da-DK"/>
-        </w:rPr>
-        <w:t xml:space="preserve"> og </w:t>
-      </w:r>
-      <w:proofErr w:type="spellStart"/>
-      <w:r>
-        <w:rPr>
-          <w:lang w:val="da-DK"/>
-        </w:rPr>
-        <w:t>data.str</w:t>
-      </w:r>
-      <w:proofErr w:type="spellEnd"/>
-      <w:r>
-        <w:rPr>
-          <w:lang w:val="da-DK"/>
-        </w:rPr>
-        <w:t xml:space="preserve"> ?</w:t>
-      </w:r>
-      <w:r>
-        <w:rPr>
-          <w:lang w:val="da-DK"/>
-        </w:rPr>
-        <w:br/>
-        <w:t xml:space="preserve">(print eventuelt </w:t>
-      </w:r>
-      <w:proofErr w:type="spellStart"/>
-      <w:proofErr w:type="gramStart"/>
-      <w:r>
-        <w:rPr>
-          <w:lang w:val="da-DK"/>
-        </w:rPr>
-        <w:t>data.i</w:t>
-      </w:r>
-      <w:proofErr w:type="spellEnd"/>
-      <w:proofErr w:type="gramEnd"/>
-      <w:r>
-        <w:rPr>
-          <w:lang w:val="da-DK"/>
-        </w:rPr>
-        <w:t xml:space="preserve"> som en </w:t>
-      </w:r>
-      <w:proofErr w:type="spellStart"/>
-      <w:r>
-        <w:rPr>
-          <w:lang w:val="da-DK"/>
-        </w:rPr>
-        <w:t>hex-value</w:t>
-      </w:r>
-      <w:proofErr w:type="spellEnd"/>
-      <w:r>
-        <w:rPr>
-          <w:lang w:val="da-DK"/>
-        </w:rPr>
-        <w:t xml:space="preserve">) </w:t>
+        <w:t xml:space="preserve">Hvorfor giver </w:t>
+      </w:r>
+      <w:proofErr w:type="spellStart"/>
+      <w:r>
+        <w:rPr>
+          <w:lang w:val="da-DK"/>
+        </w:rPr>
+        <w:t>data.f</w:t>
+      </w:r>
+      <w:proofErr w:type="spellEnd"/>
+      <w:r>
+        <w:rPr>
+          <w:lang w:val="da-DK"/>
+        </w:rPr>
+        <w:t xml:space="preserve"> ikke noget output? (0). </w:t>
       </w:r>
       <w:r>
         <w:rPr>
@@ -4322,147 +4736,33 @@
           <w:bCs/>
           <w:lang w:val="da-DK"/>
         </w:rPr>
-        <w:t>– Samme som bytearray</w:t>
-      </w:r>
-    </w:p>
-    <w:p>
-      <w:pPr>
-        <w:pStyle w:val="BodyText"/>
-        <w:numPr>
-          <w:ilvl w:val="0"/>
-          <w:numId w:val="10"/>
-        </w:numPr>
-        <w:rPr>
-          <w:lang w:val="da-DK"/>
-        </w:rPr>
-      </w:pPr>
-      <w:r>
-        <w:rPr>
-          <w:lang w:val="da-DK"/>
-        </w:rPr>
-        <w:t xml:space="preserve">Hvor meget plads fylder denne union (hvad bestemmer det og hvorfor lige dette tal)? – </w:t>
-      </w:r>
+        <w:t xml:space="preserve">– </w:t>
+      </w:r>
+      <w:proofErr w:type="spellStart"/>
       <w:r>
         <w:rPr>
           <w:b/>
           <w:bCs/>
           <w:lang w:val="da-DK"/>
         </w:rPr>
-        <w:t>4 byte (</w:t>
-      </w:r>
-      <w:proofErr w:type="spellStart"/>
+        <w:t>data.byte_array</w:t>
+      </w:r>
+      <w:proofErr w:type="spellEnd"/>
       <w:r>
         <w:rPr>
           <w:b/>
           <w:bCs/>
           <w:lang w:val="da-DK"/>
         </w:rPr>
-        <w:t>int</w:t>
-      </w:r>
-      <w:proofErr w:type="spellEnd"/>
+        <w:t xml:space="preserve">[3] is </w:t>
+      </w:r>
+      <w:proofErr w:type="spellStart"/>
       <w:r>
         <w:rPr>
           <w:b/>
           <w:bCs/>
           <w:lang w:val="da-DK"/>
         </w:rPr>
-        <w:t>)</w:t>
-      </w:r>
-    </w:p>
-    <w:p>
-      <w:pPr>
-        <w:pStyle w:val="BodyText"/>
-        <w:numPr>
-          <w:ilvl w:val="0"/>
-          <w:numId w:val="10"/>
-        </w:numPr>
-        <w:rPr>
-          <w:lang w:val="da-DK"/>
-        </w:rPr>
-      </w:pPr>
-      <w:r>
-        <w:rPr>
-          <w:lang w:val="da-DK"/>
-        </w:rPr>
-        <w:t xml:space="preserve">Hvorfor giver </w:t>
-      </w:r>
-      <w:proofErr w:type="spellStart"/>
-      <w:proofErr w:type="gramStart"/>
-      <w:r>
-        <w:rPr>
-          <w:lang w:val="da-DK"/>
-        </w:rPr>
-        <w:t>data.f</w:t>
-      </w:r>
-      <w:proofErr w:type="spellEnd"/>
-      <w:proofErr w:type="gramEnd"/>
-      <w:r>
-        <w:rPr>
-          <w:lang w:val="da-DK"/>
-        </w:rPr>
-        <w:t xml:space="preserve"> ikke noget output? (0). </w:t>
-      </w:r>
-      <w:r>
-        <w:rPr>
-          <w:b/>
-          <w:bCs/>
-          <w:lang w:val="da-DK"/>
-        </w:rPr>
-        <w:t xml:space="preserve">– </w:t>
-      </w:r>
-      <w:proofErr w:type="spellStart"/>
-      <w:proofErr w:type="gramStart"/>
-      <w:r>
-        <w:rPr>
-          <w:b/>
-          <w:bCs/>
-          <w:lang w:val="da-DK"/>
-        </w:rPr>
-        <w:t>data.byte</w:t>
-      </w:r>
-      <w:proofErr w:type="gramEnd"/>
-      <w:r>
-        <w:rPr>
-          <w:b/>
-          <w:bCs/>
-          <w:lang w:val="da-DK"/>
-        </w:rPr>
-        <w:t>_</w:t>
-      </w:r>
-      <w:proofErr w:type="gramStart"/>
-      <w:r>
-        <w:rPr>
-          <w:b/>
-          <w:bCs/>
-          <w:lang w:val="da-DK"/>
-        </w:rPr>
-        <w:t>array</w:t>
-      </w:r>
-      <w:proofErr w:type="spellEnd"/>
-      <w:r>
-        <w:rPr>
-          <w:b/>
-          <w:bCs/>
-          <w:lang w:val="da-DK"/>
-        </w:rPr>
-        <w:t>[</w:t>
-      </w:r>
-      <w:proofErr w:type="gramEnd"/>
-      <w:r>
-        <w:rPr>
-          <w:b/>
-          <w:bCs/>
-          <w:lang w:val="da-DK"/>
-        </w:rPr>
-        <w:t xml:space="preserve">3] is </w:t>
-      </w:r>
-      <w:proofErr w:type="spellStart"/>
-      <w:r>
-        <w:rPr>
-          <w:b/>
-          <w:bCs/>
-          <w:lang w:val="da-DK"/>
-        </w:rPr>
         <w:t>exponent</w:t>
       </w:r>
       <w:proofErr w:type="spellEnd"/>
@@ -4478,14 +4778,7 @@
         <w:rPr>
           <w:lang w:val="da-DK"/>
         </w:rPr>
-        <w:lastRenderedPageBreak/>
-        <w:t>A</w:t>
-      </w:r>
-      <w:r>
-        <w:rPr>
-          <w:lang w:val="da-DK"/>
-        </w:rPr>
-        <w:t xml:space="preserve">: </w:t>
+        <w:t xml:space="preserve">A: </w:t>
       </w:r>
       <w:r>
         <w:rPr>
@@ -4520,22 +4813,40 @@
       <w:pPr>
         <w:pStyle w:val="BodyText"/>
       </w:pPr>
-      <w:proofErr w:type="gramStart"/>
       <w:r>
         <w:t xml:space="preserve">Se  </w:t>
       </w:r>
       <w:r>
+        <w:t>patient2_sol.c</w:t>
+      </w:r>
+    </w:p>
+    <w:p>
+      <w:pPr>
+        <w:pStyle w:val="Heading"/>
+      </w:pPr>
+      <w:r>
+        <w:t xml:space="preserve">A: </w:t>
+      </w:r>
+      <w:r>
+        <w:t>patient3</w:t>
+      </w:r>
+    </w:p>
+    <w:p>
+      <w:pPr>
+        <w:pStyle w:val="BodyText"/>
+      </w:pPr>
+      <w:r>
+        <w:t xml:space="preserve">Se  </w:t>
+      </w:r>
+      <w:r>
         <w:t>patient</w:t>
       </w:r>
-      <w:proofErr w:type="gramEnd"/>
-      <w:r>
-        <w:t>2_sol</w:t>
-      </w:r>
-      <w:proofErr w:type="gramStart"/>
-      <w:r>
-        <w:t>.c</w:t>
-      </w:r>
-      <w:proofErr w:type="gramEnd"/>
+      <w:r>
+        <w:t>3</w:t>
+      </w:r>
+      <w:r>
+        <w:t>_sol.c</w:t>
+      </w:r>
     </w:p>
     <w:p>
       <w:pPr>
@@ -4545,61 +4856,15 @@
         <w:t xml:space="preserve">A: </w:t>
       </w:r>
       <w:r>
-        <w:t>patient</w:t>
-      </w:r>
-      <w:r>
-        <w:t>3</w:t>
-      </w:r>
-    </w:p>
-    <w:p>
-      <w:pPr>
-        <w:pStyle w:val="BodyText"/>
-      </w:pPr>
-      <w:proofErr w:type="gramStart"/>
-      <w:r>
-        <w:t xml:space="preserve">Se  </w:t>
-      </w:r>
-      <w:r>
-        <w:t>patient</w:t>
-      </w:r>
-      <w:proofErr w:type="gramEnd"/>
-      <w:r>
-        <w:t>3</w:t>
-      </w:r>
-      <w:r>
-        <w:t>_sol</w:t>
-      </w:r>
-      <w:proofErr w:type="gramStart"/>
-      <w:r>
-        <w:t>.c</w:t>
-      </w:r>
-      <w:proofErr w:type="gramEnd"/>
-    </w:p>
-    <w:p>
-      <w:pPr>
-        <w:pStyle w:val="Heading"/>
-      </w:pPr>
-      <w:r>
-        <w:t xml:space="preserve">A: </w:t>
-      </w:r>
-      <w:r>
-        <w:t>patient</w:t>
-      </w:r>
-      <w:r>
-        <w:t>4</w:t>
-      </w:r>
-    </w:p>
-    <w:p>
-      <w:pPr>
-        <w:pStyle w:val="BodyText"/>
-      </w:pPr>
-      <w:proofErr w:type="gramStart"/>
-      <w:r>
-        <w:t>Se</w:t>
-      </w:r>
-      <w:proofErr w:type="gramEnd"/>
-      <w:r>
-        <w:t xml:space="preserve"> </w:t>
+        <w:t>patient4</w:t>
+      </w:r>
+    </w:p>
+    <w:p>
+      <w:pPr>
+        <w:pStyle w:val="BodyText"/>
+      </w:pPr>
+      <w:r>
+        <w:t xml:space="preserve">Se </w:t>
       </w:r>
       <w:r>
         <w:t>patient1to4_sol.c</w:t>
@@ -4623,6 +4888,121 @@
 <file path=word/numbering.xml><?xml version="1.0" encoding="utf-8"?>
 <w:numbering xmlns:wpc="http://schemas.microsoft.com/office/word/2010/wordprocessingCanvas" xmlns:cx="http://schemas.microsoft.com/office/drawing/2014/chartex" xmlns:cx1="http://schemas.microsoft.com/office/drawing/2015/9/8/chartex" xmlns:cx2="http://schemas.microsoft.com/office/drawing/2015/10/21/chartex" xmlns:cx3="http://schemas.microsoft.com/office/drawing/2016/5/9/chartex" xmlns:cx4="http://schemas.microsoft.com/office/drawing/2016/5/10/chartex" xmlns:cx5="http://schemas.microsoft.com/office/drawing/2016/5/11/chartex" xmlns:cx6="http://schemas.microsoft.com/office/drawing/2016/5/12/chartex" xmlns:cx7="http://schemas.microsoft.com/office/drawing/2016/5/13/chartex" xmlns:cx8="http://schemas.microsoft.com/office/drawing/2016/5/14/chartex" xmlns:mc="http://schemas.openxmlformats.org/markup-compatibility/2006" xmlns:aink="http://schemas.microsoft.com/office/drawing/2016/ink" xmlns:am3d="http://schemas.microsoft.com/office/drawing/2017/model3d" xmlns:o="urn:schemas-microsoft-com:office:office" xmlns:oel="http://schemas.microsoft.com/office/2019/extlst" xmlns:r="http://schemas.openxmlformats.org/officeDocument/2006/relationships" xmlns:m="http://schemas.openxmlformats.org/officeDocument/2006/math" xmlns:v="urn:schemas-microsoft-com:vml" xmlns:wp14="http://schemas.microsoft.com/office/word/2010/wordprocessingDrawing" xmlns:wp="http://schemas.openxmlformats.org/drawingml/2006/wordprocessingDrawing" xmlns:w10="urn:schemas-microsoft-com:office:word" xmlns:w="http://schemas.openxmlformats.org/wordprocessingml/2006/main" xmlns:w14="http://schemas.microsoft.com/office/word/2010/wordml" xmlns:w15="http://schemas.microsoft.com/office/word/2012/wordml" xmlns:w16cex="http://schemas.microsoft.com/office/word/2018/wordml/cex" xmlns:w16cid="http://schemas.microsoft.com/office/word/2016/wordml/cid" xmlns:w16="http://schemas.microsoft.com/office/word/2018/wordml" xmlns:w16du="http://schemas.microsoft.com/office/word/2023/wordml/word16du" xmlns:w16sdtdh="http://schemas.microsoft.com/office/word/2020/wordml/sdtdatahash" xmlns:w16sdtfl="http://schemas.microsoft.com/office/word/2024/wordml/sdtformatlock" xmlns:w16se="http://schemas.microsoft.com/office/word/2015/wordml/symex" xmlns:wpg="http://schemas.microsoft.com/office/word/2010/wordprocessingGroup" xmlns:wpi="http://schemas.microsoft.com/office/word/2010/wordprocessingInk" xmlns:wne="http://schemas.microsoft.com/office/word/2006/wordml" xmlns:wps="http://schemas.microsoft.com/office/word/2010/wordprocessingShape" mc:Ignorable="w14 w15 w16se w16cid w16 w16cex w16sdtdh w16sdtfl w16du wp14">
   <w:abstractNum w:abstractNumId="0" w15:restartNumberingAfterBreak="0">
+    <w:nsid w:val="12B1574C"/>
+    <w:multiLevelType w:val="hybridMultilevel"/>
+    <w:tmpl w:val="70A87F5A"/>
+    <w:lvl w:ilvl="0" w:tplc="2D30E990">
+      <w:start w:val="1"/>
+      <w:numFmt w:val="decimal"/>
+      <w:lvlText w:val="%1."/>
+      <w:lvlJc w:val="left"/>
+      <w:pPr>
+        <w:tabs>
+          <w:tab w:val="num" w:pos="720"/>
+        </w:tabs>
+        <w:ind w:left="720" w:hanging="360"/>
+      </w:pPr>
+    </w:lvl>
+    <w:lvl w:ilvl="1" w:tplc="CBF4F554">
+      <w:numFmt w:val="bullet"/>
+      <w:lvlText w:val=""/>
+      <w:lvlJc w:val="left"/>
+      <w:pPr>
+        <w:tabs>
+          <w:tab w:val="num" w:pos="1440"/>
+        </w:tabs>
+        <w:ind w:left="1440" w:hanging="360"/>
+      </w:pPr>
+      <w:rPr>
+        <w:rFonts w:ascii="Symbol" w:hAnsi="Symbol" w:hint="default"/>
+      </w:rPr>
+    </w:lvl>
+    <w:lvl w:ilvl="2" w:tplc="625249F6" w:tentative="1">
+      <w:start w:val="1"/>
+      <w:numFmt w:val="decimal"/>
+      <w:lvlText w:val="%3."/>
+      <w:lvlJc w:val="left"/>
+      <w:pPr>
+        <w:tabs>
+          <w:tab w:val="num" w:pos="2160"/>
+        </w:tabs>
+        <w:ind w:left="2160" w:hanging="360"/>
+      </w:pPr>
+    </w:lvl>
+    <w:lvl w:ilvl="3" w:tplc="B05EB150" w:tentative="1">
+      <w:start w:val="1"/>
+      <w:numFmt w:val="decimal"/>
+      <w:lvlText w:val="%4."/>
+      <w:lvlJc w:val="left"/>
+      <w:pPr>
+        <w:tabs>
+          <w:tab w:val="num" w:pos="2880"/>
+        </w:tabs>
+        <w:ind w:left="2880" w:hanging="360"/>
+      </w:pPr>
+    </w:lvl>
+    <w:lvl w:ilvl="4" w:tplc="E2B84920" w:tentative="1">
+      <w:start w:val="1"/>
+      <w:numFmt w:val="decimal"/>
+      <w:lvlText w:val="%5."/>
+      <w:lvlJc w:val="left"/>
+      <w:pPr>
+        <w:tabs>
+          <w:tab w:val="num" w:pos="3600"/>
+        </w:tabs>
+        <w:ind w:left="3600" w:hanging="360"/>
+      </w:pPr>
+    </w:lvl>
+    <w:lvl w:ilvl="5" w:tplc="C0E6BB44" w:tentative="1">
+      <w:start w:val="1"/>
+      <w:numFmt w:val="decimal"/>
+      <w:lvlText w:val="%6."/>
+      <w:lvlJc w:val="left"/>
+      <w:pPr>
+        <w:tabs>
+          <w:tab w:val="num" w:pos="4320"/>
+        </w:tabs>
+        <w:ind w:left="4320" w:hanging="360"/>
+      </w:pPr>
+    </w:lvl>
+    <w:lvl w:ilvl="6" w:tplc="D0FE1DA8" w:tentative="1">
+      <w:start w:val="1"/>
+      <w:numFmt w:val="decimal"/>
+      <w:lvlText w:val="%7."/>
+      <w:lvlJc w:val="left"/>
+      <w:pPr>
+        <w:tabs>
+          <w:tab w:val="num" w:pos="5040"/>
+        </w:tabs>
+        <w:ind w:left="5040" w:hanging="360"/>
+      </w:pPr>
+    </w:lvl>
+    <w:lvl w:ilvl="7" w:tplc="26D6241E" w:tentative="1">
+      <w:start w:val="1"/>
+      <w:numFmt w:val="decimal"/>
+      <w:lvlText w:val="%8."/>
+      <w:lvlJc w:val="left"/>
+      <w:pPr>
+        <w:tabs>
+          <w:tab w:val="num" w:pos="5760"/>
+        </w:tabs>
+        <w:ind w:left="5760" w:hanging="360"/>
+      </w:pPr>
+    </w:lvl>
+    <w:lvl w:ilvl="8" w:tplc="D57EF0CC" w:tentative="1">
+      <w:start w:val="1"/>
+      <w:numFmt w:val="decimal"/>
+      <w:lvlText w:val="%9."/>
+      <w:lvlJc w:val="left"/>
+      <w:pPr>
+        <w:tabs>
+          <w:tab w:val="num" w:pos="6480"/>
+        </w:tabs>
+        <w:ind w:left="6480" w:hanging="360"/>
+      </w:pPr>
+    </w:lvl>
+  </w:abstractNum>
+  <w:abstractNum w:abstractNumId="1" w15:restartNumberingAfterBreak="0">
     <w:nsid w:val="198C4614"/>
     <w:multiLevelType w:val="hybridMultilevel"/>
     <w:tmpl w:val="8546432C"/>
@@ -4762,7 +5142,7 @@
       </w:rPr>
     </w:lvl>
   </w:abstractNum>
-  <w:abstractNum w:abstractNumId="1" w15:restartNumberingAfterBreak="0">
+  <w:abstractNum w:abstractNumId="2" w15:restartNumberingAfterBreak="0">
     <w:nsid w:val="3DD26EE3"/>
     <w:multiLevelType w:val="hybridMultilevel"/>
     <w:tmpl w:val="B826FDF4"/>
@@ -4875,7 +5255,7 @@
       </w:pPr>
     </w:lvl>
   </w:abstractNum>
-  <w:abstractNum w:abstractNumId="2" w15:restartNumberingAfterBreak="0">
+  <w:abstractNum w:abstractNumId="3" w15:restartNumberingAfterBreak="0">
     <w:nsid w:val="41103A1A"/>
     <w:multiLevelType w:val="hybridMultilevel"/>
     <w:tmpl w:val="5F1E9E6C"/>
@@ -4988,7 +5368,7 @@
       </w:pPr>
     </w:lvl>
   </w:abstractNum>
-  <w:abstractNum w:abstractNumId="3" w15:restartNumberingAfterBreak="0">
+  <w:abstractNum w:abstractNumId="4" w15:restartNumberingAfterBreak="0">
     <w:nsid w:val="41F4728C"/>
     <w:multiLevelType w:val="hybridMultilevel"/>
     <w:tmpl w:val="49D4D8F6"/>
@@ -5127,7 +5507,7 @@
       </w:rPr>
     </w:lvl>
   </w:abstractNum>
-  <w:abstractNum w:abstractNumId="4" w15:restartNumberingAfterBreak="0">
+  <w:abstractNum w:abstractNumId="5" w15:restartNumberingAfterBreak="0">
     <w:nsid w:val="42DB7BD1"/>
     <w:multiLevelType w:val="hybridMultilevel"/>
     <w:tmpl w:val="A35EBE28"/>
@@ -5240,7 +5620,7 @@
       </w:pPr>
     </w:lvl>
   </w:abstractNum>
-  <w:abstractNum w:abstractNumId="5" w15:restartNumberingAfterBreak="0">
+  <w:abstractNum w:abstractNumId="6" w15:restartNumberingAfterBreak="0">
     <w:nsid w:val="47653A1E"/>
     <w:multiLevelType w:val="hybridMultilevel"/>
     <w:tmpl w:val="9C141AC6"/>
@@ -5353,7 +5733,7 @@
       </w:pPr>
     </w:lvl>
   </w:abstractNum>
-  <w:abstractNum w:abstractNumId="6" w15:restartNumberingAfterBreak="0">
+  <w:abstractNum w:abstractNumId="7" w15:restartNumberingAfterBreak="0">
     <w:nsid w:val="4AC410D0"/>
     <w:multiLevelType w:val="hybridMultilevel"/>
     <w:tmpl w:val="5EEACB50"/>
@@ -5493,7 +5873,7 @@
       </w:rPr>
     </w:lvl>
   </w:abstractNum>
-  <w:abstractNum w:abstractNumId="7" w15:restartNumberingAfterBreak="0">
+  <w:abstractNum w:abstractNumId="8" w15:restartNumberingAfterBreak="0">
     <w:nsid w:val="4EF72D15"/>
     <w:multiLevelType w:val="hybridMultilevel"/>
     <w:tmpl w:val="971A4AD2"/>
@@ -5633,7 +6013,122 @@
       </w:rPr>
     </w:lvl>
   </w:abstractNum>
-  <w:abstractNum w:abstractNumId="8" w15:restartNumberingAfterBreak="0">
+  <w:abstractNum w:abstractNumId="9" w15:restartNumberingAfterBreak="0">
+    <w:nsid w:val="54D40EB7"/>
+    <w:multiLevelType w:val="hybridMultilevel"/>
+    <w:tmpl w:val="70A87F5A"/>
+    <w:lvl w:ilvl="0" w:tplc="FFFFFFFF">
+      <w:start w:val="1"/>
+      <w:numFmt w:val="decimal"/>
+      <w:lvlText w:val="%1."/>
+      <w:lvlJc w:val="left"/>
+      <w:pPr>
+        <w:tabs>
+          <w:tab w:val="num" w:pos="720"/>
+        </w:tabs>
+        <w:ind w:left="720" w:hanging="360"/>
+      </w:pPr>
+    </w:lvl>
+    <w:lvl w:ilvl="1" w:tplc="FFFFFFFF">
+      <w:numFmt w:val="bullet"/>
+      <w:lvlText w:val=""/>
+      <w:lvlJc w:val="left"/>
+      <w:pPr>
+        <w:tabs>
+          <w:tab w:val="num" w:pos="1440"/>
+        </w:tabs>
+        <w:ind w:left="1440" w:hanging="360"/>
+      </w:pPr>
+      <w:rPr>
+        <w:rFonts w:ascii="Symbol" w:hAnsi="Symbol" w:hint="default"/>
+      </w:rPr>
+    </w:lvl>
+    <w:lvl w:ilvl="2" w:tplc="FFFFFFFF" w:tentative="1">
+      <w:start w:val="1"/>
+      <w:numFmt w:val="decimal"/>
+      <w:lvlText w:val="%3."/>
+      <w:lvlJc w:val="left"/>
+      <w:pPr>
+        <w:tabs>
+          <w:tab w:val="num" w:pos="2160"/>
+        </w:tabs>
+        <w:ind w:left="2160" w:hanging="360"/>
+      </w:pPr>
+    </w:lvl>
+    <w:lvl w:ilvl="3" w:tplc="FFFFFFFF" w:tentative="1">
+      <w:start w:val="1"/>
+      <w:numFmt w:val="decimal"/>
+      <w:lvlText w:val="%4."/>
+      <w:lvlJc w:val="left"/>
+      <w:pPr>
+        <w:tabs>
+          <w:tab w:val="num" w:pos="2880"/>
+        </w:tabs>
+        <w:ind w:left="2880" w:hanging="360"/>
+      </w:pPr>
+    </w:lvl>
+    <w:lvl w:ilvl="4" w:tplc="FFFFFFFF" w:tentative="1">
+      <w:start w:val="1"/>
+      <w:numFmt w:val="decimal"/>
+      <w:lvlText w:val="%5."/>
+      <w:lvlJc w:val="left"/>
+      <w:pPr>
+        <w:tabs>
+          <w:tab w:val="num" w:pos="3600"/>
+        </w:tabs>
+        <w:ind w:left="3600" w:hanging="360"/>
+      </w:pPr>
+    </w:lvl>
+    <w:lvl w:ilvl="5" w:tplc="FFFFFFFF" w:tentative="1">
+      <w:start w:val="1"/>
+      <w:numFmt w:val="decimal"/>
+      <w:lvlText w:val="%6."/>
+      <w:lvlJc w:val="left"/>
+      <w:pPr>
+        <w:tabs>
+          <w:tab w:val="num" w:pos="4320"/>
+        </w:tabs>
+        <w:ind w:left="4320" w:hanging="360"/>
+      </w:pPr>
+    </w:lvl>
+    <w:lvl w:ilvl="6" w:tplc="FFFFFFFF" w:tentative="1">
+      <w:start w:val="1"/>
+      <w:numFmt w:val="decimal"/>
+      <w:lvlText w:val="%7."/>
+      <w:lvlJc w:val="left"/>
+      <w:pPr>
+        <w:tabs>
+          <w:tab w:val="num" w:pos="5040"/>
+        </w:tabs>
+        <w:ind w:left="5040" w:hanging="360"/>
+      </w:pPr>
+    </w:lvl>
+    <w:lvl w:ilvl="7" w:tplc="FFFFFFFF" w:tentative="1">
+      <w:start w:val="1"/>
+      <w:numFmt w:val="decimal"/>
+      <w:lvlText w:val="%8."/>
+      <w:lvlJc w:val="left"/>
+      <w:pPr>
+        <w:tabs>
+          <w:tab w:val="num" w:pos="5760"/>
+        </w:tabs>
+        <w:ind w:left="5760" w:hanging="360"/>
+      </w:pPr>
+    </w:lvl>
+    <w:lvl w:ilvl="8" w:tplc="FFFFFFFF" w:tentative="1">
+      <w:start w:val="1"/>
+      <w:numFmt w:val="decimal"/>
+      <w:lvlText w:val="%9."/>
+      <w:lvlJc w:val="left"/>
+      <w:pPr>
+        <w:tabs>
+          <w:tab w:val="num" w:pos="6480"/>
+        </w:tabs>
+        <w:ind w:left="6480" w:hanging="360"/>
+      </w:pPr>
+    </w:lvl>
+  </w:abstractNum>
+  <w:abstractNum w:abstractNumId="10" w15:restartNumberingAfterBreak="0">
     <w:nsid w:val="59613830"/>
     <w:multiLevelType w:val="hybridMultilevel"/>
     <w:tmpl w:val="AE9041B2"/>
@@ -5773,7 +6268,7 @@
       </w:rPr>
     </w:lvl>
   </w:abstractNum>
-  <w:abstractNum w:abstractNumId="9" w15:restartNumberingAfterBreak="0">
+  <w:abstractNum w:abstractNumId="11" w15:restartNumberingAfterBreak="0">
     <w:nsid w:val="60432F9A"/>
     <w:multiLevelType w:val="hybridMultilevel"/>
     <w:tmpl w:val="E3246B4E"/>
@@ -5886,7 +6381,7 @@
       </w:pPr>
     </w:lvl>
   </w:abstractNum>
-  <w:abstractNum w:abstractNumId="10" w15:restartNumberingAfterBreak="0">
+  <w:abstractNum w:abstractNumId="12" w15:restartNumberingAfterBreak="0">
     <w:nsid w:val="609802A5"/>
     <w:multiLevelType w:val="hybridMultilevel"/>
     <w:tmpl w:val="666CBCA2"/>
@@ -5999,7 +6494,122 @@
       </w:pPr>
     </w:lvl>
   </w:abstractNum>
-  <w:abstractNum w:abstractNumId="11" w15:restartNumberingAfterBreak="0">
+  <w:abstractNum w:abstractNumId="13" w15:restartNumberingAfterBreak="0">
+    <w:nsid w:val="68D7418A"/>
+    <w:multiLevelType w:val="hybridMultilevel"/>
+    <w:tmpl w:val="70A87F5A"/>
+    <w:lvl w:ilvl="0" w:tplc="FFFFFFFF">
+      <w:start w:val="1"/>
+      <w:numFmt w:val="decimal"/>
+      <w:lvlText w:val="%1."/>
+      <w:lvlJc w:val="left"/>
+      <w:pPr>
+        <w:tabs>
+          <w:tab w:val="num" w:pos="720"/>
+        </w:tabs>
+        <w:ind w:left="720" w:hanging="360"/>
+      </w:pPr>
+    </w:lvl>
+    <w:lvl w:ilvl="1" w:tplc="FFFFFFFF">
+      <w:numFmt w:val="bullet"/>
+      <w:lvlText w:val=""/>
+      <w:lvlJc w:val="left"/>
+      <w:pPr>
+        <w:tabs>
+          <w:tab w:val="num" w:pos="1440"/>
+        </w:tabs>
+        <w:ind w:left="1440" w:hanging="360"/>
+      </w:pPr>
+      <w:rPr>
+        <w:rFonts w:ascii="Symbol" w:hAnsi="Symbol" w:hint="default"/>
+      </w:rPr>
+    </w:lvl>
+    <w:lvl w:ilvl="2" w:tplc="FFFFFFFF" w:tentative="1">
+      <w:start w:val="1"/>
+      <w:numFmt w:val="decimal"/>
+      <w:lvlText w:val="%3."/>
+      <w:lvlJc w:val="left"/>
+      <w:pPr>
+        <w:tabs>
+          <w:tab w:val="num" w:pos="2160"/>
+        </w:tabs>
+        <w:ind w:left="2160" w:hanging="360"/>
+      </w:pPr>
+    </w:lvl>
+    <w:lvl w:ilvl="3" w:tplc="FFFFFFFF" w:tentative="1">
+      <w:start w:val="1"/>
+      <w:numFmt w:val="decimal"/>
+      <w:lvlText w:val="%4."/>
+      <w:lvlJc w:val="left"/>
+      <w:pPr>
+        <w:tabs>
+          <w:tab w:val="num" w:pos="2880"/>
+        </w:tabs>
+        <w:ind w:left="2880" w:hanging="360"/>
+      </w:pPr>
+    </w:lvl>
+    <w:lvl w:ilvl="4" w:tplc="FFFFFFFF" w:tentative="1">
+      <w:start w:val="1"/>
+      <w:numFmt w:val="decimal"/>
+      <w:lvlText w:val="%5."/>
+      <w:lvlJc w:val="left"/>
+      <w:pPr>
+        <w:tabs>
+          <w:tab w:val="num" w:pos="3600"/>
+        </w:tabs>
+        <w:ind w:left="3600" w:hanging="360"/>
+      </w:pPr>
+    </w:lvl>
+    <w:lvl w:ilvl="5" w:tplc="FFFFFFFF" w:tentative="1">
+      <w:start w:val="1"/>
+      <w:numFmt w:val="decimal"/>
+      <w:lvlText w:val="%6."/>
+      <w:lvlJc w:val="left"/>
+      <w:pPr>
+        <w:tabs>
+          <w:tab w:val="num" w:pos="4320"/>
+        </w:tabs>
+        <w:ind w:left="4320" w:hanging="360"/>
+      </w:pPr>
+    </w:lvl>
+    <w:lvl w:ilvl="6" w:tplc="FFFFFFFF" w:tentative="1">
+      <w:start w:val="1"/>
+      <w:numFmt w:val="decimal"/>
+      <w:lvlText w:val="%7."/>
+      <w:lvlJc w:val="left"/>
+      <w:pPr>
+        <w:tabs>
+          <w:tab w:val="num" w:pos="5040"/>
+        </w:tabs>
+        <w:ind w:left="5040" w:hanging="360"/>
+      </w:pPr>
+    </w:lvl>
+    <w:lvl w:ilvl="7" w:tplc="FFFFFFFF" w:tentative="1">
+      <w:start w:val="1"/>
+      <w:numFmt w:val="decimal"/>
+      <w:lvlText w:val="%8."/>
+      <w:lvlJc w:val="left"/>
+      <w:pPr>
+        <w:tabs>
+          <w:tab w:val="num" w:pos="5760"/>
+        </w:tabs>
+        <w:ind w:left="5760" w:hanging="360"/>
+      </w:pPr>
+    </w:lvl>
+    <w:lvl w:ilvl="8" w:tplc="FFFFFFFF" w:tentative="1">
+      <w:start w:val="1"/>
+      <w:numFmt w:val="decimal"/>
+      <w:lvlText w:val="%9."/>
+      <w:lvlJc w:val="left"/>
+      <w:pPr>
+        <w:tabs>
+          <w:tab w:val="num" w:pos="6480"/>
+        </w:tabs>
+        <w:ind w:left="6480" w:hanging="360"/>
+      </w:pPr>
+    </w:lvl>
+  </w:abstractNum>
+  <w:abstractNum w:abstractNumId="14" w15:restartNumberingAfterBreak="0">
     <w:nsid w:val="69675CDE"/>
     <w:multiLevelType w:val="hybridMultilevel"/>
     <w:tmpl w:val="14100968"/>
@@ -6112,7 +6722,7 @@
       </w:pPr>
     </w:lvl>
   </w:abstractNum>
-  <w:abstractNum w:abstractNumId="12" w15:restartNumberingAfterBreak="0">
+  <w:abstractNum w:abstractNumId="15" w15:restartNumberingAfterBreak="0">
     <w:nsid w:val="6F5D0D82"/>
     <w:multiLevelType w:val="hybridMultilevel"/>
     <w:tmpl w:val="D2103EB8"/>
@@ -6225,7 +6835,7 @@
       </w:pPr>
     </w:lvl>
   </w:abstractNum>
-  <w:abstractNum w:abstractNumId="13" w15:restartNumberingAfterBreak="0">
+  <w:abstractNum w:abstractNumId="16" w15:restartNumberingAfterBreak="0">
     <w:nsid w:val="7D8952F3"/>
     <w:multiLevelType w:val="hybridMultilevel"/>
     <w:tmpl w:val="19F65D72"/>
@@ -6366,46 +6976,55 @@
     </w:lvl>
   </w:abstractNum>
   <w:num w:numId="1" w16cid:durableId="2124959186">
+    <w:abstractNumId w:val="1"/>
+  </w:num>
+  <w:num w:numId="2" w16cid:durableId="913244289">
+    <w:abstractNumId w:val="7"/>
+  </w:num>
+  <w:num w:numId="3" w16cid:durableId="536428395">
+    <w:abstractNumId w:val="8"/>
+  </w:num>
+  <w:num w:numId="4" w16cid:durableId="4673085">
+    <w:abstractNumId w:val="10"/>
+  </w:num>
+  <w:num w:numId="5" w16cid:durableId="1344355436">
+    <w:abstractNumId w:val="3"/>
+  </w:num>
+  <w:num w:numId="6" w16cid:durableId="788474696">
+    <w:abstractNumId w:val="15"/>
+  </w:num>
+  <w:num w:numId="7" w16cid:durableId="297682739">
+    <w:abstractNumId w:val="14"/>
+  </w:num>
+  <w:num w:numId="8" w16cid:durableId="590629469">
+    <w:abstractNumId w:val="4"/>
+  </w:num>
+  <w:num w:numId="9" w16cid:durableId="815882092">
+    <w:abstractNumId w:val="12"/>
+  </w:num>
+  <w:num w:numId="10" w16cid:durableId="1556697462">
+    <w:abstractNumId w:val="16"/>
+  </w:num>
+  <w:num w:numId="11" w16cid:durableId="171913914">
+    <w:abstractNumId w:val="5"/>
+  </w:num>
+  <w:num w:numId="12" w16cid:durableId="249236112">
+    <w:abstractNumId w:val="11"/>
+  </w:num>
+  <w:num w:numId="13" w16cid:durableId="803619541">
+    <w:abstractNumId w:val="6"/>
+  </w:num>
+  <w:num w:numId="14" w16cid:durableId="732390933">
+    <w:abstractNumId w:val="2"/>
+  </w:num>
+  <w:num w:numId="15" w16cid:durableId="1092120984">
     <w:abstractNumId w:val="0"/>
   </w:num>
-  <w:num w:numId="2" w16cid:durableId="913244289">
-    <w:abstractNumId w:val="6"/>
-  </w:num>
-  <w:num w:numId="3" w16cid:durableId="536428395">
-    <w:abstractNumId w:val="7"/>
-  </w:num>
-  <w:num w:numId="4" w16cid:durableId="4673085">
-    <w:abstractNumId w:val="8"/>
-  </w:num>
-  <w:num w:numId="5" w16cid:durableId="1344355436">
-    <w:abstractNumId w:val="2"/>
-  </w:num>
-  <w:num w:numId="6" w16cid:durableId="788474696">
-    <w:abstractNumId w:val="12"/>
-  </w:num>
-  <w:num w:numId="7" w16cid:durableId="297682739">
-    <w:abstractNumId w:val="11"/>
-  </w:num>
-  <w:num w:numId="8" w16cid:durableId="590629469">
-    <w:abstractNumId w:val="3"/>
-  </w:num>
-  <w:num w:numId="9" w16cid:durableId="815882092">
-    <w:abstractNumId w:val="10"/>
-  </w:num>
-  <w:num w:numId="10" w16cid:durableId="1556697462">
-    <w:abstractNumId w:val="13"/>
-  </w:num>
-  <w:num w:numId="11" w16cid:durableId="171913914">
-    <w:abstractNumId w:val="4"/>
-  </w:num>
-  <w:num w:numId="12" w16cid:durableId="249236112">
+  <w:num w:numId="16" w16cid:durableId="972757493">
     <w:abstractNumId w:val="9"/>
   </w:num>
-  <w:num w:numId="13" w16cid:durableId="803619541">
-    <w:abstractNumId w:val="5"/>
-  </w:num>
-  <w:num w:numId="14" w16cid:durableId="732390933">
-    <w:abstractNumId w:val="1"/>
+  <w:num w:numId="17" w16cid:durableId="104428060">
+    <w:abstractNumId w:val="13"/>
   </w:num>
 </w:numbering>
 </file>
@@ -6925,6 +7544,86 @@
       <w:shd w:val="clear" w:color="auto" w:fill="E1DFDD"/>
     </w:rPr>
   </w:style>
+  <w:style w:type="paragraph" w:styleId="HTMLPreformatted">
+    <w:name w:val="HTML Preformatted"/>
+    <w:basedOn w:val="Normal"/>
+    <w:link w:val="HTMLPreformattedChar"/>
+    <w:uiPriority w:val="99"/>
+    <w:semiHidden/>
+    <w:unhideWhenUsed/>
+    <w:rsid w:val="00972A01"/>
+    <w:pPr>
+      <w:tabs>
+        <w:tab w:val="left" w:pos="916"/>
+        <w:tab w:val="left" w:pos="1832"/>
+        <w:tab w:val="left" w:pos="2748"/>
+        <w:tab w:val="left" w:pos="3664"/>
+        <w:tab w:val="left" w:pos="4580"/>
+        <w:tab w:val="left" w:pos="5496"/>
+        <w:tab w:val="left" w:pos="6412"/>
+        <w:tab w:val="left" w:pos="7328"/>
+        <w:tab w:val="left" w:pos="8244"/>
+        <w:tab w:val="left" w:pos="9160"/>
+        <w:tab w:val="left" w:pos="10076"/>
+        <w:tab w:val="left" w:pos="10992"/>
+        <w:tab w:val="left" w:pos="11908"/>
+        <w:tab w:val="left" w:pos="12824"/>
+        <w:tab w:val="left" w:pos="13740"/>
+        <w:tab w:val="left" w:pos="14656"/>
+      </w:tabs>
+      <w:suppressAutoHyphens w:val="0"/>
+    </w:pPr>
+    <w:rPr>
+      <w:rFonts w:ascii="Courier New" w:eastAsia="Times New Roman" w:hAnsi="Courier New" w:cs="Courier New"/>
+      <w:kern w:val="0"/>
+      <w:sz w:val="20"/>
+      <w:szCs w:val="20"/>
+      <w:lang w:val="da-DK" w:eastAsia="da-DK" w:bidi="ar-SA"/>
+    </w:rPr>
+  </w:style>
+  <w:style w:type="character" w:customStyle="1" w:styleId="HTMLPreformattedChar">
+    <w:name w:val="HTML Preformatted Char"/>
+    <w:basedOn w:val="DefaultParagraphFont"/>
+    <w:link w:val="HTMLPreformatted"/>
+    <w:uiPriority w:val="99"/>
+    <w:semiHidden/>
+    <w:rsid w:val="00972A01"/>
+    <w:rPr>
+      <w:rFonts w:ascii="Courier New" w:eastAsia="Times New Roman" w:hAnsi="Courier New" w:cs="Courier New"/>
+      <w:kern w:val="0"/>
+      <w:sz w:val="20"/>
+      <w:szCs w:val="20"/>
+      <w:lang w:val="da-DK" w:eastAsia="da-DK" w:bidi="ar-SA"/>
+    </w:rPr>
+  </w:style>
+  <w:style w:type="character" w:styleId="HTMLCode">
+    <w:name w:val="HTML Code"/>
+    <w:basedOn w:val="DefaultParagraphFont"/>
+    <w:uiPriority w:val="99"/>
+    <w:semiHidden/>
+    <w:unhideWhenUsed/>
+    <w:rsid w:val="00972A01"/>
+    <w:rPr>
+      <w:rFonts w:ascii="Courier New" w:eastAsia="Times New Roman" w:hAnsi="Courier New" w:cs="Courier New"/>
+      <w:sz w:val="20"/>
+      <w:szCs w:val="20"/>
+    </w:rPr>
+  </w:style>
+  <w:style w:type="paragraph" w:styleId="ListParagraph">
+    <w:name w:val="List Paragraph"/>
+    <w:basedOn w:val="Normal"/>
+    <w:uiPriority w:val="34"/>
+    <w:qFormat/>
+    <w:rsid w:val="00972A01"/>
+    <w:pPr>
+      <w:ind w:left="720"/>
+      <w:contextualSpacing/>
+    </w:pPr>
+    <w:rPr>
+      <w:rFonts w:cs="Mangal"/>
+      <w:szCs w:val="21"/>
+    </w:rPr>
+  </w:style>
 </w:styles>
 </file>
 

</xml_diff>

<commit_message>
updated order of exercises a bit
</commit_message>
<xml_diff>
--- a/advanced_datatypes_questions.docx
+++ b/advanced_datatypes_questions.docx
@@ -33,21 +33,7 @@
         <w:rPr>
           <w:lang w:val="da-DK"/>
         </w:rPr>
-        <w:t xml:space="preserve">Hvad er en </w:t>
-      </w:r>
-      <w:proofErr w:type="spellStart"/>
-      <w:r>
-        <w:rPr>
-          <w:lang w:val="da-DK"/>
-        </w:rPr>
-        <w:t>advanceret</w:t>
-      </w:r>
-      <w:proofErr w:type="spellEnd"/>
-      <w:r>
-        <w:rPr>
-          <w:lang w:val="da-DK"/>
-        </w:rPr>
-        <w:t xml:space="preserve"> datatype?</w:t>
+        <w:t>Hvad er en advanceret datatype?</w:t>
       </w:r>
     </w:p>
     <w:p>
@@ -65,21 +51,7 @@
         <w:rPr>
           <w:lang w:val="da-DK"/>
         </w:rPr>
-        <w:t xml:space="preserve">Har du set nogle </w:t>
-      </w:r>
-      <w:proofErr w:type="spellStart"/>
-      <w:r>
-        <w:rPr>
-          <w:lang w:val="da-DK"/>
-        </w:rPr>
-        <w:t>advancerede</w:t>
-      </w:r>
-      <w:proofErr w:type="spellEnd"/>
-      <w:r>
-        <w:rPr>
-          <w:lang w:val="da-DK"/>
-        </w:rPr>
-        <w:t xml:space="preserve"> datatyper allerede?</w:t>
+        <w:t>Har du set nogle advancerede datatyper allerede?</w:t>
       </w:r>
     </w:p>
     <w:p>
@@ -115,21 +87,7 @@
         <w:rPr>
           <w:lang w:val="da-DK"/>
         </w:rPr>
-        <w:t xml:space="preserve">Lav et program patient1.c, som benytter en </w:t>
-      </w:r>
-      <w:proofErr w:type="spellStart"/>
-      <w:r>
-        <w:rPr>
-          <w:lang w:val="da-DK"/>
-        </w:rPr>
-        <w:t>struct</w:t>
-      </w:r>
-      <w:proofErr w:type="spellEnd"/>
-      <w:r>
-        <w:rPr>
-          <w:lang w:val="da-DK"/>
-        </w:rPr>
-        <w:t xml:space="preserve"> til patient specifikke informationer, og som printer informationerne ud.</w:t>
+        <w:t>Lav et program patient1.c, som benytter en struct til patient specifikke informationer, og som printer informationerne ud.</w:t>
       </w:r>
     </w:p>
     <w:p>
@@ -163,35 +121,7 @@
         <w:rPr>
           <w:lang w:val="da-DK"/>
         </w:rPr>
-        <w:t xml:space="preserve">Definer et </w:t>
-      </w:r>
-      <w:proofErr w:type="spellStart"/>
-      <w:r>
-        <w:rPr>
-          <w:lang w:val="da-DK"/>
-        </w:rPr>
-        <w:t>struct</w:t>
-      </w:r>
-      <w:proofErr w:type="spellEnd"/>
-      <w:r>
-        <w:rPr>
-          <w:lang w:val="da-DK"/>
-        </w:rPr>
-        <w:t xml:space="preserve"> Template som hedder Patient med følgende </w:t>
-      </w:r>
-      <w:proofErr w:type="spellStart"/>
-      <w:r>
-        <w:rPr>
-          <w:lang w:val="da-DK"/>
-        </w:rPr>
-        <w:t>member</w:t>
-      </w:r>
-      <w:proofErr w:type="spellEnd"/>
-      <w:r>
-        <w:rPr>
-          <w:lang w:val="da-DK"/>
-        </w:rPr>
-        <w:t xml:space="preserve">-variabler: </w:t>
+        <w:t xml:space="preserve">Definer et struct Template som hedder Patient med følgende member-variabler: </w:t>
       </w:r>
     </w:p>
     <w:p>
@@ -203,21 +133,8 @@
         </w:numPr>
       </w:pPr>
       <w:r>
-        <w:t xml:space="preserve">int id, int age, float </w:t>
-      </w:r>
-      <w:proofErr w:type="spellStart"/>
-      <w:r>
-        <w:t>heightM</w:t>
-      </w:r>
-      <w:proofErr w:type="spellEnd"/>
-      <w:r>
-        <w:t xml:space="preserve">, float </w:t>
-      </w:r>
-      <w:proofErr w:type="spellStart"/>
-      <w:r>
-        <w:t>weightKg</w:t>
-      </w:r>
-      <w:proofErr w:type="spellEnd"/>
+        <w:t>int id, int age, float heightM, float weightKg</w:t>
+      </w:r>
     </w:p>
     <w:p>
       <w:pPr>
@@ -252,35 +169,7 @@
         <w:rPr>
           <w:lang w:val="da-DK"/>
         </w:rPr>
-        <w:t xml:space="preserve">Hint: et </w:t>
-      </w:r>
-      <w:proofErr w:type="spellStart"/>
-      <w:r>
-        <w:rPr>
-          <w:lang w:val="da-DK"/>
-        </w:rPr>
-        <w:t>struct</w:t>
-      </w:r>
-      <w:proofErr w:type="spellEnd"/>
-      <w:r>
-        <w:rPr>
-          <w:lang w:val="da-DK"/>
-        </w:rPr>
-        <w:t xml:space="preserve"> </w:t>
-      </w:r>
-      <w:proofErr w:type="spellStart"/>
-      <w:r>
-        <w:rPr>
-          <w:lang w:val="da-DK"/>
-        </w:rPr>
-        <w:t>membervariabel</w:t>
-      </w:r>
-      <w:proofErr w:type="spellEnd"/>
-      <w:r>
-        <w:rPr>
-          <w:lang w:val="da-DK"/>
-        </w:rPr>
-        <w:t xml:space="preserve"> er ofte ental</w:t>
+        <w:t>Hint: et struct membervariabel er ofte ental</w:t>
       </w:r>
     </w:p>
     <w:p>
@@ -300,37 +189,12 @@
         </w:rPr>
         <w:t xml:space="preserve">lav et </w:t>
       </w:r>
-      <w:proofErr w:type="spellStart"/>
       <w:r>
         <w:rPr>
           <w:highlight w:val="yellow"/>
           <w:lang w:val="da-DK"/>
         </w:rPr>
-        <w:t>struct</w:t>
-      </w:r>
-      <w:proofErr w:type="spellEnd"/>
-      <w:r>
-        <w:rPr>
-          <w:highlight w:val="yellow"/>
-          <w:lang w:val="da-DK"/>
-        </w:rPr>
-        <w:t xml:space="preserve"> Patient </w:t>
-      </w:r>
-      <w:proofErr w:type="spellStart"/>
-      <w:r>
-        <w:rPr>
-          <w:highlight w:val="yellow"/>
-          <w:lang w:val="da-DK"/>
-        </w:rPr>
-        <w:t>tommy</w:t>
-      </w:r>
-      <w:proofErr w:type="spellEnd"/>
-      <w:r>
-        <w:rPr>
-          <w:highlight w:val="yellow"/>
-          <w:lang w:val="da-DK"/>
-        </w:rPr>
-        <w:t>;</w:t>
+        <w:t>struct Patient tommy;</w:t>
       </w:r>
       <w:r>
         <w:rPr>
@@ -354,35 +218,7 @@
         <w:rPr>
           <w:lang w:val="da-DK"/>
         </w:rPr>
-        <w:t>.id=1, .age=21, .</w:t>
-      </w:r>
-      <w:proofErr w:type="spellStart"/>
-      <w:r>
-        <w:rPr>
-          <w:lang w:val="da-DK"/>
-        </w:rPr>
-        <w:t>heightM</w:t>
-      </w:r>
-      <w:proofErr w:type="spellEnd"/>
-      <w:r>
-        <w:rPr>
-          <w:lang w:val="da-DK"/>
-        </w:rPr>
-        <w:t>=1.8, .</w:t>
-      </w:r>
-      <w:proofErr w:type="spellStart"/>
-      <w:r>
-        <w:rPr>
-          <w:lang w:val="da-DK"/>
-        </w:rPr>
-        <w:t>weightKg</w:t>
-      </w:r>
-      <w:proofErr w:type="spellEnd"/>
-      <w:r>
-        <w:rPr>
-          <w:lang w:val="da-DK"/>
-        </w:rPr>
-        <w:t>=55.0</w:t>
+        <w:t>.id=1, .age=21, .heightM=1.8, .weightKg=55.0</w:t>
       </w:r>
     </w:p>
     <w:p>
@@ -400,30 +236,8 @@
         <w:rPr>
           <w:lang w:val="da-DK"/>
         </w:rPr>
-        <w:t xml:space="preserve">Print hvert </w:t>
-      </w:r>
-      <w:proofErr w:type="spellStart"/>
-      <w:r>
-        <w:rPr>
-          <w:lang w:val="da-DK"/>
-        </w:rPr>
-        <w:t>membervariabel</w:t>
-      </w:r>
-      <w:proofErr w:type="spellEnd"/>
-      <w:r>
-        <w:rPr>
-          <w:lang w:val="da-DK"/>
-        </w:rPr>
-        <w:t xml:space="preserve"> ud individuelt for </w:t>
-      </w:r>
-      <w:proofErr w:type="spellStart"/>
-      <w:r>
-        <w:rPr>
-          <w:lang w:val="da-DK"/>
-        </w:rPr>
-        <w:t>tommy</w:t>
-      </w:r>
-      <w:proofErr w:type="spellEnd"/>
+        <w:t>Print hvert membervariabel ud individuelt for tommy</w:t>
+      </w:r>
     </w:p>
     <w:p>
       <w:pPr>
@@ -444,43 +258,21 @@
         <w:rPr>
           <w:lang w:val="da-DK"/>
         </w:rPr>
-        <w:t xml:space="preserve">Q: Opret en simpel Sensor </w:t>
-      </w:r>
-      <w:proofErr w:type="spellStart"/>
-      <w:r>
-        <w:rPr>
-          <w:lang w:val="da-DK"/>
-        </w:rPr>
-        <w:t>Structur</w:t>
-      </w:r>
-      <w:proofErr w:type="spellEnd"/>
-    </w:p>
-    <w:p>
-      <w:pPr>
-        <w:pStyle w:val="BodyText"/>
-        <w:rPr>
-          <w:lang w:val="da-DK"/>
-        </w:rPr>
-      </w:pPr>
-      <w:r>
-        <w:rPr>
-          <w:lang w:val="da-DK"/>
-        </w:rPr>
-        <w:t xml:space="preserve">I mange biomedicinske systemer skal man håndtere og strukturere patientdata. I denne opgave skal du oprette en simpel </w:t>
-      </w:r>
-      <w:proofErr w:type="spellStart"/>
-      <w:r>
-        <w:rPr>
-          <w:lang w:val="da-DK"/>
-        </w:rPr>
-        <w:t>struct</w:t>
-      </w:r>
-      <w:proofErr w:type="spellEnd"/>
-      <w:r>
-        <w:rPr>
-          <w:lang w:val="da-DK"/>
-        </w:rPr>
-        <w:t xml:space="preserve">, der kan holde information om en patient, og skrive et program, der kan indlæse og vise disse data. </w:t>
+        <w:t>Q: Opret en simpel Sensor Structur</w:t>
+      </w:r>
+    </w:p>
+    <w:p>
+      <w:pPr>
+        <w:pStyle w:val="BodyText"/>
+        <w:rPr>
+          <w:lang w:val="da-DK"/>
+        </w:rPr>
+      </w:pPr>
+      <w:r>
+        <w:rPr>
+          <w:lang w:val="da-DK"/>
+        </w:rPr>
+        <w:t xml:space="preserve">I mange biomedicinske systemer skal man håndtere og strukturere patientdata. I denne opgave skal du oprette en simpel struct, der kan holde information om en patient, og skrive et program, der kan indlæse og vise disse data. </w:t>
       </w:r>
     </w:p>
     <w:p>
@@ -498,35 +290,7 @@
         <w:rPr>
           <w:lang w:val="da-DK"/>
         </w:rPr>
-        <w:t xml:space="preserve">Definér en </w:t>
-      </w:r>
-      <w:proofErr w:type="spellStart"/>
-      <w:r>
-        <w:rPr>
-          <w:lang w:val="da-DK"/>
-        </w:rPr>
-        <w:t>struct</w:t>
-      </w:r>
-      <w:proofErr w:type="spellEnd"/>
-      <w:r>
-        <w:rPr>
-          <w:lang w:val="da-DK"/>
-        </w:rPr>
-        <w:t xml:space="preserve"> kaldet </w:t>
-      </w:r>
-      <w:proofErr w:type="spellStart"/>
-      <w:r>
-        <w:rPr>
-          <w:lang w:val="da-DK"/>
-        </w:rPr>
-        <w:t>TempSensor</w:t>
-      </w:r>
-      <w:proofErr w:type="spellEnd"/>
-      <w:r>
-        <w:rPr>
-          <w:lang w:val="da-DK"/>
-        </w:rPr>
-        <w:t>, som indeholder:</w:t>
+        <w:t>Definér en struct kaldet TempSensor, som indeholder:</w:t>
       </w:r>
     </w:p>
     <w:p>
@@ -540,19 +304,11 @@
           <w:lang w:val="da-DK"/>
         </w:rPr>
       </w:pPr>
-      <w:proofErr w:type="spellStart"/>
-      <w:r>
-        <w:rPr>
-          <w:lang w:val="da-DK"/>
-        </w:rPr>
-        <w:t>int</w:t>
-      </w:r>
-      <w:proofErr w:type="spellEnd"/>
-      <w:r>
-        <w:rPr>
-          <w:lang w:val="da-DK"/>
-        </w:rPr>
-        <w:t xml:space="preserve"> id – sensorens ID</w:t>
+      <w:r>
+        <w:rPr>
+          <w:lang w:val="da-DK"/>
+        </w:rPr>
+        <w:t>int id – sensorens ID</w:t>
       </w:r>
     </w:p>
     <w:p>
@@ -566,33 +322,11 @@
           <w:lang w:val="da-DK"/>
         </w:rPr>
       </w:pPr>
-      <w:proofErr w:type="spellStart"/>
-      <w:r>
-        <w:rPr>
-          <w:lang w:val="da-DK"/>
-        </w:rPr>
-        <w:t>float</w:t>
-      </w:r>
-      <w:proofErr w:type="spellEnd"/>
-      <w:r>
-        <w:rPr>
-          <w:lang w:val="da-DK"/>
-        </w:rPr>
-        <w:t xml:space="preserve"> </w:t>
-      </w:r>
-      <w:proofErr w:type="spellStart"/>
-      <w:r>
-        <w:rPr>
-          <w:lang w:val="da-DK"/>
-        </w:rPr>
-        <w:t>temperature</w:t>
-      </w:r>
-      <w:proofErr w:type="spellEnd"/>
-      <w:r>
-        <w:rPr>
-          <w:lang w:val="da-DK"/>
-        </w:rPr>
-        <w:t xml:space="preserve"> – målt temperatur i grader Celsius</w:t>
+      <w:r>
+        <w:rPr>
+          <w:lang w:val="da-DK"/>
+        </w:rPr>
+        <w:t>float temperature – målt temperatur i grader Celsius</w:t>
       </w:r>
     </w:p>
     <w:p>
@@ -610,21 +344,7 @@
         <w:rPr>
           <w:lang w:val="da-DK"/>
         </w:rPr>
-        <w:t xml:space="preserve">I </w:t>
-      </w:r>
-      <w:proofErr w:type="spellStart"/>
-      <w:r>
-        <w:rPr>
-          <w:lang w:val="da-DK"/>
-        </w:rPr>
-        <w:t>main</w:t>
-      </w:r>
-      <w:proofErr w:type="spellEnd"/>
-      <w:r>
-        <w:rPr>
-          <w:lang w:val="da-DK"/>
-        </w:rPr>
-        <w:t>():</w:t>
+        <w:t>I main():</w:t>
       </w:r>
     </w:p>
     <w:p>
@@ -642,16 +362,8 @@
         <w:rPr>
           <w:lang w:val="da-DK"/>
         </w:rPr>
-        <w:t xml:space="preserve">Opret én variabel 'sensor' af typen </w:t>
-      </w:r>
-      <w:proofErr w:type="spellStart"/>
-      <w:r>
-        <w:rPr>
-          <w:lang w:val="da-DK"/>
-        </w:rPr>
-        <w:t>TempSensor</w:t>
-      </w:r>
-      <w:proofErr w:type="spellEnd"/>
+        <w:t>Opret én variabel 'sensor' af typen TempSensor</w:t>
+      </w:r>
     </w:p>
     <w:p>
       <w:pPr>
@@ -699,6 +411,14 @@
     </w:p>
     <w:p>
       <w:pPr>
+        <w:pStyle w:val="BodyText"/>
+        <w:rPr>
+          <w:lang w:val="da-DK"/>
+        </w:rPr>
+      </w:pPr>
+    </w:p>
+    <w:p>
+      <w:pPr>
         <w:pStyle w:val="Heading"/>
         <w:rPr>
           <w:lang w:val="da-DK"/>
@@ -710,137 +430,25 @@
         </w:rPr>
         <w:t xml:space="preserve">Q: </w:t>
       </w:r>
-      <w:proofErr w:type="spellStart"/>
-      <w:r>
-        <w:rPr>
-          <w:lang w:val="da-DK"/>
-        </w:rPr>
-        <w:t>example_timemodule</w:t>
-      </w:r>
-      <w:proofErr w:type="spellEnd"/>
-    </w:p>
-    <w:p>
-      <w:pPr>
-        <w:pStyle w:val="BodyText"/>
-        <w:rPr>
-          <w:lang w:val="da-DK"/>
-        </w:rPr>
-      </w:pPr>
-      <w:r>
-        <w:rPr>
-          <w:lang w:val="da-DK"/>
-        </w:rPr>
-        <w:t>Lav et program som beskriver hvornår tidstælleren i C startede. Svar på følgende spørgsmål:</w:t>
-      </w:r>
-    </w:p>
-    <w:p>
-      <w:pPr>
-        <w:pStyle w:val="BodyText"/>
-        <w:numPr>
-          <w:ilvl w:val="0"/>
-          <w:numId w:val="6"/>
-        </w:numPr>
-        <w:rPr>
-          <w:lang w:val="da-DK"/>
-        </w:rPr>
-      </w:pPr>
-      <w:r>
-        <w:rPr>
-          <w:lang w:val="da-DK"/>
-        </w:rPr>
-        <w:t xml:space="preserve">Hvor mange bytes fylder </w:t>
-      </w:r>
-      <w:proofErr w:type="spellStart"/>
-      <w:r>
-        <w:rPr>
-          <w:lang w:val="da-DK"/>
-        </w:rPr>
-        <w:t>struct</w:t>
-      </w:r>
-      <w:proofErr w:type="spellEnd"/>
-      <w:r>
-        <w:rPr>
-          <w:lang w:val="da-DK"/>
-        </w:rPr>
-        <w:t xml:space="preserve"> </w:t>
-      </w:r>
-      <w:proofErr w:type="spellStart"/>
-      <w:r>
-        <w:rPr>
-          <w:lang w:val="da-DK"/>
-        </w:rPr>
-        <w:t>tm</w:t>
-      </w:r>
-      <w:proofErr w:type="spellEnd"/>
-      <w:r>
-        <w:rPr>
-          <w:lang w:val="da-DK"/>
-        </w:rPr>
-        <w:t>?</w:t>
-      </w:r>
-    </w:p>
-    <w:p>
-      <w:pPr>
-        <w:pStyle w:val="BodyText"/>
-        <w:numPr>
-          <w:ilvl w:val="0"/>
-          <w:numId w:val="6"/>
-        </w:numPr>
-        <w:rPr>
-          <w:lang w:val="da-DK"/>
-        </w:rPr>
-      </w:pPr>
-      <w:r>
-        <w:rPr>
-          <w:lang w:val="da-DK"/>
-        </w:rPr>
-        <w:t xml:space="preserve">Hvornår (dato og klokkeslæt) startede tidstælleren </w:t>
-      </w:r>
-      <w:proofErr w:type="spellStart"/>
-      <w:r>
-        <w:rPr>
-          <w:lang w:val="da-DK"/>
-        </w:rPr>
-        <w:t>time_t</w:t>
-      </w:r>
-      <w:proofErr w:type="spellEnd"/>
-      <w:r>
-        <w:rPr>
-          <w:lang w:val="da-DK"/>
-        </w:rPr>
-        <w:t xml:space="preserve">? </w:t>
-      </w:r>
-    </w:p>
-    <w:p>
-      <w:pPr>
-        <w:pStyle w:val="BodyText"/>
-        <w:numPr>
-          <w:ilvl w:val="1"/>
-          <w:numId w:val="6"/>
-        </w:numPr>
-        <w:rPr>
-          <w:lang w:val="da-DK"/>
-        </w:rPr>
-      </w:pPr>
-      <w:r>
-        <w:rPr>
-          <w:lang w:val="da-DK"/>
-        </w:rPr>
-        <w:t xml:space="preserve">Hint: Hvad gør funktionen </w:t>
-      </w:r>
-      <w:proofErr w:type="spellStart"/>
-      <w:r>
-        <w:rPr>
-          <w:lang w:val="da-DK"/>
-        </w:rPr>
-        <w:t>ctime</w:t>
-      </w:r>
-      <w:proofErr w:type="spellEnd"/>
-      <w:r>
-        <w:rPr>
-          <w:lang w:val="da-DK"/>
-        </w:rPr>
-        <w:t xml:space="preserve">? </w:t>
+      <w:r>
+        <w:rPr>
+          <w:lang w:val="da-DK"/>
+        </w:rPr>
+        <w:t>esp32_enumerate</w:t>
+      </w:r>
+    </w:p>
+    <w:p>
+      <w:pPr>
+        <w:pStyle w:val="BodyText"/>
+        <w:rPr>
+          <w:lang w:val="da-DK"/>
+        </w:rPr>
+      </w:pPr>
+      <w:r>
+        <w:rPr>
+          <w:lang w:val="da-DK"/>
+        </w:rPr>
+        <w:t>Lav et program esp32_enumerate i Arduino, hvor pins er defineret i en enum. Send værdierne af både venstre og højre knap til din computer.</w:t>
       </w:r>
     </w:p>
     <w:p>
@@ -864,645 +472,6 @@
         <w:pStyle w:val="BodyText"/>
         <w:numPr>
           <w:ilvl w:val="0"/>
-          <w:numId w:val="7"/>
-        </w:numPr>
-        <w:rPr>
-          <w:lang w:val="da-DK"/>
-        </w:rPr>
-      </w:pPr>
-      <w:r>
-        <w:rPr>
-          <w:lang w:val="da-DK"/>
-        </w:rPr>
-        <w:t xml:space="preserve">Lav et program </w:t>
-      </w:r>
-      <w:proofErr w:type="spellStart"/>
-      <w:r>
-        <w:rPr>
-          <w:lang w:val="da-DK"/>
-        </w:rPr>
-        <w:t>example_timemodule.c</w:t>
-      </w:r>
-      <w:proofErr w:type="spellEnd"/>
-    </w:p>
-    <w:p>
-      <w:pPr>
-        <w:pStyle w:val="BodyText"/>
-        <w:numPr>
-          <w:ilvl w:val="0"/>
-          <w:numId w:val="7"/>
-        </w:numPr>
-        <w:rPr>
-          <w:lang w:val="da-DK"/>
-        </w:rPr>
-      </w:pPr>
-      <w:r>
-        <w:rPr>
-          <w:lang w:val="da-DK"/>
-        </w:rPr>
-        <w:t xml:space="preserve">Find ud af, samt importer det </w:t>
-      </w:r>
-      <w:proofErr w:type="spellStart"/>
-      <w:r>
-        <w:rPr>
-          <w:lang w:val="da-DK"/>
-        </w:rPr>
-        <w:t>library</w:t>
-      </w:r>
-      <w:proofErr w:type="spellEnd"/>
-      <w:r>
-        <w:rPr>
-          <w:lang w:val="da-DK"/>
-        </w:rPr>
-        <w:t xml:space="preserve"> hvor du kan finde datatypen </w:t>
-      </w:r>
-      <w:proofErr w:type="spellStart"/>
-      <w:r>
-        <w:rPr>
-          <w:lang w:val="da-DK"/>
-        </w:rPr>
-        <w:t>tm</w:t>
-      </w:r>
-      <w:proofErr w:type="spellEnd"/>
-      <w:r>
-        <w:rPr>
-          <w:lang w:val="da-DK"/>
-        </w:rPr>
-        <w:t xml:space="preserve">, </w:t>
-      </w:r>
-      <w:proofErr w:type="spellStart"/>
-      <w:r>
-        <w:rPr>
-          <w:lang w:val="da-DK"/>
-        </w:rPr>
-        <w:t>time_t</w:t>
-      </w:r>
-      <w:proofErr w:type="spellEnd"/>
-      <w:r>
-        <w:rPr>
-          <w:lang w:val="da-DK"/>
-        </w:rPr>
-        <w:t xml:space="preserve">, samt funktionerne </w:t>
-      </w:r>
-      <w:proofErr w:type="spellStart"/>
-      <w:r>
-        <w:rPr>
-          <w:lang w:val="da-DK"/>
-        </w:rPr>
-        <w:t>asctime</w:t>
-      </w:r>
-      <w:proofErr w:type="spellEnd"/>
-      <w:r>
-        <w:rPr>
-          <w:lang w:val="da-DK"/>
-        </w:rPr>
-        <w:t xml:space="preserve"> og </w:t>
-      </w:r>
-      <w:proofErr w:type="spellStart"/>
-      <w:r>
-        <w:rPr>
-          <w:lang w:val="da-DK"/>
-        </w:rPr>
-        <w:t>ctime</w:t>
-      </w:r>
-      <w:proofErr w:type="spellEnd"/>
-    </w:p>
-    <w:p>
-      <w:pPr>
-        <w:pStyle w:val="BodyText"/>
-        <w:numPr>
-          <w:ilvl w:val="1"/>
-          <w:numId w:val="7"/>
-        </w:numPr>
-        <w:rPr>
-          <w:lang w:val="da-DK"/>
-        </w:rPr>
-      </w:pPr>
-      <w:r>
-        <w:rPr>
-          <w:lang w:val="da-DK"/>
-        </w:rPr>
-        <w:t>Hint: cs50 manual</w:t>
-      </w:r>
-    </w:p>
-    <w:p>
-      <w:pPr>
-        <w:pStyle w:val="BodyText"/>
-        <w:numPr>
-          <w:ilvl w:val="0"/>
-          <w:numId w:val="7"/>
-        </w:numPr>
-        <w:rPr>
-          <w:lang w:val="da-DK"/>
-        </w:rPr>
-      </w:pPr>
-      <w:r>
-        <w:rPr>
-          <w:lang w:val="da-DK"/>
-        </w:rPr>
-        <w:t xml:space="preserve">Definer en variabel </w:t>
-      </w:r>
-      <w:r>
-        <w:rPr>
-          <w:lang w:val="da-DK"/>
-        </w:rPr>
-        <w:tab/>
-      </w:r>
-      <w:proofErr w:type="spellStart"/>
-      <w:r>
-        <w:rPr>
-          <w:lang w:val="da-DK"/>
-        </w:rPr>
-        <w:t>time_t</w:t>
-      </w:r>
-      <w:proofErr w:type="spellEnd"/>
-      <w:r>
-        <w:rPr>
-          <w:lang w:val="da-DK"/>
-        </w:rPr>
-        <w:t xml:space="preserve"> </w:t>
-      </w:r>
-      <w:proofErr w:type="spellStart"/>
-      <w:r>
-        <w:rPr>
-          <w:lang w:val="da-DK"/>
-        </w:rPr>
-        <w:t>epoch</w:t>
-      </w:r>
-      <w:proofErr w:type="spellEnd"/>
-      <w:r>
-        <w:rPr>
-          <w:lang w:val="da-DK"/>
-        </w:rPr>
-        <w:t xml:space="preserve"> = 0</w:t>
-      </w:r>
-    </w:p>
-    <w:p>
-      <w:pPr>
-        <w:pStyle w:val="BodyText"/>
-        <w:numPr>
-          <w:ilvl w:val="0"/>
-          <w:numId w:val="7"/>
-        </w:numPr>
-        <w:rPr>
-          <w:lang w:val="da-DK"/>
-        </w:rPr>
-      </w:pPr>
-      <w:r>
-        <w:rPr>
-          <w:lang w:val="da-DK"/>
-        </w:rPr>
-        <w:t xml:space="preserve">Print antal bytes som </w:t>
-      </w:r>
-      <w:proofErr w:type="spellStart"/>
-      <w:r>
-        <w:rPr>
-          <w:lang w:val="da-DK"/>
-        </w:rPr>
-        <w:t>struct</w:t>
-      </w:r>
-      <w:proofErr w:type="spellEnd"/>
-      <w:r>
-        <w:rPr>
-          <w:lang w:val="da-DK"/>
-        </w:rPr>
-        <w:t xml:space="preserve"> </w:t>
-      </w:r>
-      <w:proofErr w:type="spellStart"/>
-      <w:r>
-        <w:rPr>
-          <w:lang w:val="da-DK"/>
-        </w:rPr>
-        <w:t>tm</w:t>
-      </w:r>
-      <w:proofErr w:type="spellEnd"/>
-      <w:r>
-        <w:rPr>
-          <w:lang w:val="da-DK"/>
-        </w:rPr>
-        <w:t xml:space="preserve"> indeholder (Hint: </w:t>
-      </w:r>
-      <w:proofErr w:type="spellStart"/>
-      <w:r>
-        <w:rPr>
-          <w:lang w:val="da-DK"/>
-        </w:rPr>
-        <w:t>sizeof</w:t>
-      </w:r>
-      <w:proofErr w:type="spellEnd"/>
-      <w:r>
-        <w:rPr>
-          <w:lang w:val="da-DK"/>
-        </w:rPr>
-        <w:t>)</w:t>
-      </w:r>
-    </w:p>
-    <w:p>
-      <w:pPr>
-        <w:pStyle w:val="BodyText"/>
-        <w:rPr>
-          <w:lang w:val="da-DK"/>
-        </w:rPr>
-      </w:pPr>
-      <w:r>
-        <w:rPr>
-          <w:lang w:val="da-DK"/>
-        </w:rPr>
-        <w:t xml:space="preserve">3. Benyt print output fra </w:t>
-      </w:r>
-      <w:proofErr w:type="spellStart"/>
-      <w:r>
-        <w:rPr>
-          <w:lang w:val="da-DK"/>
-        </w:rPr>
-        <w:t>ctime</w:t>
-      </w:r>
-      <w:proofErr w:type="spellEnd"/>
-      <w:r>
-        <w:rPr>
-          <w:lang w:val="da-DK"/>
-        </w:rPr>
-        <w:t>(&amp;</w:t>
-      </w:r>
-      <w:proofErr w:type="spellStart"/>
-      <w:r>
-        <w:rPr>
-          <w:lang w:val="da-DK"/>
-        </w:rPr>
-        <w:t>epoch</w:t>
-      </w:r>
-      <w:proofErr w:type="spellEnd"/>
-      <w:r>
-        <w:rPr>
-          <w:lang w:val="da-DK"/>
-        </w:rPr>
-        <w:t>) til terminalen</w:t>
-      </w:r>
-    </w:p>
-    <w:p>
-      <w:pPr>
-        <w:pStyle w:val="BodyText"/>
-        <w:rPr>
-          <w:lang w:val="da-DK"/>
-        </w:rPr>
-      </w:pPr>
-    </w:p>
-    <w:p>
-      <w:pPr>
-        <w:pStyle w:val="Heading"/>
-        <w:rPr>
-          <w:lang w:val="da-DK"/>
-        </w:rPr>
-      </w:pPr>
-      <w:r>
-        <w:rPr>
-          <w:lang w:val="da-DK"/>
-        </w:rPr>
-        <w:t>Q: union1</w:t>
-      </w:r>
-    </w:p>
-    <w:p>
-      <w:pPr>
-        <w:pStyle w:val="BodyText"/>
-        <w:rPr>
-          <w:lang w:val="da-DK"/>
-        </w:rPr>
-      </w:pPr>
-      <w:r>
-        <w:rPr>
-          <w:lang w:val="da-DK"/>
-        </w:rPr>
-        <w:t>Med udgangspunkt i union1.c, Svar på følgende spørgsmål:</w:t>
-      </w:r>
-    </w:p>
-    <w:p>
-      <w:pPr>
-        <w:pStyle w:val="BodyText"/>
-        <w:numPr>
-          <w:ilvl w:val="0"/>
-          <w:numId w:val="9"/>
-        </w:numPr>
-        <w:rPr>
-          <w:lang w:val="da-DK"/>
-        </w:rPr>
-      </w:pPr>
-      <w:r>
-        <w:rPr>
-          <w:lang w:val="da-DK"/>
-        </w:rPr>
-        <w:t xml:space="preserve">Hvorfor har </w:t>
-      </w:r>
-      <w:proofErr w:type="spellStart"/>
-      <w:r>
-        <w:rPr>
-          <w:lang w:val="da-DK"/>
-        </w:rPr>
-        <w:t>data.i</w:t>
-      </w:r>
-      <w:proofErr w:type="spellEnd"/>
-      <w:r>
-        <w:rPr>
-          <w:lang w:val="da-DK"/>
-        </w:rPr>
-        <w:t xml:space="preserve"> = 10 og </w:t>
-      </w:r>
-      <w:proofErr w:type="spellStart"/>
-      <w:r>
-        <w:rPr>
-          <w:lang w:val="da-DK"/>
-        </w:rPr>
-        <w:t>data.f</w:t>
-      </w:r>
-      <w:proofErr w:type="spellEnd"/>
-      <w:r>
-        <w:rPr>
-          <w:lang w:val="da-DK"/>
-        </w:rPr>
-        <w:t xml:space="preserve"> = -220.5 ikke nogen effekt på det udskrevne i </w:t>
-      </w:r>
-      <w:proofErr w:type="spellStart"/>
-      <w:r>
-        <w:rPr>
-          <w:lang w:val="da-DK"/>
-        </w:rPr>
-        <w:t>printf</w:t>
-      </w:r>
-      <w:proofErr w:type="spellEnd"/>
-      <w:r>
-        <w:rPr>
-          <w:lang w:val="da-DK"/>
-        </w:rPr>
-        <w:t>?</w:t>
-      </w:r>
-    </w:p>
-    <w:p>
-      <w:pPr>
-        <w:pStyle w:val="BodyText"/>
-        <w:numPr>
-          <w:ilvl w:val="0"/>
-          <w:numId w:val="9"/>
-        </w:numPr>
-        <w:rPr>
-          <w:lang w:val="da-DK"/>
-        </w:rPr>
-      </w:pPr>
-      <w:r>
-        <w:rPr>
-          <w:lang w:val="da-DK"/>
-        </w:rPr>
-        <w:t xml:space="preserve">Forklar sammenhængen mellem </w:t>
-      </w:r>
-      <w:proofErr w:type="spellStart"/>
-      <w:r>
-        <w:rPr>
-          <w:lang w:val="da-DK"/>
-        </w:rPr>
-        <w:t>data.i</w:t>
-      </w:r>
-      <w:proofErr w:type="spellEnd"/>
-      <w:r>
-        <w:rPr>
-          <w:lang w:val="da-DK"/>
-        </w:rPr>
-        <w:t xml:space="preserve"> og </w:t>
-      </w:r>
-      <w:proofErr w:type="spellStart"/>
-      <w:r>
-        <w:rPr>
-          <w:lang w:val="da-DK"/>
-        </w:rPr>
-        <w:t>data.str</w:t>
-      </w:r>
-      <w:proofErr w:type="spellEnd"/>
-      <w:r>
-        <w:rPr>
-          <w:lang w:val="da-DK"/>
-        </w:rPr>
-        <w:t xml:space="preserve"> ?</w:t>
-      </w:r>
-      <w:r>
-        <w:rPr>
-          <w:lang w:val="da-DK"/>
-        </w:rPr>
-        <w:br/>
-        <w:t xml:space="preserve">(print eventuelt </w:t>
-      </w:r>
-      <w:proofErr w:type="spellStart"/>
-      <w:r>
-        <w:rPr>
-          <w:lang w:val="da-DK"/>
-        </w:rPr>
-        <w:t>data.i</w:t>
-      </w:r>
-      <w:proofErr w:type="spellEnd"/>
-      <w:r>
-        <w:rPr>
-          <w:lang w:val="da-DK"/>
-        </w:rPr>
-        <w:t xml:space="preserve"> som en </w:t>
-      </w:r>
-      <w:proofErr w:type="spellStart"/>
-      <w:r>
-        <w:rPr>
-          <w:lang w:val="da-DK"/>
-        </w:rPr>
-        <w:t>hex-value</w:t>
-      </w:r>
-      <w:proofErr w:type="spellEnd"/>
-      <w:r>
-        <w:rPr>
-          <w:lang w:val="da-DK"/>
-        </w:rPr>
-        <w:t>)</w:t>
-      </w:r>
-    </w:p>
-    <w:p>
-      <w:pPr>
-        <w:pStyle w:val="BodyText"/>
-        <w:numPr>
-          <w:ilvl w:val="0"/>
-          <w:numId w:val="9"/>
-        </w:numPr>
-        <w:rPr>
-          <w:lang w:val="da-DK"/>
-        </w:rPr>
-      </w:pPr>
-      <w:r>
-        <w:rPr>
-          <w:lang w:val="da-DK"/>
-        </w:rPr>
-        <w:t>Hvor meget plads fylder denne union (hvad bestemmer det og hvorfor lige dette tal)?</w:t>
-      </w:r>
-    </w:p>
-    <w:p>
-      <w:pPr>
-        <w:pStyle w:val="BodyText"/>
-        <w:numPr>
-          <w:ilvl w:val="0"/>
-          <w:numId w:val="9"/>
-        </w:numPr>
-        <w:rPr>
-          <w:lang w:val="da-DK"/>
-        </w:rPr>
-      </w:pPr>
-      <w:r>
-        <w:rPr>
-          <w:lang w:val="da-DK"/>
-        </w:rPr>
-        <w:t xml:space="preserve">Hvorfor giver </w:t>
-      </w:r>
-      <w:proofErr w:type="spellStart"/>
-      <w:r>
-        <w:rPr>
-          <w:lang w:val="da-DK"/>
-        </w:rPr>
-        <w:t>data.f</w:t>
-      </w:r>
-      <w:proofErr w:type="spellEnd"/>
-      <w:r>
-        <w:rPr>
-          <w:lang w:val="da-DK"/>
-        </w:rPr>
-        <w:t xml:space="preserve"> ikke noget output?</w:t>
-      </w:r>
-    </w:p>
-    <w:p>
-      <w:pPr>
-        <w:pStyle w:val="BodyText"/>
-        <w:numPr>
-          <w:ilvl w:val="1"/>
-          <w:numId w:val="9"/>
-        </w:numPr>
-        <w:rPr>
-          <w:lang w:val="da-DK"/>
-        </w:rPr>
-      </w:pPr>
-      <w:r>
-        <w:rPr>
-          <w:lang w:val="da-DK"/>
-        </w:rPr>
-        <w:t xml:space="preserve">Hint: når man skriver "abc", hvad står der så på </w:t>
-      </w:r>
-      <w:proofErr w:type="spellStart"/>
-      <w:r>
-        <w:rPr>
-          <w:lang w:val="da-DK"/>
-        </w:rPr>
-        <w:t>idx</w:t>
-      </w:r>
-      <w:proofErr w:type="spellEnd"/>
-      <w:r>
-        <w:rPr>
-          <w:lang w:val="da-DK"/>
-        </w:rPr>
-        <w:t xml:space="preserve"> 3 (</w:t>
-      </w:r>
-      <w:proofErr w:type="spellStart"/>
-      <w:r>
-        <w:rPr>
-          <w:lang w:val="da-DK"/>
-        </w:rPr>
-        <w:t>exponenten</w:t>
-      </w:r>
-      <w:proofErr w:type="spellEnd"/>
-      <w:r>
-        <w:rPr>
-          <w:lang w:val="da-DK"/>
-        </w:rPr>
-        <w:t>)?</w:t>
-      </w:r>
-    </w:p>
-    <w:p>
-      <w:pPr>
-        <w:pStyle w:val="BodyText"/>
-        <w:rPr>
-          <w:lang w:val="da-DK"/>
-        </w:rPr>
-      </w:pPr>
-    </w:p>
-    <w:p>
-      <w:pPr>
-        <w:pStyle w:val="Heading"/>
-        <w:rPr>
-          <w:lang w:val="da-DK"/>
-        </w:rPr>
-      </w:pPr>
-      <w:r>
-        <w:rPr>
-          <w:lang w:val="da-DK"/>
-        </w:rPr>
-        <w:t xml:space="preserve">Q: </w:t>
-      </w:r>
-      <w:r>
-        <w:rPr>
-          <w:lang w:val="da-DK"/>
-        </w:rPr>
-        <w:t>esp32_enumerate</w:t>
-      </w:r>
-    </w:p>
-    <w:p>
-      <w:pPr>
-        <w:pStyle w:val="BodyText"/>
-        <w:rPr>
-          <w:lang w:val="da-DK"/>
-        </w:rPr>
-      </w:pPr>
-      <w:r>
-        <w:rPr>
-          <w:lang w:val="da-DK"/>
-        </w:rPr>
-        <w:t xml:space="preserve">Lav et program esp32_enumerate i Arduino, hvor </w:t>
-      </w:r>
-      <w:proofErr w:type="spellStart"/>
-      <w:r>
-        <w:rPr>
-          <w:lang w:val="da-DK"/>
-        </w:rPr>
-        <w:t>pins</w:t>
-      </w:r>
-      <w:proofErr w:type="spellEnd"/>
-      <w:r>
-        <w:rPr>
-          <w:lang w:val="da-DK"/>
-        </w:rPr>
-        <w:t xml:space="preserve"> er defineret i en </w:t>
-      </w:r>
-      <w:proofErr w:type="spellStart"/>
-      <w:r>
-        <w:rPr>
-          <w:lang w:val="da-DK"/>
-        </w:rPr>
-        <w:t>enum</w:t>
-      </w:r>
-      <w:proofErr w:type="spellEnd"/>
-      <w:r>
-        <w:rPr>
-          <w:lang w:val="da-DK"/>
-        </w:rPr>
-        <w:t>. Send værdierne af både venstre og højre knap til din computer.</w:t>
-      </w:r>
-    </w:p>
-    <w:p>
-      <w:pPr>
-        <w:pStyle w:val="BodyText"/>
-        <w:rPr>
-          <w:lang w:val="da-DK"/>
-        </w:rPr>
-      </w:pPr>
-      <w:r>
-        <w:rPr>
-          <w:b/>
-          <w:bCs/>
-          <w:lang w:val="da-DK"/>
-        </w:rPr>
-        <w:t>Fremgangsmåde:</w:t>
-      </w:r>
-    </w:p>
-    <w:p>
-      <w:pPr>
-        <w:pStyle w:val="BodyText"/>
-        <w:numPr>
-          <w:ilvl w:val="0"/>
           <w:numId w:val="11"/>
         </w:numPr>
         <w:rPr>
@@ -1513,35 +482,7 @@
         <w:rPr>
           <w:lang w:val="da-DK"/>
         </w:rPr>
-        <w:t xml:space="preserve">Definer en </w:t>
-      </w:r>
-      <w:proofErr w:type="spellStart"/>
-      <w:r>
-        <w:rPr>
-          <w:lang w:val="da-DK"/>
-        </w:rPr>
-        <w:t>enum</w:t>
-      </w:r>
-      <w:proofErr w:type="spellEnd"/>
-      <w:r>
-        <w:rPr>
-          <w:lang w:val="da-DK"/>
-        </w:rPr>
-        <w:t xml:space="preserve"> af </w:t>
-      </w:r>
-      <w:proofErr w:type="spellStart"/>
-      <w:r>
-        <w:rPr>
-          <w:lang w:val="da-DK"/>
-        </w:rPr>
-        <w:t>ButtonsPins</w:t>
-      </w:r>
-      <w:proofErr w:type="spellEnd"/>
-      <w:r>
-        <w:rPr>
-          <w:lang w:val="da-DK"/>
-        </w:rPr>
-        <w:t xml:space="preserve">, med værdier </w:t>
+        <w:t xml:space="preserve">Definer en enum af ButtonsPins, med værdier </w:t>
       </w:r>
     </w:p>
     <w:p>
@@ -1555,19 +496,11 @@
           <w:lang w:val="da-DK"/>
         </w:rPr>
       </w:pPr>
-      <w:proofErr w:type="spellStart"/>
-      <w:r>
-        <w:rPr>
-          <w:lang w:val="da-DK"/>
-        </w:rPr>
-        <w:t>Left</w:t>
-      </w:r>
-      <w:proofErr w:type="spellEnd"/>
-      <w:r>
-        <w:rPr>
-          <w:lang w:val="da-DK"/>
-        </w:rPr>
-        <w:t>=0</w:t>
+      <w:r>
+        <w:rPr>
+          <w:lang w:val="da-DK"/>
+        </w:rPr>
+        <w:t>Left=0</w:t>
       </w:r>
     </w:p>
     <w:p>
@@ -1585,7 +518,6 @@
         <w:rPr>
           <w:lang w:val="da-DK"/>
         </w:rPr>
-        <w:lastRenderedPageBreak/>
         <w:t>Right=35</w:t>
       </w:r>
     </w:p>
@@ -1686,21 +618,7 @@
         <w:rPr>
           <w:lang w:val="da-DK"/>
         </w:rPr>
-        <w:t xml:space="preserve">Sæt et </w:t>
-      </w:r>
-      <w:proofErr w:type="spellStart"/>
-      <w:r>
-        <w:rPr>
-          <w:lang w:val="da-DK"/>
-        </w:rPr>
-        <w:t>delay</w:t>
-      </w:r>
-      <w:proofErr w:type="spellEnd"/>
-      <w:r>
-        <w:rPr>
-          <w:lang w:val="da-DK"/>
-        </w:rPr>
-        <w:t xml:space="preserve"> på 100ms</w:t>
+        <w:t>Sæt et delay på 100ms</w:t>
       </w:r>
     </w:p>
     <w:p>
@@ -1832,35 +750,7 @@
         <w:rPr>
           <w:lang w:val="da-DK"/>
         </w:rPr>
-        <w:t xml:space="preserve">Skriv kildekoden til et program patient2.c. Programmet skal indeholde et array som indeholder 7 elementer af typen </w:t>
-      </w:r>
-      <w:proofErr w:type="spellStart"/>
-      <w:r>
-        <w:rPr>
-          <w:lang w:val="da-DK"/>
-        </w:rPr>
-        <w:t>struct</w:t>
-      </w:r>
-      <w:proofErr w:type="spellEnd"/>
-      <w:r>
-        <w:rPr>
-          <w:lang w:val="da-DK"/>
-        </w:rPr>
-        <w:t xml:space="preserve"> Patient. Programmet skal </w:t>
-      </w:r>
-      <w:proofErr w:type="spellStart"/>
-      <w:r>
-        <w:rPr>
-          <w:lang w:val="da-DK"/>
-        </w:rPr>
-        <w:t>vha</w:t>
-      </w:r>
-      <w:proofErr w:type="spellEnd"/>
-      <w:r>
-        <w:rPr>
-          <w:lang w:val="da-DK"/>
-        </w:rPr>
-        <w:t xml:space="preserve"> et loop printe alle informationer for hver patient ud.</w:t>
+        <w:t>Skriv kildekoden til et program patient2.c. Programmet skal indeholde et array som indeholder 7 elementer af typen struct Patient. Programmet skal vha et loop printe alle informationer for hver patient ud.</w:t>
       </w:r>
     </w:p>
     <w:p>
@@ -1907,6 +797,7 @@
           <w:bCs/>
           <w:lang w:val="da-DK"/>
         </w:rPr>
+        <w:lastRenderedPageBreak/>
         <w:t>Fremgangsmåde:</w:t>
       </w:r>
     </w:p>
@@ -1943,35 +834,7 @@
         <w:rPr>
           <w:lang w:val="da-DK"/>
         </w:rPr>
-        <w:t xml:space="preserve">Definer et </w:t>
-      </w:r>
-      <w:proofErr w:type="spellStart"/>
-      <w:r>
-        <w:rPr>
-          <w:lang w:val="da-DK"/>
-        </w:rPr>
-        <w:t>struct</w:t>
-      </w:r>
-      <w:proofErr w:type="spellEnd"/>
-      <w:r>
-        <w:rPr>
-          <w:lang w:val="da-DK"/>
-        </w:rPr>
-        <w:t xml:space="preserve"> Patient array, som kan indeholde 7 elementer, og sæt </w:t>
-      </w:r>
-      <w:proofErr w:type="spellStart"/>
-      <w:r>
-        <w:rPr>
-          <w:lang w:val="da-DK"/>
-        </w:rPr>
-        <w:t>dataen</w:t>
-      </w:r>
-      <w:proofErr w:type="spellEnd"/>
-      <w:r>
-        <w:rPr>
-          <w:lang w:val="da-DK"/>
-        </w:rPr>
-        <w:t xml:space="preserve"> ind. Det nye array skal indeholde følgende patient informationer</w:t>
+        <w:t>Definer et struct Patient array, som kan indeholde 7 elementer, og sæt dataen ind. Det nye array skal indeholde følgende patient informationer</w:t>
       </w:r>
     </w:p>
     <w:p>
@@ -1989,35 +852,7 @@
         <w:rPr>
           <w:lang w:val="da-DK"/>
         </w:rPr>
-        <w:t xml:space="preserve">id 99, age 18, </w:t>
-      </w:r>
-      <w:proofErr w:type="spellStart"/>
-      <w:r>
-        <w:rPr>
-          <w:lang w:val="da-DK"/>
-        </w:rPr>
-        <w:t>heightM</w:t>
-      </w:r>
-      <w:proofErr w:type="spellEnd"/>
-      <w:r>
-        <w:rPr>
-          <w:lang w:val="da-DK"/>
-        </w:rPr>
-        <w:t xml:space="preserve"> 1.82, </w:t>
-      </w:r>
-      <w:proofErr w:type="spellStart"/>
-      <w:r>
-        <w:rPr>
-          <w:lang w:val="da-DK"/>
-        </w:rPr>
-        <w:t>weightKg</w:t>
-      </w:r>
-      <w:proofErr w:type="spellEnd"/>
-      <w:r>
-        <w:rPr>
-          <w:lang w:val="da-DK"/>
-        </w:rPr>
-        <w:t xml:space="preserve"> 88.0</w:t>
+        <w:t>id 99, age 18, heightM 1.82, weightKg 88.0</w:t>
       </w:r>
     </w:p>
     <w:p>
@@ -2035,35 +870,7 @@
         <w:rPr>
           <w:lang w:val="da-DK"/>
         </w:rPr>
-        <w:t xml:space="preserve">id 93, age 35, </w:t>
-      </w:r>
-      <w:proofErr w:type="spellStart"/>
-      <w:r>
-        <w:rPr>
-          <w:lang w:val="da-DK"/>
-        </w:rPr>
-        <w:t>heightM</w:t>
-      </w:r>
-      <w:proofErr w:type="spellEnd"/>
-      <w:r>
-        <w:rPr>
-          <w:lang w:val="da-DK"/>
-        </w:rPr>
-        <w:t xml:space="preserve"> 1.63, </w:t>
-      </w:r>
-      <w:proofErr w:type="spellStart"/>
-      <w:r>
-        <w:rPr>
-          <w:lang w:val="da-DK"/>
-        </w:rPr>
-        <w:t>weightKg</w:t>
-      </w:r>
-      <w:proofErr w:type="spellEnd"/>
-      <w:r>
-        <w:rPr>
-          <w:lang w:val="da-DK"/>
-        </w:rPr>
-        <w:t xml:space="preserve"> 69.0</w:t>
+        <w:t>id 93, age 35, heightM 1.63, weightKg 69.0</w:t>
       </w:r>
     </w:p>
     <w:p>
@@ -2081,35 +888,7 @@
         <w:rPr>
           <w:lang w:val="da-DK"/>
         </w:rPr>
-        <w:t xml:space="preserve">id 89, age 25, </w:t>
-      </w:r>
-      <w:proofErr w:type="spellStart"/>
-      <w:r>
-        <w:rPr>
-          <w:lang w:val="da-DK"/>
-        </w:rPr>
-        <w:t>heightM</w:t>
-      </w:r>
-      <w:proofErr w:type="spellEnd"/>
-      <w:r>
-        <w:rPr>
-          <w:lang w:val="da-DK"/>
-        </w:rPr>
-        <w:t xml:space="preserve"> 1.80, </w:t>
-      </w:r>
-      <w:proofErr w:type="spellStart"/>
-      <w:r>
-        <w:rPr>
-          <w:lang w:val="da-DK"/>
-        </w:rPr>
-        <w:t>weightKg</w:t>
-      </w:r>
-      <w:proofErr w:type="spellEnd"/>
-      <w:r>
-        <w:rPr>
-          <w:lang w:val="da-DK"/>
-        </w:rPr>
-        <w:t xml:space="preserve"> 75.0</w:t>
+        <w:t>id 89, age 25, heightM 1.80, weightKg 75.0</w:t>
       </w:r>
     </w:p>
     <w:p>
@@ -2127,35 +906,7 @@
         <w:rPr>
           <w:lang w:val="da-DK"/>
         </w:rPr>
-        <w:t xml:space="preserve">id 83, age 31, </w:t>
-      </w:r>
-      <w:proofErr w:type="spellStart"/>
-      <w:r>
-        <w:rPr>
-          <w:lang w:val="da-DK"/>
-        </w:rPr>
-        <w:t>heightM</w:t>
-      </w:r>
-      <w:proofErr w:type="spellEnd"/>
-      <w:r>
-        <w:rPr>
-          <w:lang w:val="da-DK"/>
-        </w:rPr>
-        <w:t xml:space="preserve"> 1.51, </w:t>
-      </w:r>
-      <w:proofErr w:type="spellStart"/>
-      <w:r>
-        <w:rPr>
-          <w:lang w:val="da-DK"/>
-        </w:rPr>
-        <w:t>weightKg</w:t>
-      </w:r>
-      <w:proofErr w:type="spellEnd"/>
-      <w:r>
-        <w:rPr>
-          <w:lang w:val="da-DK"/>
-        </w:rPr>
-        <w:t xml:space="preserve"> 70.0</w:t>
+        <w:t>id 83, age 31, heightM 1.51, weightKg 70.0</w:t>
       </w:r>
     </w:p>
     <w:p>
@@ -2173,36 +924,7 @@
         <w:rPr>
           <w:lang w:val="da-DK"/>
         </w:rPr>
-        <w:lastRenderedPageBreak/>
-        <w:t xml:space="preserve">id 46, age 29, </w:t>
-      </w:r>
-      <w:proofErr w:type="spellStart"/>
-      <w:r>
-        <w:rPr>
-          <w:lang w:val="da-DK"/>
-        </w:rPr>
-        <w:t>heightM</w:t>
-      </w:r>
-      <w:proofErr w:type="spellEnd"/>
-      <w:r>
-        <w:rPr>
-          <w:lang w:val="da-DK"/>
-        </w:rPr>
-        <w:t xml:space="preserve"> 1.75, </w:t>
-      </w:r>
-      <w:proofErr w:type="spellStart"/>
-      <w:r>
-        <w:rPr>
-          <w:lang w:val="da-DK"/>
-        </w:rPr>
-        <w:t>weightKg</w:t>
-      </w:r>
-      <w:proofErr w:type="spellEnd"/>
-      <w:r>
-        <w:rPr>
-          <w:lang w:val="da-DK"/>
-        </w:rPr>
-        <w:t xml:space="preserve"> 63.0</w:t>
+        <w:t>id 46, age 29, heightM 1.75, weightKg 63.0</w:t>
       </w:r>
     </w:p>
     <w:p>
@@ -2220,35 +942,7 @@
         <w:rPr>
           <w:lang w:val="da-DK"/>
         </w:rPr>
-        <w:t xml:space="preserve">id 16, age 56, </w:t>
-      </w:r>
-      <w:proofErr w:type="spellStart"/>
-      <w:r>
-        <w:rPr>
-          <w:lang w:val="da-DK"/>
-        </w:rPr>
-        <w:t>heightM</w:t>
-      </w:r>
-      <w:proofErr w:type="spellEnd"/>
-      <w:r>
-        <w:rPr>
-          <w:lang w:val="da-DK"/>
-        </w:rPr>
-        <w:t xml:space="preserve"> 1.52, </w:t>
-      </w:r>
-      <w:proofErr w:type="spellStart"/>
-      <w:r>
-        <w:rPr>
-          <w:lang w:val="da-DK"/>
-        </w:rPr>
-        <w:t>weightKg</w:t>
-      </w:r>
-      <w:proofErr w:type="spellEnd"/>
-      <w:r>
-        <w:rPr>
-          <w:lang w:val="da-DK"/>
-        </w:rPr>
-        <w:t xml:space="preserve"> 54.0</w:t>
+        <w:t>id 16, age 56, heightM 1.52, weightKg 54.0</w:t>
       </w:r>
     </w:p>
     <w:p>
@@ -2266,35 +960,7 @@
         <w:rPr>
           <w:lang w:val="da-DK"/>
         </w:rPr>
-        <w:t xml:space="preserve">id 17, age 16, </w:t>
-      </w:r>
-      <w:proofErr w:type="spellStart"/>
-      <w:r>
-        <w:rPr>
-          <w:lang w:val="da-DK"/>
-        </w:rPr>
-        <w:t>heightM</w:t>
-      </w:r>
-      <w:proofErr w:type="spellEnd"/>
-      <w:r>
-        <w:rPr>
-          <w:lang w:val="da-DK"/>
-        </w:rPr>
-        <w:t xml:space="preserve"> 1.65, </w:t>
-      </w:r>
-      <w:proofErr w:type="spellStart"/>
-      <w:r>
-        <w:rPr>
-          <w:lang w:val="da-DK"/>
-        </w:rPr>
-        <w:t>weightKg</w:t>
-      </w:r>
-      <w:proofErr w:type="spellEnd"/>
-      <w:r>
-        <w:rPr>
-          <w:lang w:val="da-DK"/>
-        </w:rPr>
-        <w:t xml:space="preserve"> 50.0</w:t>
+        <w:t>id 17, age 16, heightM 1.65, weightKg 50.0</w:t>
       </w:r>
     </w:p>
     <w:p>
@@ -2340,35 +1006,7 @@
         <w:rPr>
           <w:lang w:val="da-DK"/>
         </w:rPr>
-        <w:t xml:space="preserve">Skriv kildekoden til et program patient3.c, som benytter en liste af </w:t>
-      </w:r>
-      <w:proofErr w:type="spellStart"/>
-      <w:r>
-        <w:rPr>
-          <w:lang w:val="da-DK"/>
-        </w:rPr>
-        <w:t>struct</w:t>
-      </w:r>
-      <w:proofErr w:type="spellEnd"/>
-      <w:r>
-        <w:rPr>
-          <w:lang w:val="da-DK"/>
-        </w:rPr>
-        <w:t xml:space="preserve"> Patient der kan indeholde data. Udregn gennemsnittet ofr </w:t>
-      </w:r>
-      <w:proofErr w:type="spellStart"/>
-      <w:r>
-        <w:rPr>
-          <w:lang w:val="da-DK"/>
-        </w:rPr>
-        <w:t>hhv</w:t>
-      </w:r>
-      <w:proofErr w:type="spellEnd"/>
-      <w:r>
-        <w:rPr>
-          <w:lang w:val="da-DK"/>
-        </w:rPr>
-        <w:t xml:space="preserve"> alder, højde og vægt.</w:t>
+        <w:t>Skriv kildekoden til et program patient3.c, som benytter en liste af struct Patient der kan indeholde data. Udregn gennemsnittet ofr hhv alder, højde og vægt.</w:t>
       </w:r>
     </w:p>
     <w:p>
@@ -2420,21 +1058,7 @@
         <w:rPr>
           <w:lang w:val="da-DK"/>
         </w:rPr>
-        <w:t xml:space="preserve">Overvej hvilke </w:t>
-      </w:r>
-      <w:proofErr w:type="spellStart"/>
-      <w:r>
-        <w:rPr>
-          <w:lang w:val="da-DK"/>
-        </w:rPr>
-        <w:t>libraries</w:t>
-      </w:r>
-      <w:proofErr w:type="spellEnd"/>
-      <w:r>
-        <w:rPr>
-          <w:lang w:val="da-DK"/>
-        </w:rPr>
-        <w:t xml:space="preserve"> vi skal benytte til </w:t>
+        <w:t xml:space="preserve">Overvej hvilke libraries vi skal benytte til </w:t>
       </w:r>
       <m:oMath>
         <m:sSup>
@@ -2508,21 +1132,7 @@
         <w:rPr>
           <w:lang w:val="da-DK"/>
         </w:rPr>
-        <w:t xml:space="preserve">Print de </w:t>
-      </w:r>
-      <w:proofErr w:type="spellStart"/>
-      <w:r>
-        <w:rPr>
-          <w:lang w:val="da-DK"/>
-        </w:rPr>
-        <w:t>descriptive</w:t>
-      </w:r>
-      <w:proofErr w:type="spellEnd"/>
-      <w:r>
-        <w:rPr>
-          <w:lang w:val="da-DK"/>
-        </w:rPr>
-        <w:t xml:space="preserve"> informationer ud i terminalen, sammen med antallet af patienter</w:t>
+        <w:t>Print de descriptive informationer ud i terminalen, sammen med antallet af patienter</w:t>
       </w:r>
     </w:p>
     <w:p>
@@ -2912,21 +1522,7 @@
         <w:rPr>
           <w:lang w:val="da-DK"/>
         </w:rPr>
-        <w:t xml:space="preserve">Skriv kildekoden til et program patient4.c, som benytter en liste af </w:t>
-      </w:r>
-      <w:proofErr w:type="spellStart"/>
-      <w:r>
-        <w:rPr>
-          <w:lang w:val="da-DK"/>
-        </w:rPr>
-        <w:t>struct</w:t>
-      </w:r>
-      <w:proofErr w:type="spellEnd"/>
-      <w:r>
-        <w:rPr>
-          <w:lang w:val="da-DK"/>
-        </w:rPr>
-        <w:t xml:space="preserve"> Patient der kan indeholde data</w:t>
+        <w:t>Skriv kildekoden til et program patient4.c, som benytter en liste af struct Patient der kan indeholde data</w:t>
       </w:r>
     </w:p>
     <w:p>
@@ -2962,44 +1558,8 @@
         <w:rPr>
           <w:lang w:val="da-DK"/>
         </w:rPr>
-        <w:t xml:space="preserve">Definer en </w:t>
-      </w:r>
-      <w:proofErr w:type="spellStart"/>
-      <w:r>
-        <w:rPr>
-          <w:lang w:val="da-DK"/>
-        </w:rPr>
-        <w:t>enum</w:t>
-      </w:r>
-      <w:proofErr w:type="spellEnd"/>
-      <w:r>
-        <w:rPr>
-          <w:lang w:val="da-DK"/>
-        </w:rPr>
-        <w:t xml:space="preserve"> type </w:t>
-      </w:r>
-      <w:proofErr w:type="spellStart"/>
-      <w:r>
-        <w:rPr>
-          <w:lang w:val="da-DK"/>
-        </w:rPr>
-        <w:t>Gender</w:t>
-      </w:r>
-      <w:proofErr w:type="spellEnd"/>
-      <w:r>
-        <w:rPr>
-          <w:lang w:val="da-DK"/>
-        </w:rPr>
-        <w:t xml:space="preserve">, som indeholder Male, </w:t>
-      </w:r>
-      <w:proofErr w:type="spellStart"/>
-      <w:r>
-        <w:rPr>
-          <w:lang w:val="da-DK"/>
-        </w:rPr>
-        <w:t>Female</w:t>
-      </w:r>
-      <w:proofErr w:type="spellEnd"/>
+        <w:t>Definer en enum type Gender, som indeholder Male, Female</w:t>
+      </w:r>
     </w:p>
     <w:p>
       <w:pPr>
@@ -3043,63 +1603,8 @@
         <w:rPr>
           <w:lang w:val="da-DK"/>
         </w:rPr>
-        <w:t xml:space="preserve">tilføj en </w:t>
-      </w:r>
-      <w:proofErr w:type="spellStart"/>
-      <w:r>
-        <w:rPr>
-          <w:lang w:val="da-DK"/>
-        </w:rPr>
-        <w:t>member</w:t>
-      </w:r>
-      <w:proofErr w:type="spellEnd"/>
-      <w:r>
-        <w:rPr>
-          <w:lang w:val="da-DK"/>
-        </w:rPr>
-        <w:t xml:space="preserve">-variable </w:t>
-      </w:r>
-      <w:proofErr w:type="spellStart"/>
-      <w:r>
-        <w:rPr>
-          <w:lang w:val="da-DK"/>
-        </w:rPr>
-        <w:t>gender</w:t>
-      </w:r>
-      <w:proofErr w:type="spellEnd"/>
-      <w:r>
-        <w:rPr>
-          <w:lang w:val="da-DK"/>
-        </w:rPr>
-        <w:t xml:space="preserve">, som er af datatypen </w:t>
-      </w:r>
-      <w:proofErr w:type="spellStart"/>
-      <w:r>
-        <w:rPr>
-          <w:lang w:val="da-DK"/>
-        </w:rPr>
-        <w:t>enum</w:t>
-      </w:r>
-      <w:proofErr w:type="spellEnd"/>
-      <w:r>
-        <w:rPr>
-          <w:lang w:val="da-DK"/>
-        </w:rPr>
-        <w:t xml:space="preserve"> </w:t>
-      </w:r>
-      <w:proofErr w:type="spellStart"/>
-      <w:r>
-        <w:rPr>
-          <w:lang w:val="da-DK"/>
-        </w:rPr>
-        <w:t>Gender</w:t>
-      </w:r>
-      <w:proofErr w:type="spellEnd"/>
-      <w:r>
-        <w:rPr>
-          <w:lang w:val="da-DK"/>
-        </w:rPr>
-        <w:t>.</w:t>
+        <w:lastRenderedPageBreak/>
+        <w:t>tilføj en member-variable gender, som er af datatypen enum Gender.</w:t>
       </w:r>
     </w:p>
     <w:p>
@@ -3117,35 +1622,7 @@
         <w:rPr>
           <w:lang w:val="da-DK"/>
         </w:rPr>
-        <w:t xml:space="preserve">id 1999, age 18, </w:t>
-      </w:r>
-      <w:proofErr w:type="spellStart"/>
-      <w:r>
-        <w:rPr>
-          <w:lang w:val="da-DK"/>
-        </w:rPr>
-        <w:t>heightM</w:t>
-      </w:r>
-      <w:proofErr w:type="spellEnd"/>
-      <w:r>
-        <w:rPr>
-          <w:lang w:val="da-DK"/>
-        </w:rPr>
-        <w:t xml:space="preserve"> 1.82, </w:t>
-      </w:r>
-      <w:proofErr w:type="spellStart"/>
-      <w:r>
-        <w:rPr>
-          <w:lang w:val="da-DK"/>
-        </w:rPr>
-        <w:t>weightKg</w:t>
-      </w:r>
-      <w:proofErr w:type="spellEnd"/>
-      <w:r>
-        <w:rPr>
-          <w:lang w:val="da-DK"/>
-        </w:rPr>
-        <w:t xml:space="preserve"> 88, Male</w:t>
+        <w:t>id 1999, age 18, heightM 1.82, weightKg 88, Male</w:t>
       </w:r>
     </w:p>
     <w:p>
@@ -3163,44 +1640,8 @@
         <w:rPr>
           <w:lang w:val="da-DK"/>
         </w:rPr>
-        <w:t xml:space="preserve">id 1993, age 35, </w:t>
-      </w:r>
-      <w:proofErr w:type="spellStart"/>
-      <w:r>
-        <w:rPr>
-          <w:lang w:val="da-DK"/>
-        </w:rPr>
-        <w:t>heightM</w:t>
-      </w:r>
-      <w:proofErr w:type="spellEnd"/>
-      <w:r>
-        <w:rPr>
-          <w:lang w:val="da-DK"/>
-        </w:rPr>
-        <w:t xml:space="preserve"> 1.63, </w:t>
-      </w:r>
-      <w:proofErr w:type="spellStart"/>
-      <w:r>
-        <w:rPr>
-          <w:lang w:val="da-DK"/>
-        </w:rPr>
-        <w:t>weightKg</w:t>
-      </w:r>
-      <w:proofErr w:type="spellEnd"/>
-      <w:r>
-        <w:rPr>
-          <w:lang w:val="da-DK"/>
-        </w:rPr>
-        <w:t xml:space="preserve"> 69, </w:t>
-      </w:r>
-      <w:proofErr w:type="spellStart"/>
-      <w:r>
-        <w:rPr>
-          <w:lang w:val="da-DK"/>
-        </w:rPr>
-        <w:t>Female</w:t>
-      </w:r>
-      <w:proofErr w:type="spellEnd"/>
+        <w:t>id 1993, age 35, heightM 1.63, weightKg 69, Female</w:t>
+      </w:r>
     </w:p>
     <w:p>
       <w:pPr>
@@ -3217,35 +1658,7 @@
         <w:rPr>
           <w:lang w:val="da-DK"/>
         </w:rPr>
-        <w:t xml:space="preserve">id 899 , age 25, </w:t>
-      </w:r>
-      <w:proofErr w:type="spellStart"/>
-      <w:r>
-        <w:rPr>
-          <w:lang w:val="da-DK"/>
-        </w:rPr>
-        <w:t>heightM</w:t>
-      </w:r>
-      <w:proofErr w:type="spellEnd"/>
-      <w:r>
-        <w:rPr>
-          <w:lang w:val="da-DK"/>
-        </w:rPr>
-        <w:t xml:space="preserve"> 1.80, </w:t>
-      </w:r>
-      <w:proofErr w:type="spellStart"/>
-      <w:r>
-        <w:rPr>
-          <w:lang w:val="da-DK"/>
-        </w:rPr>
-        <w:t>weightKg</w:t>
-      </w:r>
-      <w:proofErr w:type="spellEnd"/>
-      <w:r>
-        <w:rPr>
-          <w:lang w:val="da-DK"/>
-        </w:rPr>
-        <w:t xml:space="preserve"> 75, Male</w:t>
+        <w:t>id 899 , age 25, heightM 1.80, weightKg 75, Male</w:t>
       </w:r>
     </w:p>
     <w:p>
@@ -3263,44 +1676,8 @@
         <w:rPr>
           <w:lang w:val="da-DK"/>
         </w:rPr>
-        <w:t xml:space="preserve">id 9783, age 31, </w:t>
-      </w:r>
-      <w:proofErr w:type="spellStart"/>
-      <w:r>
-        <w:rPr>
-          <w:lang w:val="da-DK"/>
-        </w:rPr>
-        <w:t>heightM</w:t>
-      </w:r>
-      <w:proofErr w:type="spellEnd"/>
-      <w:r>
-        <w:rPr>
-          <w:lang w:val="da-DK"/>
-        </w:rPr>
-        <w:t xml:space="preserve"> 1.51, </w:t>
-      </w:r>
-      <w:proofErr w:type="spellStart"/>
-      <w:r>
-        <w:rPr>
-          <w:lang w:val="da-DK"/>
-        </w:rPr>
-        <w:t>weightKg</w:t>
-      </w:r>
-      <w:proofErr w:type="spellEnd"/>
-      <w:r>
-        <w:rPr>
-          <w:lang w:val="da-DK"/>
-        </w:rPr>
-        <w:t xml:space="preserve"> 70, </w:t>
-      </w:r>
-      <w:proofErr w:type="spellStart"/>
-      <w:r>
-        <w:rPr>
-          <w:lang w:val="da-DK"/>
-        </w:rPr>
-        <w:t>Female</w:t>
-      </w:r>
-      <w:proofErr w:type="spellEnd"/>
+        <w:t>id 9783, age 31, heightM 1.51, weightKg 70, Female</w:t>
+      </w:r>
     </w:p>
     <w:p>
       <w:pPr>
@@ -3317,44 +1694,8 @@
         <w:rPr>
           <w:lang w:val="da-DK"/>
         </w:rPr>
-        <w:t xml:space="preserve">id 6446, age 29, </w:t>
-      </w:r>
-      <w:proofErr w:type="spellStart"/>
-      <w:r>
-        <w:rPr>
-          <w:lang w:val="da-DK"/>
-        </w:rPr>
-        <w:t>heightM</w:t>
-      </w:r>
-      <w:proofErr w:type="spellEnd"/>
-      <w:r>
-        <w:rPr>
-          <w:lang w:val="da-DK"/>
-        </w:rPr>
-        <w:t xml:space="preserve"> 1.75, </w:t>
-      </w:r>
-      <w:proofErr w:type="spellStart"/>
-      <w:r>
-        <w:rPr>
-          <w:lang w:val="da-DK"/>
-        </w:rPr>
-        <w:t>weightKg</w:t>
-      </w:r>
-      <w:proofErr w:type="spellEnd"/>
-      <w:r>
-        <w:rPr>
-          <w:lang w:val="da-DK"/>
-        </w:rPr>
-        <w:t xml:space="preserve"> 63, </w:t>
-      </w:r>
-      <w:proofErr w:type="spellStart"/>
-      <w:r>
-        <w:rPr>
-          <w:lang w:val="da-DK"/>
-        </w:rPr>
-        <w:t>Female</w:t>
-      </w:r>
-      <w:proofErr w:type="spellEnd"/>
+        <w:t>id 6446, age 29, heightM 1.75, weightKg 63, Female</w:t>
+      </w:r>
     </w:p>
     <w:p>
       <w:pPr>
@@ -3371,44 +1712,8 @@
         <w:rPr>
           <w:lang w:val="da-DK"/>
         </w:rPr>
-        <w:t xml:space="preserve">id  16 , age 56, </w:t>
-      </w:r>
-      <w:proofErr w:type="spellStart"/>
-      <w:r>
-        <w:rPr>
-          <w:lang w:val="da-DK"/>
-        </w:rPr>
-        <w:t>heightM</w:t>
-      </w:r>
-      <w:proofErr w:type="spellEnd"/>
-      <w:r>
-        <w:rPr>
-          <w:lang w:val="da-DK"/>
-        </w:rPr>
-        <w:t xml:space="preserve"> 1.52, </w:t>
-      </w:r>
-      <w:proofErr w:type="spellStart"/>
-      <w:r>
-        <w:rPr>
-          <w:lang w:val="da-DK"/>
-        </w:rPr>
-        <w:t>weightKg</w:t>
-      </w:r>
-      <w:proofErr w:type="spellEnd"/>
-      <w:r>
-        <w:rPr>
-          <w:lang w:val="da-DK"/>
-        </w:rPr>
-        <w:t xml:space="preserve"> 54, </w:t>
-      </w:r>
-      <w:proofErr w:type="spellStart"/>
-      <w:r>
-        <w:rPr>
-          <w:lang w:val="da-DK"/>
-        </w:rPr>
-        <w:t>Female</w:t>
-      </w:r>
-      <w:proofErr w:type="spellEnd"/>
+        <w:t>id  16 , age 56, heightM 1.52, weightKg 54, Female</w:t>
+      </w:r>
     </w:p>
     <w:p>
       <w:pPr>
@@ -3425,36 +1730,7 @@
         <w:rPr>
           <w:lang w:val="da-DK"/>
         </w:rPr>
-        <w:lastRenderedPageBreak/>
-        <w:t xml:space="preserve">id  16 , age 16, </w:t>
-      </w:r>
-      <w:proofErr w:type="spellStart"/>
-      <w:r>
-        <w:rPr>
-          <w:lang w:val="da-DK"/>
-        </w:rPr>
-        <w:t>heightM</w:t>
-      </w:r>
-      <w:proofErr w:type="spellEnd"/>
-      <w:r>
-        <w:rPr>
-          <w:lang w:val="da-DK"/>
-        </w:rPr>
-        <w:t xml:space="preserve"> 1.65, </w:t>
-      </w:r>
-      <w:proofErr w:type="spellStart"/>
-      <w:r>
-        <w:rPr>
-          <w:lang w:val="da-DK"/>
-        </w:rPr>
-        <w:t>weightKg</w:t>
-      </w:r>
-      <w:proofErr w:type="spellEnd"/>
-      <w:r>
-        <w:rPr>
-          <w:lang w:val="da-DK"/>
-        </w:rPr>
-        <w:t xml:space="preserve"> 50, Male</w:t>
+        <w:t>id  16 , age 16, heightM 1.65, weightKg 50, Male</w:t>
       </w:r>
     </w:p>
     <w:p>
@@ -3520,21 +1796,7 @@
         <w:rPr>
           <w:lang w:val="da-DK"/>
         </w:rPr>
-        <w:t xml:space="preserve">Hint: overvej om man ikke kan gemme antallet af observationer for hhv. mænd / kvinder i den statistiske </w:t>
-      </w:r>
-      <w:proofErr w:type="spellStart"/>
-      <w:r>
-        <w:rPr>
-          <w:lang w:val="da-DK"/>
-        </w:rPr>
-        <w:t>struct</w:t>
-      </w:r>
-      <w:proofErr w:type="spellEnd"/>
-      <w:r>
-        <w:rPr>
-          <w:lang w:val="da-DK"/>
-        </w:rPr>
-        <w:t>.</w:t>
+        <w:t>Hint: overvej om man ikke kan gemme antallet af observationer for hhv. mænd / kvinder i den statistiske struct.</w:t>
       </w:r>
     </w:p>
     <w:p>
@@ -3751,6 +2013,389 @@
     </w:p>
     <w:p>
       <w:pPr>
+        <w:pStyle w:val="BodyText"/>
+        <w:rPr>
+          <w:iCs/>
+          <w:lang w:val="da-DK"/>
+        </w:rPr>
+      </w:pPr>
+    </w:p>
+    <w:p>
+      <w:pPr>
+        <w:pStyle w:val="Heading"/>
+        <w:rPr>
+          <w:lang w:val="da-DK"/>
+        </w:rPr>
+      </w:pPr>
+      <w:r>
+        <w:rPr>
+          <w:lang w:val="da-DK"/>
+        </w:rPr>
+        <w:t>Q: example_timemodule</w:t>
+      </w:r>
+    </w:p>
+    <w:p>
+      <w:pPr>
+        <w:pStyle w:val="BodyText"/>
+        <w:rPr>
+          <w:lang w:val="da-DK"/>
+        </w:rPr>
+      </w:pPr>
+      <w:r>
+        <w:rPr>
+          <w:lang w:val="da-DK"/>
+        </w:rPr>
+        <w:t>Lav et program som beskriver hvornår tidstælleren i C startede. Svar på følgende spørgsmål:</w:t>
+      </w:r>
+    </w:p>
+    <w:p>
+      <w:pPr>
+        <w:pStyle w:val="BodyText"/>
+        <w:numPr>
+          <w:ilvl w:val="0"/>
+          <w:numId w:val="6"/>
+        </w:numPr>
+        <w:rPr>
+          <w:lang w:val="da-DK"/>
+        </w:rPr>
+      </w:pPr>
+      <w:r>
+        <w:rPr>
+          <w:lang w:val="da-DK"/>
+        </w:rPr>
+        <w:t>Hvor mange bytes fylder struct tm?</w:t>
+      </w:r>
+    </w:p>
+    <w:p>
+      <w:pPr>
+        <w:pStyle w:val="BodyText"/>
+        <w:numPr>
+          <w:ilvl w:val="0"/>
+          <w:numId w:val="6"/>
+        </w:numPr>
+        <w:rPr>
+          <w:lang w:val="da-DK"/>
+        </w:rPr>
+      </w:pPr>
+      <w:r>
+        <w:rPr>
+          <w:lang w:val="da-DK"/>
+        </w:rPr>
+        <w:t xml:space="preserve">Hvornår (dato og klokkeslæt) startede tidstælleren time_t? </w:t>
+      </w:r>
+    </w:p>
+    <w:p>
+      <w:pPr>
+        <w:pStyle w:val="BodyText"/>
+        <w:numPr>
+          <w:ilvl w:val="1"/>
+          <w:numId w:val="6"/>
+        </w:numPr>
+        <w:rPr>
+          <w:lang w:val="da-DK"/>
+        </w:rPr>
+      </w:pPr>
+      <w:r>
+        <w:rPr>
+          <w:lang w:val="da-DK"/>
+        </w:rPr>
+        <w:t xml:space="preserve">Hint: Hvad gør funktionen ctime? </w:t>
+      </w:r>
+    </w:p>
+    <w:p>
+      <w:pPr>
+        <w:pStyle w:val="BodyText"/>
+        <w:rPr>
+          <w:lang w:val="da-DK"/>
+        </w:rPr>
+      </w:pPr>
+      <w:r>
+        <w:rPr>
+          <w:b/>
+          <w:bCs/>
+          <w:lang w:val="da-DK"/>
+        </w:rPr>
+        <w:t>Fremgangsmåde:</w:t>
+      </w:r>
+    </w:p>
+    <w:p>
+      <w:pPr>
+        <w:pStyle w:val="BodyText"/>
+        <w:numPr>
+          <w:ilvl w:val="0"/>
+          <w:numId w:val="7"/>
+        </w:numPr>
+        <w:rPr>
+          <w:lang w:val="da-DK"/>
+        </w:rPr>
+      </w:pPr>
+      <w:r>
+        <w:rPr>
+          <w:lang w:val="da-DK"/>
+        </w:rPr>
+        <w:t>Lav et program example_timemodule.c</w:t>
+      </w:r>
+    </w:p>
+    <w:p>
+      <w:pPr>
+        <w:pStyle w:val="BodyText"/>
+        <w:numPr>
+          <w:ilvl w:val="0"/>
+          <w:numId w:val="7"/>
+        </w:numPr>
+        <w:rPr>
+          <w:lang w:val="da-DK"/>
+        </w:rPr>
+      </w:pPr>
+      <w:r>
+        <w:rPr>
+          <w:lang w:val="da-DK"/>
+        </w:rPr>
+        <w:t>Find ud af, samt importer det library hvor du kan finde datatypen tm, time_t, samt funktionerne asctime og ctime</w:t>
+      </w:r>
+    </w:p>
+    <w:p>
+      <w:pPr>
+        <w:pStyle w:val="BodyText"/>
+        <w:numPr>
+          <w:ilvl w:val="1"/>
+          <w:numId w:val="7"/>
+        </w:numPr>
+        <w:rPr>
+          <w:lang w:val="da-DK"/>
+        </w:rPr>
+      </w:pPr>
+      <w:r>
+        <w:rPr>
+          <w:lang w:val="da-DK"/>
+        </w:rPr>
+        <w:t>Hint: cs50 manual</w:t>
+      </w:r>
+    </w:p>
+    <w:p>
+      <w:pPr>
+        <w:pStyle w:val="BodyText"/>
+        <w:numPr>
+          <w:ilvl w:val="0"/>
+          <w:numId w:val="7"/>
+        </w:numPr>
+        <w:rPr>
+          <w:lang w:val="da-DK"/>
+        </w:rPr>
+      </w:pPr>
+      <w:r>
+        <w:rPr>
+          <w:lang w:val="da-DK"/>
+        </w:rPr>
+        <w:t xml:space="preserve">Definer en variabel </w:t>
+      </w:r>
+      <w:r>
+        <w:rPr>
+          <w:lang w:val="da-DK"/>
+        </w:rPr>
+        <w:tab/>
+        <w:t>time_t epoch = 0</w:t>
+      </w:r>
+    </w:p>
+    <w:p>
+      <w:pPr>
+        <w:pStyle w:val="BodyText"/>
+        <w:numPr>
+          <w:ilvl w:val="0"/>
+          <w:numId w:val="7"/>
+        </w:numPr>
+        <w:rPr>
+          <w:lang w:val="da-DK"/>
+        </w:rPr>
+      </w:pPr>
+      <w:r>
+        <w:rPr>
+          <w:lang w:val="da-DK"/>
+        </w:rPr>
+        <w:t>Print antal bytes som struct tm indeholder (Hint: sizeof)</w:t>
+      </w:r>
+    </w:p>
+    <w:p>
+      <w:pPr>
+        <w:pStyle w:val="BodyText"/>
+        <w:rPr>
+          <w:lang w:val="da-DK"/>
+        </w:rPr>
+      </w:pPr>
+      <w:r>
+        <w:rPr>
+          <w:lang w:val="da-DK"/>
+        </w:rPr>
+        <w:t xml:space="preserve">3. </w:t>
+      </w:r>
+      <w:r>
+        <w:rPr>
+          <w:lang w:val="da-DK"/>
+        </w:rPr>
+        <w:t>Print den string, som</w:t>
+      </w:r>
+      <w:r>
+        <w:rPr>
+          <w:lang w:val="da-DK"/>
+        </w:rPr>
+        <w:t xml:space="preserve"> ctime(&amp;epoch) </w:t>
+      </w:r>
+      <w:r>
+        <w:rPr>
+          <w:lang w:val="da-DK"/>
+        </w:rPr>
+        <w:t>laver, i</w:t>
+      </w:r>
+      <w:r>
+        <w:rPr>
+          <w:lang w:val="da-DK"/>
+        </w:rPr>
+        <w:t xml:space="preserve"> terminalen</w:t>
+      </w:r>
+    </w:p>
+    <w:p>
+      <w:pPr>
+        <w:pStyle w:val="BodyText"/>
+        <w:rPr>
+          <w:lang w:val="da-DK"/>
+        </w:rPr>
+      </w:pPr>
+    </w:p>
+    <w:p>
+      <w:pPr>
+        <w:pStyle w:val="Heading"/>
+        <w:rPr>
+          <w:lang w:val="da-DK"/>
+        </w:rPr>
+      </w:pPr>
+      <w:r>
+        <w:rPr>
+          <w:lang w:val="da-DK"/>
+        </w:rPr>
+        <w:t>Q: union1</w:t>
+      </w:r>
+    </w:p>
+    <w:p>
+      <w:pPr>
+        <w:pStyle w:val="BodyText"/>
+        <w:rPr>
+          <w:lang w:val="da-DK"/>
+        </w:rPr>
+      </w:pPr>
+      <w:r>
+        <w:rPr>
+          <w:lang w:val="da-DK"/>
+        </w:rPr>
+        <w:t>Med udgangspunkt i union1.c, Svar på følgende spørgsmål:</w:t>
+      </w:r>
+    </w:p>
+    <w:p>
+      <w:pPr>
+        <w:pStyle w:val="BodyText"/>
+        <w:numPr>
+          <w:ilvl w:val="0"/>
+          <w:numId w:val="9"/>
+        </w:numPr>
+        <w:rPr>
+          <w:lang w:val="da-DK"/>
+        </w:rPr>
+      </w:pPr>
+      <w:r>
+        <w:rPr>
+          <w:lang w:val="da-DK"/>
+        </w:rPr>
+        <w:t>Hvorfor har data.i = 10 og data.f = -220.5 ikke nogen effekt på det udskrevne i printf?</w:t>
+      </w:r>
+    </w:p>
+    <w:p>
+      <w:pPr>
+        <w:pStyle w:val="BodyText"/>
+        <w:numPr>
+          <w:ilvl w:val="0"/>
+          <w:numId w:val="9"/>
+        </w:numPr>
+        <w:rPr>
+          <w:lang w:val="da-DK"/>
+        </w:rPr>
+      </w:pPr>
+      <w:r>
+        <w:rPr>
+          <w:lang w:val="da-DK"/>
+        </w:rPr>
+        <w:t>Forklar sammenhængen mellem data.i og data.str ?</w:t>
+      </w:r>
+      <w:r>
+        <w:rPr>
+          <w:lang w:val="da-DK"/>
+        </w:rPr>
+        <w:br/>
+        <w:t>(print eventuelt data.i som en hex-value)</w:t>
+      </w:r>
+    </w:p>
+    <w:p>
+      <w:pPr>
+        <w:pStyle w:val="BodyText"/>
+        <w:numPr>
+          <w:ilvl w:val="0"/>
+          <w:numId w:val="9"/>
+        </w:numPr>
+        <w:rPr>
+          <w:lang w:val="da-DK"/>
+        </w:rPr>
+      </w:pPr>
+      <w:r>
+        <w:rPr>
+          <w:lang w:val="da-DK"/>
+        </w:rPr>
+        <w:t>Hvor meget plads fylder denne union (hvad bestemmer det og hvorfor lige dette tal)?</w:t>
+      </w:r>
+    </w:p>
+    <w:p>
+      <w:pPr>
+        <w:pStyle w:val="BodyText"/>
+        <w:numPr>
+          <w:ilvl w:val="0"/>
+          <w:numId w:val="9"/>
+        </w:numPr>
+        <w:rPr>
+          <w:lang w:val="da-DK"/>
+        </w:rPr>
+      </w:pPr>
+      <w:r>
+        <w:rPr>
+          <w:lang w:val="da-DK"/>
+        </w:rPr>
+        <w:t>Hvorfor giver data.f ikke noget output?</w:t>
+      </w:r>
+    </w:p>
+    <w:p>
+      <w:pPr>
+        <w:pStyle w:val="BodyText"/>
+        <w:numPr>
+          <w:ilvl w:val="1"/>
+          <w:numId w:val="9"/>
+        </w:numPr>
+        <w:rPr>
+          <w:lang w:val="da-DK"/>
+        </w:rPr>
+      </w:pPr>
+      <w:r>
+        <w:rPr>
+          <w:lang w:val="da-DK"/>
+        </w:rPr>
+        <w:t>Hint: når man skriver "abc", hvad står der så på idx 3 (exponenten)?</w:t>
+      </w:r>
+    </w:p>
+    <w:p>
+      <w:pPr>
+        <w:pStyle w:val="BodyText"/>
+        <w:rPr>
+          <w:lang w:val="da-DK"/>
+        </w:rPr>
+      </w:pPr>
+    </w:p>
+    <w:p>
+      <w:pPr>
         <w:pStyle w:val="Title"/>
       </w:pPr>
       <w:r>
@@ -3780,21 +2425,7 @@
         <w:rPr>
           <w:lang w:val="da-DK"/>
         </w:rPr>
-        <w:t xml:space="preserve">Hvad er en </w:t>
-      </w:r>
-      <w:proofErr w:type="spellStart"/>
-      <w:r>
-        <w:rPr>
-          <w:lang w:val="da-DK"/>
-        </w:rPr>
-        <w:t>advanceret</w:t>
-      </w:r>
-      <w:proofErr w:type="spellEnd"/>
-      <w:r>
-        <w:rPr>
-          <w:lang w:val="da-DK"/>
-        </w:rPr>
-        <w:t xml:space="preserve"> datatype?</w:t>
+        <w:t>Hvad er en advanceret datatype?</w:t>
       </w:r>
     </w:p>
     <w:p>
@@ -3826,21 +2457,8 @@
         <w:tab/>
       </w:r>
       <w:r>
-        <w:t>burger-</w:t>
-      </w:r>
-      <w:proofErr w:type="spellStart"/>
-      <w:r>
-        <w:t>defineret</w:t>
-      </w:r>
-      <w:proofErr w:type="spellEnd"/>
-      <w:r>
-        <w:t xml:space="preserve"> </w:t>
-      </w:r>
-      <w:proofErr w:type="spellStart"/>
-      <w:r>
-        <w:t>egenskaber</w:t>
-      </w:r>
-      <w:proofErr w:type="spellEnd"/>
+        <w:t>burger-defineret egenskaber</w:t>
+      </w:r>
     </w:p>
     <w:p>
       <w:pPr>
@@ -3857,26 +2475,15 @@
         <w:rPr>
           <w:lang w:val="da-DK"/>
         </w:rPr>
-        <w:t xml:space="preserve">Har du set nogle </w:t>
-      </w:r>
-      <w:proofErr w:type="spellStart"/>
-      <w:r>
-        <w:rPr>
-          <w:lang w:val="da-DK"/>
-        </w:rPr>
-        <w:t>advancerede</w:t>
-      </w:r>
-      <w:proofErr w:type="spellEnd"/>
-      <w:r>
-        <w:rPr>
-          <w:lang w:val="da-DK"/>
-        </w:rPr>
-        <w:t xml:space="preserve"> datatyper allerede?</w:t>
-      </w:r>
-    </w:p>
-    <w:p>
-      <w:pPr>
-        <w:pStyle w:val="BodyText"/>
+        <w:t>Har du set nogle advancerede datatyper allerede?</w:t>
+      </w:r>
+    </w:p>
+    <w:p>
+      <w:pPr>
+        <w:pStyle w:val="BodyText"/>
+        <w:rPr>
+          <w:lang w:val="da-DK"/>
+        </w:rPr>
       </w:pPr>
       <w:r>
         <w:rPr>
@@ -3884,17 +2491,24 @@
         </w:rPr>
         <w:tab/>
       </w:r>
-      <w:proofErr w:type="spellStart"/>
-      <w:r>
+      <w:r>
+        <w:rPr>
+          <w:lang w:val="da-DK"/>
+        </w:rPr>
         <w:t>funktioner</w:t>
       </w:r>
-      <w:proofErr w:type="spellEnd"/>
-    </w:p>
-    <w:p>
-      <w:pPr>
-        <w:pStyle w:val="BodyText"/>
-      </w:pPr>
-      <w:r>
+    </w:p>
+    <w:p>
+      <w:pPr>
+        <w:pStyle w:val="BodyText"/>
+        <w:rPr>
+          <w:lang w:val="da-DK"/>
+        </w:rPr>
+      </w:pPr>
+      <w:r>
+        <w:rPr>
+          <w:lang w:val="da-DK"/>
+        </w:rPr>
         <w:tab/>
         <w:t>arrays</w:t>
       </w:r>
@@ -3902,8 +2516,14 @@
     <w:p>
       <w:pPr>
         <w:pStyle w:val="BodyText"/>
-      </w:pPr>
-      <w:r>
+        <w:rPr>
+          <w:lang w:val="da-DK"/>
+        </w:rPr>
+      </w:pPr>
+      <w:r>
+        <w:rPr>
+          <w:lang w:val="da-DK"/>
+        </w:rPr>
         <w:tab/>
         <w:t>pointers</w:t>
       </w:r>
@@ -3911,24 +2531,42 @@
     <w:p>
       <w:pPr>
         <w:pStyle w:val="BodyText"/>
-      </w:pPr>
-      <w:r>
+        <w:rPr>
+          <w:lang w:val="da-DK"/>
+        </w:rPr>
+      </w:pPr>
+      <w:r>
+        <w:rPr>
+          <w:lang w:val="da-DK"/>
+        </w:rPr>
         <w:tab/>
       </w:r>
     </w:p>
     <w:p>
       <w:pPr>
         <w:pStyle w:val="Heading"/>
-      </w:pPr>
-      <w:r>
+        <w:rPr>
+          <w:lang w:val="da-DK"/>
+        </w:rPr>
+      </w:pPr>
+      <w:r>
+        <w:rPr>
+          <w:lang w:val="da-DK"/>
+        </w:rPr>
         <w:t>A: patient1</w:t>
       </w:r>
     </w:p>
     <w:p>
       <w:pPr>
         <w:pStyle w:val="BodyText"/>
-      </w:pPr>
-      <w:r>
+        <w:rPr>
+          <w:lang w:val="da-DK"/>
+        </w:rPr>
+      </w:pPr>
+      <w:r>
+        <w:rPr>
+          <w:lang w:val="da-DK"/>
+        </w:rPr>
         <w:t>Se patient1_sol.c</w:t>
       </w:r>
     </w:p>
@@ -3943,22 +2581,8 @@
         <w:rPr>
           <w:lang w:val="da-DK"/>
         </w:rPr>
-        <w:t>A</w:t>
-      </w:r>
-      <w:r>
-        <w:rPr>
-          <w:lang w:val="da-DK"/>
-        </w:rPr>
-        <w:t xml:space="preserve">: Opret en simpel Sensor </w:t>
-      </w:r>
-      <w:proofErr w:type="spellStart"/>
-      <w:r>
-        <w:rPr>
-          <w:lang w:val="da-DK"/>
-        </w:rPr>
-        <w:t>Structur</w:t>
-      </w:r>
-      <w:proofErr w:type="spellEnd"/>
+        <w:t>A: Opret en simpel Sensor Structur</w:t>
+      </w:r>
     </w:p>
     <w:p>
       <w:pPr>
@@ -3971,35 +2595,7 @@
         <w:rPr>
           <w:lang w:val="da-DK" w:bidi="ar-SA"/>
         </w:rPr>
-        <w:t xml:space="preserve">I mange biomedicinske systemer skal man håndtere og strukturere patientdata. I denne opgave skal du skrive et program, </w:t>
-      </w:r>
-      <w:proofErr w:type="spellStart"/>
-      <w:r>
-        <w:rPr>
-          <w:lang w:val="da-DK" w:bidi="ar-SA"/>
-        </w:rPr>
-        <w:t>sensorstruct</w:t>
-      </w:r>
-      <w:proofErr w:type="spellEnd"/>
-      <w:r>
-        <w:rPr>
-          <w:lang w:val="da-DK" w:bidi="ar-SA"/>
-        </w:rPr>
-        <w:t xml:space="preserve">, som indeholder en simpel </w:t>
-      </w:r>
-      <w:proofErr w:type="spellStart"/>
-      <w:r>
-        <w:rPr>
-          <w:lang w:val="da-DK" w:bidi="ar-SA"/>
-        </w:rPr>
-        <w:t>struct</w:t>
-      </w:r>
-      <w:proofErr w:type="spellEnd"/>
-      <w:r>
-        <w:rPr>
-          <w:lang w:val="da-DK" w:bidi="ar-SA"/>
-        </w:rPr>
-        <w:t xml:space="preserve">, der kan holde information om en sensor, der kan indlæse og vise disse data. </w:t>
+        <w:t xml:space="preserve">I mange biomedicinske systemer skal man håndtere og strukturere patientdata. I denne opgave skal du skrive et program, sensorstruct, som indeholder en simpel struct, der kan holde information om en sensor, der kan indlæse og vise disse data. </w:t>
       </w:r>
     </w:p>
     <w:p>
@@ -4017,35 +2613,7 @@
         <w:rPr>
           <w:lang w:val="da-DK"/>
         </w:rPr>
-        <w:t xml:space="preserve">Definér en </w:t>
-      </w:r>
-      <w:proofErr w:type="spellStart"/>
-      <w:r>
-        <w:rPr>
-          <w:lang w:val="da-DK"/>
-        </w:rPr>
-        <w:t>struct</w:t>
-      </w:r>
-      <w:proofErr w:type="spellEnd"/>
-      <w:r>
-        <w:rPr>
-          <w:lang w:val="da-DK"/>
-        </w:rPr>
-        <w:t xml:space="preserve"> kaldet </w:t>
-      </w:r>
-      <w:proofErr w:type="spellStart"/>
-      <w:r>
-        <w:rPr>
-          <w:lang w:val="da-DK"/>
-        </w:rPr>
-        <w:t>TempSensor</w:t>
-      </w:r>
-      <w:proofErr w:type="spellEnd"/>
-      <w:r>
-        <w:rPr>
-          <w:lang w:val="da-DK"/>
-        </w:rPr>
-        <w:t>, som indeholder:</w:t>
+        <w:t>Definér en struct kaldet TempSensor, som indeholder:</w:t>
       </w:r>
     </w:p>
     <w:p>
@@ -4059,19 +2627,11 @@
           <w:lang w:val="da-DK"/>
         </w:rPr>
       </w:pPr>
-      <w:proofErr w:type="spellStart"/>
-      <w:r>
-        <w:rPr>
-          <w:lang w:val="da-DK"/>
-        </w:rPr>
-        <w:t>int</w:t>
-      </w:r>
-      <w:proofErr w:type="spellEnd"/>
-      <w:r>
-        <w:rPr>
-          <w:lang w:val="da-DK"/>
-        </w:rPr>
-        <w:t xml:space="preserve"> id – sensorens ID</w:t>
+      <w:r>
+        <w:rPr>
+          <w:lang w:val="da-DK"/>
+        </w:rPr>
+        <w:t>int id – sensorens ID</w:t>
       </w:r>
     </w:p>
     <w:p>
@@ -4085,33 +2645,11 @@
           <w:lang w:val="da-DK"/>
         </w:rPr>
       </w:pPr>
-      <w:proofErr w:type="spellStart"/>
-      <w:r>
-        <w:rPr>
-          <w:lang w:val="da-DK"/>
-        </w:rPr>
-        <w:t>float</w:t>
-      </w:r>
-      <w:proofErr w:type="spellEnd"/>
-      <w:r>
-        <w:rPr>
-          <w:lang w:val="da-DK"/>
-        </w:rPr>
-        <w:t xml:space="preserve"> </w:t>
-      </w:r>
-      <w:proofErr w:type="spellStart"/>
-      <w:r>
-        <w:rPr>
-          <w:lang w:val="da-DK"/>
-        </w:rPr>
-        <w:t>temperature</w:t>
-      </w:r>
-      <w:proofErr w:type="spellEnd"/>
-      <w:r>
-        <w:rPr>
-          <w:lang w:val="da-DK"/>
-        </w:rPr>
-        <w:t xml:space="preserve"> – målt temperatur i grader Celsius</w:t>
+      <w:r>
+        <w:rPr>
+          <w:lang w:val="da-DK"/>
+        </w:rPr>
+        <w:t>float temperature – målt temperatur i grader Celsius</w:t>
       </w:r>
     </w:p>
     <w:p>
@@ -4129,21 +2667,8 @@
         <w:rPr>
           <w:lang w:val="da-DK"/>
         </w:rPr>
-        <w:t xml:space="preserve">I </w:t>
-      </w:r>
-      <w:proofErr w:type="spellStart"/>
-      <w:r>
-        <w:rPr>
-          <w:lang w:val="da-DK"/>
-        </w:rPr>
-        <w:t>main</w:t>
-      </w:r>
-      <w:proofErr w:type="spellEnd"/>
-      <w:r>
-        <w:rPr>
-          <w:lang w:val="da-DK"/>
-        </w:rPr>
-        <w:t>():</w:t>
+        <w:lastRenderedPageBreak/>
+        <w:t>I main():</w:t>
       </w:r>
     </w:p>
     <w:p>
@@ -4161,17 +2686,8 @@
         <w:rPr>
           <w:lang w:val="da-DK"/>
         </w:rPr>
-        <w:lastRenderedPageBreak/>
-        <w:t xml:space="preserve">Opret én variabel 'sensor' af typen </w:t>
-      </w:r>
-      <w:proofErr w:type="spellStart"/>
-      <w:r>
-        <w:rPr>
-          <w:lang w:val="da-DK"/>
-        </w:rPr>
-        <w:t>TempSensor</w:t>
-      </w:r>
-      <w:proofErr w:type="spellEnd"/>
+        <w:t>Opret én variabel 'sensor' af typen TempSensor</w:t>
+      </w:r>
     </w:p>
     <w:p>
       <w:pPr>
@@ -4227,15 +2743,113 @@
     <w:p>
       <w:pPr>
         <w:pStyle w:val="Heading"/>
-      </w:pPr>
-      <w:r>
+        <w:rPr>
+          <w:lang w:val="da-DK"/>
+        </w:rPr>
+      </w:pPr>
+      <w:r>
+        <w:rPr>
+          <w:lang w:val="da-DK"/>
+        </w:rPr>
         <w:t xml:space="preserve">A: </w:t>
       </w:r>
-      <w:proofErr w:type="spellStart"/>
-      <w:r>
-        <w:t>example_timemodule</w:t>
-      </w:r>
-      <w:proofErr w:type="spellEnd"/>
+      <w:r>
+        <w:rPr>
+          <w:lang w:val="da-DK"/>
+        </w:rPr>
+        <w:t>esp32_enumerate</w:t>
+      </w:r>
+    </w:p>
+    <w:p>
+      <w:pPr>
+        <w:pStyle w:val="BodyText"/>
+      </w:pPr>
+      <w:r>
+        <w:t xml:space="preserve">Se </w:t>
+      </w:r>
+      <w:r>
+        <w:t>esp32_enumerate.ino</w:t>
+      </w:r>
+    </w:p>
+    <w:p>
+      <w:pPr>
+        <w:pStyle w:val="Heading"/>
+      </w:pPr>
+      <w:r>
+        <w:t xml:space="preserve">A: </w:t>
+      </w:r>
+      <w:r>
+        <w:t>patient2</w:t>
+      </w:r>
+    </w:p>
+    <w:p>
+      <w:pPr>
+        <w:pStyle w:val="BodyText"/>
+      </w:pPr>
+      <w:r>
+        <w:t xml:space="preserve">Se  </w:t>
+      </w:r>
+      <w:r>
+        <w:t>patient2_sol.c</w:t>
+      </w:r>
+    </w:p>
+    <w:p>
+      <w:pPr>
+        <w:pStyle w:val="Heading"/>
+      </w:pPr>
+      <w:r>
+        <w:t xml:space="preserve">A: </w:t>
+      </w:r>
+      <w:r>
+        <w:t>patient3</w:t>
+      </w:r>
+    </w:p>
+    <w:p>
+      <w:pPr>
+        <w:pStyle w:val="BodyText"/>
+      </w:pPr>
+      <w:r>
+        <w:t xml:space="preserve">Se  </w:t>
+      </w:r>
+      <w:r>
+        <w:t>patient</w:t>
+      </w:r>
+      <w:r>
+        <w:t>3</w:t>
+      </w:r>
+      <w:r>
+        <w:t>_sol.c</w:t>
+      </w:r>
+    </w:p>
+    <w:p>
+      <w:pPr>
+        <w:pStyle w:val="Heading"/>
+      </w:pPr>
+      <w:r>
+        <w:t xml:space="preserve">A: </w:t>
+      </w:r>
+      <w:r>
+        <w:t>patient4</w:t>
+      </w:r>
+    </w:p>
+    <w:p>
+      <w:pPr>
+        <w:pStyle w:val="BodyText"/>
+      </w:pPr>
+      <w:r>
+        <w:t xml:space="preserve">Se </w:t>
+      </w:r>
+      <w:r>
+        <w:t>patient1to4_sol.c</w:t>
+      </w:r>
+    </w:p>
+    <w:p>
+      <w:pPr>
+        <w:pStyle w:val="Heading"/>
+      </w:pPr>
+      <w:r>
+        <w:t>A: example_timemodule</w:t>
+      </w:r>
     </w:p>
     <w:p>
       <w:pPr>
@@ -4266,35 +2880,7 @@
         <w:rPr>
           <w:lang w:val="da-DK"/>
         </w:rPr>
-        <w:t xml:space="preserve">Hvor mange bytes fylder </w:t>
-      </w:r>
-      <w:proofErr w:type="spellStart"/>
-      <w:r>
-        <w:rPr>
-          <w:lang w:val="da-DK"/>
-        </w:rPr>
-        <w:t>struct</w:t>
-      </w:r>
-      <w:proofErr w:type="spellEnd"/>
-      <w:r>
-        <w:rPr>
-          <w:lang w:val="da-DK"/>
-        </w:rPr>
-        <w:t xml:space="preserve"> </w:t>
-      </w:r>
-      <w:proofErr w:type="spellStart"/>
-      <w:r>
-        <w:rPr>
-          <w:lang w:val="da-DK"/>
-        </w:rPr>
-        <w:t>tm</w:t>
-      </w:r>
-      <w:proofErr w:type="spellEnd"/>
-      <w:r>
-        <w:rPr>
-          <w:lang w:val="da-DK"/>
-        </w:rPr>
-        <w:t>?</w:t>
+        <w:t>Hvor mange bytes fylder struct tm?</w:t>
       </w:r>
       <w:r>
         <w:rPr>
@@ -4302,74 +2888,41 @@
           <w:bCs/>
           <w:lang w:val="da-DK"/>
         </w:rPr>
-        <w:t xml:space="preserve">- 36byte (9 </w:t>
-      </w:r>
-      <w:proofErr w:type="spellStart"/>
+        <w:t>- 36byte (9 integers)</w:t>
+      </w:r>
+    </w:p>
+    <w:p>
+      <w:pPr>
+        <w:pStyle w:val="BodyText"/>
+        <w:numPr>
+          <w:ilvl w:val="0"/>
+          <w:numId w:val="8"/>
+        </w:numPr>
+        <w:rPr>
+          <w:lang w:val="da-DK"/>
+        </w:rPr>
+      </w:pPr>
+      <w:r>
+        <w:rPr>
+          <w:lang w:val="da-DK"/>
+        </w:rPr>
+        <w:t xml:space="preserve">Hvornår startede tidstælleren time_t? </w:t>
+      </w:r>
       <w:r>
         <w:rPr>
           <w:b/>
           <w:bCs/>
           <w:lang w:val="da-DK"/>
         </w:rPr>
-        <w:t>integers</w:t>
-      </w:r>
-      <w:proofErr w:type="spellEnd"/>
+        <w:t xml:space="preserve">- </w:t>
+      </w:r>
       <w:r>
         <w:rPr>
           <w:b/>
           <w:bCs/>
-          <w:lang w:val="da-DK"/>
-        </w:rPr>
-        <w:t>)</w:t>
-      </w:r>
-    </w:p>
-    <w:p>
-      <w:pPr>
-        <w:pStyle w:val="BodyText"/>
-        <w:numPr>
-          <w:ilvl w:val="0"/>
-          <w:numId w:val="8"/>
-        </w:numPr>
-        <w:rPr>
-          <w:lang w:val="da-DK"/>
-        </w:rPr>
-      </w:pPr>
-      <w:r>
-        <w:rPr>
-          <w:lang w:val="da-DK"/>
-        </w:rPr>
-        <w:t xml:space="preserve">Hvornår startede tidstælleren </w:t>
-      </w:r>
-      <w:proofErr w:type="spellStart"/>
-      <w:r>
-        <w:rPr>
-          <w:lang w:val="da-DK"/>
-        </w:rPr>
-        <w:t>time_t</w:t>
-      </w:r>
-      <w:proofErr w:type="spellEnd"/>
-      <w:r>
-        <w:rPr>
-          <w:lang w:val="da-DK"/>
-        </w:rPr>
-        <w:t xml:space="preserve">? </w:t>
-      </w:r>
-      <w:r>
-        <w:rPr>
-          <w:b/>
-          <w:bCs/>
-          <w:lang w:val="da-DK"/>
-        </w:rPr>
-        <w:t xml:space="preserve">- </w:t>
-      </w:r>
-      <w:r>
-        <w:rPr>
-          <w:b/>
-          <w:bCs/>
         </w:rPr>
         <w:t xml:space="preserve">00:00 hours, Jan 1, 1970 UTC (i.e., a </w:t>
       </w:r>
-      <w:proofErr w:type="spellStart"/>
       <w:r>
         <w:rPr>
           <w:b/>
@@ -4377,56 +2930,74 @@
           <w:i/>
           <w:iCs/>
         </w:rPr>
-        <w:t>unix</w:t>
-      </w:r>
-      <w:proofErr w:type="spellEnd"/>
+        <w:t>unix timestamp</w:t>
+      </w:r>
       <w:r>
         <w:rPr>
           <w:b/>
           <w:bCs/>
-          <w:i/>
-          <w:iCs/>
-        </w:rPr>
-        <w:t xml:space="preserve"> timestamp</w:t>
+        </w:rPr>
+        <w:t>)</w:t>
+      </w:r>
+    </w:p>
+    <w:p>
+      <w:pPr>
+        <w:pStyle w:val="BodyText"/>
+        <w:numPr>
+          <w:ilvl w:val="1"/>
+          <w:numId w:val="8"/>
+        </w:numPr>
+        <w:rPr>
+          <w:lang w:val="da-DK"/>
+        </w:rPr>
+      </w:pPr>
+      <w:r>
+        <w:rPr>
+          <w:lang w:val="da-DK"/>
+        </w:rPr>
+        <w:t xml:space="preserve">Hvad gør funktionen ctime? – </w:t>
       </w:r>
       <w:r>
         <w:rPr>
           <w:b/>
           <w:bCs/>
-        </w:rPr>
-        <w:t>)</w:t>
-      </w:r>
-    </w:p>
-    <w:p>
-      <w:pPr>
-        <w:pStyle w:val="BodyText"/>
-        <w:numPr>
-          <w:ilvl w:val="1"/>
-          <w:numId w:val="8"/>
-        </w:numPr>
-        <w:rPr>
-          <w:lang w:val="da-DK"/>
-        </w:rPr>
-      </w:pPr>
-      <w:r>
-        <w:rPr>
-          <w:lang w:val="da-DK"/>
-        </w:rPr>
-        <w:t xml:space="preserve">Hvad gør funktionen </w:t>
-      </w:r>
-      <w:proofErr w:type="spellStart"/>
-      <w:r>
-        <w:rPr>
-          <w:lang w:val="da-DK"/>
-        </w:rPr>
-        <w:t>ctime</w:t>
-      </w:r>
-      <w:proofErr w:type="spellEnd"/>
-      <w:r>
-        <w:rPr>
-          <w:lang w:val="da-DK"/>
-        </w:rPr>
-        <w:t xml:space="preserve">? – </w:t>
+          <w:lang w:val="da-DK"/>
+        </w:rPr>
+        <w:t>en læsbar string for datoen, som er representeret af time_t</w:t>
+      </w:r>
+    </w:p>
+    <w:p>
+      <w:pPr>
+        <w:pStyle w:val="BodyText"/>
+      </w:pPr>
+      <w:r>
+        <w:t>File: example_timemodule.c</w:t>
+      </w:r>
+    </w:p>
+    <w:p>
+      <w:pPr>
+        <w:pStyle w:val="Heading"/>
+      </w:pPr>
+      <w:r>
+        <w:t>A: union1</w:t>
+      </w:r>
+    </w:p>
+    <w:p>
+      <w:pPr>
+        <w:pStyle w:val="BodyText"/>
+        <w:numPr>
+          <w:ilvl w:val="0"/>
+          <w:numId w:val="10"/>
+        </w:numPr>
+        <w:rPr>
+          <w:lang w:val="da-DK"/>
+        </w:rPr>
+      </w:pPr>
+      <w:r>
+        <w:rPr>
+          <w:lang w:val="da-DK"/>
+        </w:rPr>
+        <w:t xml:space="preserve">Hvorfor har data.i = 10 og data.f = -220.5 ikke nogen effekt på det udskrevne? </w:t>
       </w:r>
       <w:r>
         <w:rPr>
@@ -4434,440 +3005,101 @@
           <w:bCs/>
           <w:lang w:val="da-DK"/>
         </w:rPr>
-        <w:t xml:space="preserve">en læsbar </w:t>
-      </w:r>
-      <w:proofErr w:type="spellStart"/>
+        <w:t>– hvad er en Union?</w:t>
+      </w:r>
       <w:r>
         <w:rPr>
           <w:b/>
           <w:bCs/>
           <w:lang w:val="da-DK"/>
         </w:rPr>
-        <w:t>string</w:t>
-      </w:r>
-      <w:proofErr w:type="spellEnd"/>
+        <w:t xml:space="preserve"> Den gør at man kan gemme alle datatyper på samme hukommelse. MEN! Man kan kun gemme 1 ting af gangen. Ellers bliver hukommelsen overskrevet.</w:t>
+      </w:r>
+    </w:p>
+    <w:p>
+      <w:pPr>
+        <w:pStyle w:val="BodyText"/>
+        <w:numPr>
+          <w:ilvl w:val="0"/>
+          <w:numId w:val="10"/>
+        </w:numPr>
+        <w:rPr>
+          <w:lang w:val="da-DK"/>
+        </w:rPr>
+      </w:pPr>
+      <w:r>
+        <w:rPr>
+          <w:lang w:val="da-DK"/>
+        </w:rPr>
+        <w:t>Forklar sammenhængen mellem data.i og data.str ?</w:t>
+      </w:r>
+      <w:r>
+        <w:rPr>
+          <w:lang w:val="da-DK"/>
+        </w:rPr>
+        <w:br/>
+        <w:t xml:space="preserve">(print eventuelt data.i som en hex-value) </w:t>
+      </w:r>
       <w:r>
         <w:rPr>
           <w:b/>
           <w:bCs/>
           <w:lang w:val="da-DK"/>
         </w:rPr>
-        <w:t xml:space="preserve"> for datoen, som er </w:t>
-      </w:r>
-      <w:proofErr w:type="spellStart"/>
+        <w:t>– Samme som bytearray</w:t>
+      </w:r>
+    </w:p>
+    <w:p>
+      <w:pPr>
+        <w:pStyle w:val="BodyText"/>
+        <w:numPr>
+          <w:ilvl w:val="0"/>
+          <w:numId w:val="10"/>
+        </w:numPr>
+        <w:rPr>
+          <w:lang w:val="da-DK"/>
+        </w:rPr>
+      </w:pPr>
+      <w:r>
+        <w:rPr>
+          <w:lang w:val="da-DK"/>
+        </w:rPr>
+        <w:t xml:space="preserve">Hvor meget plads fylder denne union (hvad bestemmer det og hvorfor lige dette tal)? – </w:t>
+      </w:r>
       <w:r>
         <w:rPr>
           <w:b/>
           <w:bCs/>
           <w:lang w:val="da-DK"/>
         </w:rPr>
-        <w:t>representeret</w:t>
-      </w:r>
-      <w:proofErr w:type="spellEnd"/>
+        <w:t>4 byte (int)</w:t>
+      </w:r>
+    </w:p>
+    <w:p>
+      <w:pPr>
+        <w:pStyle w:val="BodyText"/>
+        <w:numPr>
+          <w:ilvl w:val="0"/>
+          <w:numId w:val="10"/>
+        </w:numPr>
+        <w:rPr>
+          <w:lang w:val="da-DK"/>
+        </w:rPr>
+      </w:pPr>
+      <w:r>
+        <w:rPr>
+          <w:lang w:val="da-DK"/>
+        </w:rPr>
+        <w:lastRenderedPageBreak/>
+        <w:t xml:space="preserve">Hvorfor giver data.f ikke noget output? (0). </w:t>
+      </w:r>
       <w:r>
         <w:rPr>
           <w:b/>
           <w:bCs/>
           <w:lang w:val="da-DK"/>
         </w:rPr>
-        <w:t xml:space="preserve"> af </w:t>
-      </w:r>
-      <w:proofErr w:type="spellStart"/>
-      <w:r>
-        <w:rPr>
-          <w:b/>
-          <w:bCs/>
-          <w:lang w:val="da-DK"/>
-        </w:rPr>
-        <w:t>time_t</w:t>
-      </w:r>
-      <w:proofErr w:type="spellEnd"/>
-    </w:p>
-    <w:p>
-      <w:pPr>
-        <w:pStyle w:val="BodyText"/>
-      </w:pPr>
-      <w:r>
-        <w:t xml:space="preserve">File: </w:t>
-      </w:r>
-      <w:proofErr w:type="spellStart"/>
-      <w:r>
-        <w:t>example_timemodule.c</w:t>
-      </w:r>
-      <w:proofErr w:type="spellEnd"/>
-    </w:p>
-    <w:p>
-      <w:pPr>
-        <w:pStyle w:val="Heading"/>
-      </w:pPr>
-      <w:r>
-        <w:t>A: union1</w:t>
-      </w:r>
-    </w:p>
-    <w:p>
-      <w:pPr>
-        <w:pStyle w:val="BodyText"/>
-        <w:numPr>
-          <w:ilvl w:val="0"/>
-          <w:numId w:val="10"/>
-        </w:numPr>
-        <w:rPr>
-          <w:lang w:val="da-DK"/>
-        </w:rPr>
-      </w:pPr>
-      <w:r>
-        <w:rPr>
-          <w:lang w:val="da-DK"/>
-        </w:rPr>
-        <w:t xml:space="preserve">Hvorfor har </w:t>
-      </w:r>
-      <w:proofErr w:type="spellStart"/>
-      <w:r>
-        <w:rPr>
-          <w:lang w:val="da-DK"/>
-        </w:rPr>
-        <w:t>data.i</w:t>
-      </w:r>
-      <w:proofErr w:type="spellEnd"/>
-      <w:r>
-        <w:rPr>
-          <w:lang w:val="da-DK"/>
-        </w:rPr>
-        <w:t xml:space="preserve"> = 10 og </w:t>
-      </w:r>
-      <w:proofErr w:type="spellStart"/>
-      <w:r>
-        <w:rPr>
-          <w:lang w:val="da-DK"/>
-        </w:rPr>
-        <w:t>data.f</w:t>
-      </w:r>
-      <w:proofErr w:type="spellEnd"/>
-      <w:r>
-        <w:rPr>
-          <w:lang w:val="da-DK"/>
-        </w:rPr>
-        <w:t xml:space="preserve"> = -220.5 ikke nogen effekt på det udskrevne? </w:t>
-      </w:r>
-      <w:r>
-        <w:rPr>
-          <w:b/>
-          <w:bCs/>
-          <w:lang w:val="da-DK"/>
-        </w:rPr>
-        <w:t>– hvad er en Union?</w:t>
-      </w:r>
-      <w:r>
-        <w:rPr>
-          <w:b/>
-          <w:bCs/>
-          <w:lang w:val="da-DK"/>
-        </w:rPr>
-        <w:t xml:space="preserve"> Den gør at man kan gemme alle datatyper på samme hukommelse. MEN! Man kan kun gemme 1 ting af gangen. Ellers bliver hukommelsen overskrevet.</w:t>
-      </w:r>
-    </w:p>
-    <w:p>
-      <w:pPr>
-        <w:pStyle w:val="BodyText"/>
-        <w:numPr>
-          <w:ilvl w:val="0"/>
-          <w:numId w:val="10"/>
-        </w:numPr>
-        <w:rPr>
-          <w:lang w:val="da-DK"/>
-        </w:rPr>
-      </w:pPr>
-      <w:r>
-        <w:rPr>
-          <w:lang w:val="da-DK"/>
-        </w:rPr>
-        <w:t xml:space="preserve">Forklar sammenhængen mellem </w:t>
-      </w:r>
-      <w:proofErr w:type="spellStart"/>
-      <w:r>
-        <w:rPr>
-          <w:lang w:val="da-DK"/>
-        </w:rPr>
-        <w:t>data.i</w:t>
-      </w:r>
-      <w:proofErr w:type="spellEnd"/>
-      <w:r>
-        <w:rPr>
-          <w:lang w:val="da-DK"/>
-        </w:rPr>
-        <w:t xml:space="preserve"> og </w:t>
-      </w:r>
-      <w:proofErr w:type="spellStart"/>
-      <w:r>
-        <w:rPr>
-          <w:lang w:val="da-DK"/>
-        </w:rPr>
-        <w:t>data.str</w:t>
-      </w:r>
-      <w:proofErr w:type="spellEnd"/>
-      <w:r>
-        <w:rPr>
-          <w:lang w:val="da-DK"/>
-        </w:rPr>
-        <w:t xml:space="preserve"> ?</w:t>
-      </w:r>
-      <w:r>
-        <w:rPr>
-          <w:lang w:val="da-DK"/>
-        </w:rPr>
-        <w:br/>
-        <w:t xml:space="preserve">(print eventuelt </w:t>
-      </w:r>
-      <w:proofErr w:type="spellStart"/>
-      <w:r>
-        <w:rPr>
-          <w:lang w:val="da-DK"/>
-        </w:rPr>
-        <w:t>data.i</w:t>
-      </w:r>
-      <w:proofErr w:type="spellEnd"/>
-      <w:r>
-        <w:rPr>
-          <w:lang w:val="da-DK"/>
-        </w:rPr>
-        <w:t xml:space="preserve"> som en </w:t>
-      </w:r>
-      <w:proofErr w:type="spellStart"/>
-      <w:r>
-        <w:rPr>
-          <w:lang w:val="da-DK"/>
-        </w:rPr>
-        <w:t>hex-value</w:t>
-      </w:r>
-      <w:proofErr w:type="spellEnd"/>
-      <w:r>
-        <w:rPr>
-          <w:lang w:val="da-DK"/>
-        </w:rPr>
-        <w:t xml:space="preserve">) </w:t>
-      </w:r>
-      <w:r>
-        <w:rPr>
-          <w:b/>
-          <w:bCs/>
-          <w:lang w:val="da-DK"/>
-        </w:rPr>
-        <w:t>– Samme som bytearray</w:t>
-      </w:r>
-    </w:p>
-    <w:p>
-      <w:pPr>
-        <w:pStyle w:val="BodyText"/>
-        <w:numPr>
-          <w:ilvl w:val="0"/>
-          <w:numId w:val="10"/>
-        </w:numPr>
-        <w:rPr>
-          <w:lang w:val="da-DK"/>
-        </w:rPr>
-      </w:pPr>
-      <w:r>
-        <w:rPr>
-          <w:lang w:val="da-DK"/>
-        </w:rPr>
-        <w:t xml:space="preserve">Hvor meget plads fylder denne union (hvad bestemmer det og hvorfor lige dette tal)? – </w:t>
-      </w:r>
-      <w:r>
-        <w:rPr>
-          <w:b/>
-          <w:bCs/>
-          <w:lang w:val="da-DK"/>
-        </w:rPr>
-        <w:t>4 byte (</w:t>
-      </w:r>
-      <w:proofErr w:type="spellStart"/>
-      <w:r>
-        <w:rPr>
-          <w:b/>
-          <w:bCs/>
-          <w:lang w:val="da-DK"/>
-        </w:rPr>
-        <w:t>int</w:t>
-      </w:r>
-      <w:proofErr w:type="spellEnd"/>
-      <w:r>
-        <w:rPr>
-          <w:b/>
-          <w:bCs/>
-          <w:lang w:val="da-DK"/>
-        </w:rPr>
-        <w:t>)</w:t>
-      </w:r>
-    </w:p>
-    <w:p>
-      <w:pPr>
-        <w:pStyle w:val="BodyText"/>
-        <w:numPr>
-          <w:ilvl w:val="0"/>
-          <w:numId w:val="10"/>
-        </w:numPr>
-        <w:rPr>
-          <w:lang w:val="da-DK"/>
-        </w:rPr>
-      </w:pPr>
-      <w:r>
-        <w:rPr>
-          <w:lang w:val="da-DK"/>
-        </w:rPr>
-        <w:t xml:space="preserve">Hvorfor giver </w:t>
-      </w:r>
-      <w:proofErr w:type="spellStart"/>
-      <w:r>
-        <w:rPr>
-          <w:lang w:val="da-DK"/>
-        </w:rPr>
-        <w:t>data.f</w:t>
-      </w:r>
-      <w:proofErr w:type="spellEnd"/>
-      <w:r>
-        <w:rPr>
-          <w:lang w:val="da-DK"/>
-        </w:rPr>
-        <w:t xml:space="preserve"> ikke noget output? (0). </w:t>
-      </w:r>
-      <w:r>
-        <w:rPr>
-          <w:b/>
-          <w:bCs/>
-          <w:lang w:val="da-DK"/>
-        </w:rPr>
-        <w:t xml:space="preserve">– </w:t>
-      </w:r>
-      <w:proofErr w:type="spellStart"/>
-      <w:r>
-        <w:rPr>
-          <w:b/>
-          <w:bCs/>
-          <w:lang w:val="da-DK"/>
-        </w:rPr>
-        <w:t>data.byte_array</w:t>
-      </w:r>
-      <w:proofErr w:type="spellEnd"/>
-      <w:r>
-        <w:rPr>
-          <w:b/>
-          <w:bCs/>
-          <w:lang w:val="da-DK"/>
-        </w:rPr>
-        <w:t xml:space="preserve">[3] is </w:t>
-      </w:r>
-      <w:proofErr w:type="spellStart"/>
-      <w:r>
-        <w:rPr>
-          <w:b/>
-          <w:bCs/>
-          <w:lang w:val="da-DK"/>
-        </w:rPr>
-        <w:t>exponent</w:t>
-      </w:r>
-      <w:proofErr w:type="spellEnd"/>
-    </w:p>
-    <w:p>
-      <w:pPr>
-        <w:pStyle w:val="Heading"/>
-        <w:rPr>
-          <w:lang w:val="da-DK"/>
-        </w:rPr>
-      </w:pPr>
-      <w:r>
-        <w:rPr>
-          <w:lang w:val="da-DK"/>
-        </w:rPr>
-        <w:t xml:space="preserve">A: </w:t>
-      </w:r>
-      <w:r>
-        <w:rPr>
-          <w:lang w:val="da-DK"/>
-        </w:rPr>
-        <w:t>esp32_enumerate</w:t>
-      </w:r>
-    </w:p>
-    <w:p>
-      <w:pPr>
-        <w:pStyle w:val="BodyText"/>
-      </w:pPr>
-      <w:r>
-        <w:t xml:space="preserve">Se </w:t>
-      </w:r>
-      <w:r>
-        <w:t>esp32_enumerate.ino</w:t>
-      </w:r>
-    </w:p>
-    <w:p>
-      <w:pPr>
-        <w:pStyle w:val="Heading"/>
-      </w:pPr>
-      <w:r>
-        <w:t xml:space="preserve">A: </w:t>
-      </w:r>
-      <w:r>
-        <w:t>patient2</w:t>
-      </w:r>
-    </w:p>
-    <w:p>
-      <w:pPr>
-        <w:pStyle w:val="BodyText"/>
-      </w:pPr>
-      <w:r>
-        <w:t xml:space="preserve">Se  </w:t>
-      </w:r>
-      <w:r>
-        <w:t>patient2_sol.c</w:t>
-      </w:r>
-    </w:p>
-    <w:p>
-      <w:pPr>
-        <w:pStyle w:val="Heading"/>
-      </w:pPr>
-      <w:r>
-        <w:t xml:space="preserve">A: </w:t>
-      </w:r>
-      <w:r>
-        <w:t>patient3</w:t>
-      </w:r>
-    </w:p>
-    <w:p>
-      <w:pPr>
-        <w:pStyle w:val="BodyText"/>
-      </w:pPr>
-      <w:r>
-        <w:t xml:space="preserve">Se  </w:t>
-      </w:r>
-      <w:r>
-        <w:t>patient</w:t>
-      </w:r>
-      <w:r>
-        <w:t>3</w:t>
-      </w:r>
-      <w:r>
-        <w:t>_sol.c</w:t>
-      </w:r>
-    </w:p>
-    <w:p>
-      <w:pPr>
-        <w:pStyle w:val="Heading"/>
-      </w:pPr>
-      <w:r>
-        <w:t xml:space="preserve">A: </w:t>
-      </w:r>
-      <w:r>
-        <w:t>patient4</w:t>
-      </w:r>
-    </w:p>
-    <w:p>
-      <w:pPr>
-        <w:pStyle w:val="BodyText"/>
-      </w:pPr>
-      <w:r>
-        <w:t xml:space="preserve">Se </w:t>
-      </w:r>
-      <w:r>
-        <w:t>patient1to4_sol.c</w:t>
+        <w:t>– data.byte_array[3] is exponent</w:t>
       </w:r>
     </w:p>
     <w:p>
@@ -7432,6 +5664,7 @@
   <w:style w:type="character" w:default="1" w:styleId="DefaultParagraphFont">
     <w:name w:val="Default Paragraph Font"/>
     <w:uiPriority w:val="1"/>
+    <w:semiHidden/>
     <w:unhideWhenUsed/>
   </w:style>
   <w:style w:type="table" w:default="1" w:styleId="TableNormal">

</xml_diff>